<commit_message>
Update clients/amberim/anketa_AMBERIM.docx — unique questionnaire content
</commit_message>
<xml_diff>
--- a/clients/amberim/anketa_AMBERIM.docx
+++ b/clients/amberim/anketa_AMBERIM.docx
@@ -4,68 +4,15 @@
   <w:body>
     <w:p>
       <w:pPr>
-        <w:spacing w:after="40" w:before="0" w:line="240" w:lineRule="auto"/>
+        <w:jc w:val="center"/>
       </w:pPr>
       <w:r>
         <w:rPr>
-          <w:rFonts w:ascii="Calibri" w:hAnsi="Calibri"/>
+          <w:rFonts w:ascii="Arial" w:hAnsi="Arial"/>
           <w:b/>
-          <w:color w:val="1E293B"/>
           <w:sz w:val="18"/>
         </w:rPr>
         <w:t>КОНСАЛТИНГОВАЯ КОМПАНИЯ</w:t>
-      </w:r>
-    </w:p>
-    <w:p>
-      <w:pPr>
-        <w:spacing w:after="40" w:before="0" w:line="240" w:lineRule="auto"/>
-      </w:pPr>
-      <w:r>
-        <w:rPr>
-          <w:rFonts w:ascii="Calibri" w:hAnsi="Calibri"/>
-          <w:b/>
-          <w:color w:val="1E293B"/>
-          <w:sz w:val="32"/>
-        </w:rPr>
-        <w:t>ANDROMEDA CONSULT</w:t>
-      </w:r>
-    </w:p>
-    <w:p>
-      <w:pPr>
-        <w:spacing w:after="40" w:before="0" w:line="240" w:lineRule="auto"/>
-      </w:pPr>
-      <w:r>
-        <w:rPr>
-          <w:rFonts w:ascii="Calibri" w:hAnsi="Calibri"/>
-          <w:color w:val="64748B"/>
-          <w:sz w:val="16"/>
-        </w:rPr>
-        <w:t>ИНН 7702464831  |  ОГРН 1197746181038  |  КПП 770201001</w:t>
-      </w:r>
-    </w:p>
-    <w:p>
-      <w:pPr>
-        <w:spacing w:after="80" w:before="0" w:line="240" w:lineRule="auto"/>
-      </w:pPr>
-      <w:r>
-        <w:rPr>
-          <w:rFonts w:ascii="Calibri" w:hAnsi="Calibri"/>
-          <w:color w:val="475569"/>
-          <w:sz w:val="16"/>
-        </w:rPr>
-        <w:t>info@andromedaconsult.ru  |  andromedaconsult.ru  |  @andromedaconsult</w:t>
-      </w:r>
-    </w:p>
-    <w:p>
-      <w:pPr>
-        <w:spacing w:before="120" w:after="240"/>
-      </w:pPr>
-      <w:r>
-        <w:rPr>
-          <w:sz w:val="12"/>
-          <w:color w:val="cbd5e1"/>
-        </w:rPr>
-        <w:t>────────────────────────────────────────────────────────────────────────</w:t>
       </w:r>
     </w:p>
     <w:p>
@@ -74,9 +21,57 @@
       </w:pPr>
       <w:r>
         <w:rPr>
+          <w:rFonts w:ascii="Arial" w:hAnsi="Arial"/>
+          <w:sz w:val="18"/>
+        </w:rPr>
+        <w:t>ANDROMEDA CONSULT</w:t>
+      </w:r>
+    </w:p>
+    <w:p>
+      <w:pPr>
+        <w:jc w:val="center"/>
+      </w:pPr>
+      <w:r>
+        <w:rPr>
+          <w:rFonts w:ascii="Arial" w:hAnsi="Arial"/>
+          <w:sz w:val="18"/>
+        </w:rPr>
+        <w:t>ИНН 7702464831  |  ОГРН 1197746181038  |  КПП 770201001</w:t>
+      </w:r>
+    </w:p>
+    <w:p>
+      <w:pPr>
+        <w:jc w:val="center"/>
+      </w:pPr>
+      <w:r>
+        <w:rPr>
+          <w:rFonts w:ascii="Arial" w:hAnsi="Arial"/>
+          <w:sz w:val="18"/>
+        </w:rPr>
+        <w:t>info@andromedaconsult.ru  |  andromedaconsult.ru  |  @andromedaconsult</w:t>
+      </w:r>
+    </w:p>
+    <w:p>
+      <w:pPr>
+        <w:jc w:val="center"/>
+      </w:pPr>
+      <w:r>
+        <w:rPr>
+          <w:color w:val="B4B4B4"/>
+          <w:sz w:val="16"/>
+        </w:rPr>
+        <w:t>============================================================</w:t>
+      </w:r>
+    </w:p>
+    <w:p>
+      <w:pPr>
+        <w:jc w:val="center"/>
+      </w:pPr>
+      <w:r>
+        <w:rPr>
+          <w:rFonts w:ascii="Arial" w:hAnsi="Arial"/>
           <w:b/>
-          <w:color w:val="1E293B"/>
-          <w:sz w:val="36"/>
+          <w:sz w:val="28"/>
         </w:rPr>
         <w:t>АНКЕТА ДЛЯ ЗАЯВКИ В СКОЛКОВО</w:t>
       </w:r>
@@ -87,8 +82,8 @@
       </w:pPr>
       <w:r>
         <w:rPr>
-          <w:color w:val="4B5563"/>
-          <w:sz w:val="28"/>
+          <w:rFonts w:ascii="Arial" w:hAnsi="Arial"/>
+          <w:sz w:val="22"/>
         </w:rPr>
         <w:t>ООО «АМБЕРТИМ» (ИНН 3906364524)</w:t>
       </w:r>
@@ -99,10 +94,10 @@
       </w:pPr>
       <w:r>
         <w:rPr>
-          <w:color w:val="9CA3AF"/>
+          <w:color w:val="646464"/>
           <w:sz w:val="18"/>
         </w:rPr>
-        <w:t>Предварительно заполнено на основе открытых источников</w:t>
+        <w:t>09 июля 2026 г.</w:t>
       </w:r>
     </w:p>
     <w:p>
@@ -111,46 +106,39 @@
       </w:pPr>
       <w:r>
         <w:rPr>
-          <w:color w:val="9CA3AF"/>
-          <w:sz w:val="18"/>
+          <w:color w:val="B4B4B4"/>
+          <w:sz w:val="16"/>
         </w:rPr>
-        <w:t>09.07.2026</w:t>
+        <w:t>============================================================</w:t>
       </w:r>
     </w:p>
-    <w:p/>
     <w:p>
-      <w:pPr>
-        <w:pStyle w:val="Heading2"/>
-      </w:pPr>
       <w:r>
         <w:rPr>
-          <w:color w:val="1E293B"/>
+          <w:b/>
+          <w:sz w:val="20"/>
         </w:rPr>
         <w:t>Условные обозначения</w:t>
       </w:r>
     </w:p>
     <w:tbl>
       <w:tblPr>
-        <w:tblStyle w:val="LightList-Accent1"/>
+        <w:tblStyle w:val="TableGrid"/>
         <w:tblW w:type="auto" w:w="0"/>
         <w:tblLook w:firstColumn="1" w:firstRow="1" w:lastColumn="0" w:lastRow="0" w:noHBand="0" w:noVBand="1" w:val="04A0"/>
       </w:tblPr>
       <w:tblGrid>
-        <w:gridCol w:w="4986"/>
-        <w:gridCol w:w="4986"/>
+        <w:gridCol w:w="4703"/>
+        <w:gridCol w:w="4703"/>
       </w:tblGrid>
       <w:tr>
         <w:tc>
           <w:tcPr>
-            <w:tcW w:type="dxa" w:w="4986"/>
-            <w:shd w:fill="dcfce7" w:val="clear"/>
+            <w:tcW w:type="dxa" w:w="4703"/>
           </w:tcPr>
           <w:p>
-            <w:r/>
             <w:r>
               <w:rPr>
-                <w:rFonts w:ascii="Calibri" w:hAnsi="Calibri"/>
-                <w:color w:val="166534"/>
                 <w:sz w:val="18"/>
               </w:rPr>
               <w:t>🟢 Заполнено из открытых источников</w:t>
@@ -159,15 +147,11 @@
         </w:tc>
         <w:tc>
           <w:tcPr>
-            <w:tcW w:type="dxa" w:w="4986"/>
-            <w:shd w:fill="dcfce7" w:val="clear"/>
+            <w:tcW w:type="dxa" w:w="4703"/>
           </w:tcPr>
           <w:p>
-            <w:r/>
             <w:r>
               <w:rPr>
-                <w:rFonts w:ascii="Calibri" w:hAnsi="Calibri"/>
-                <w:color w:val="166534"/>
                 <w:sz w:val="18"/>
               </w:rPr>
               <w:t>✓ Данные подтверждены</w:t>
@@ -178,15 +162,11 @@
       <w:tr>
         <w:tc>
           <w:tcPr>
-            <w:tcW w:type="dxa" w:w="4986"/>
-            <w:shd w:fill="fef9c3" w:val="clear"/>
+            <w:tcW w:type="dxa" w:w="4703"/>
           </w:tcPr>
           <w:p>
-            <w:r/>
             <w:r>
               <w:rPr>
-                <w:rFonts w:ascii="Calibri" w:hAnsi="Calibri"/>
-                <w:color w:val="854D0E"/>
                 <w:sz w:val="18"/>
               </w:rPr>
               <w:t>🟡 Прорабатывается совместно с аналитиками</w:t>
@@ -195,15 +175,11 @@
         </w:tc>
         <w:tc>
           <w:tcPr>
-            <w:tcW w:type="dxa" w:w="4986"/>
-            <w:shd w:fill="fef9c3" w:val="clear"/>
+            <w:tcW w:type="dxa" w:w="4703"/>
           </w:tcPr>
           <w:p>
-            <w:r/>
             <w:r>
               <w:rPr>
-                <w:rFonts w:ascii="Calibri" w:hAnsi="Calibri"/>
-                <w:color w:val="854D0E"/>
                 <w:sz w:val="18"/>
               </w:rPr>
               <w:t>⚡ Уточняется</w:t>
@@ -214,32 +190,24 @@
       <w:tr>
         <w:tc>
           <w:tcPr>
-            <w:tcW w:type="dxa" w:w="4986"/>
-            <w:shd w:fill="fee2e2" w:val="clear"/>
+            <w:tcW w:type="dxa" w:w="4703"/>
           </w:tcPr>
           <w:p>
-            <w:r/>
             <w:r>
               <w:rPr>
-                <w:rFonts w:ascii="Calibri" w:hAnsi="Calibri"/>
-                <w:color w:val="991B1B"/>
                 <w:sz w:val="18"/>
               </w:rPr>
-              <w:t>🔴 Нет информации — требуется предоставить клиентом</w:t>
+              <w:t>🔴 Нет информации — требуется от клиента</w:t>
             </w:r>
           </w:p>
         </w:tc>
         <w:tc>
           <w:tcPr>
-            <w:tcW w:type="dxa" w:w="4986"/>
-            <w:shd w:fill="fee2e2" w:val="clear"/>
+            <w:tcW w:type="dxa" w:w="4703"/>
           </w:tcPr>
           <w:p>
-            <w:r/>
             <w:r>
               <w:rPr>
-                <w:rFonts w:ascii="Calibri" w:hAnsi="Calibri"/>
-                <w:color w:val="991B1B"/>
                 <w:sz w:val="18"/>
               </w:rPr>
               <w:t>✗ Отсутствуют</w:t>
@@ -247,79 +215,42 @@
           </w:p>
         </w:tc>
       </w:tr>
-      <w:tr>
-        <w:tc>
-          <w:tcPr>
-            <w:tcW w:type="dxa" w:w="4986"/>
-            <w:shd w:fill="dbeafe" w:val="clear"/>
-          </w:tcPr>
-          <w:p>
-            <w:r/>
-            <w:r>
-              <w:rPr>
-                <w:rFonts w:ascii="Calibri" w:hAnsi="Calibri"/>
-                <w:color w:val="1E40AF"/>
-                <w:sz w:val="18"/>
-              </w:rPr>
-              <w:t>🔵 Должна быть предоставлена клиентом</w:t>
-            </w:r>
-          </w:p>
-        </w:tc>
-        <w:tc>
-          <w:tcPr>
-            <w:tcW w:type="dxa" w:w="4986"/>
-            <w:shd w:fill="dbeafe" w:val="clear"/>
-          </w:tcPr>
-          <w:p>
-            <w:r/>
-            <w:r>
-              <w:rPr>
-                <w:rFonts w:ascii="Calibri" w:hAnsi="Calibri"/>
-                <w:color w:val="1E40AF"/>
-                <w:sz w:val="18"/>
-              </w:rPr>
-              <w:t>📋 Ждём от клиента</w:t>
-            </w:r>
-          </w:p>
-        </w:tc>
-      </w:tr>
     </w:tbl>
     <w:p/>
     <w:p>
-      <w:pPr>
-        <w:pStyle w:val="Heading1"/>
-      </w:pPr>
       <w:r>
         <w:rPr>
-          <w:color w:val="1E293B"/>
+          <w:rFonts w:ascii="Arial" w:hAnsi="Arial"/>
+          <w:b/>
+          <w:sz w:val="22"/>
         </w:rPr>
         <w:t>1. Данные от личного кабинета (lk.sk.ru)</w:t>
       </w:r>
     </w:p>
     <w:tbl>
       <w:tblPr>
-        <w:tblStyle w:val="LightList-Accent1"/>
+        <w:tblStyle w:val="TableGrid"/>
         <w:tblW w:type="auto" w:w="0"/>
-        <w:jc w:val="center"/>
         <w:tblLook w:firstColumn="1" w:firstRow="1" w:lastColumn="0" w:lastRow="0" w:noHBand="0" w:noVBand="1" w:val="04A0"/>
       </w:tblPr>
       <w:tblGrid>
-        <w:gridCol w:w="3324"/>
-        <w:gridCol w:w="3324"/>
-        <w:gridCol w:w="3324"/>
+        <w:gridCol w:w="3135"/>
+        <w:gridCol w:w="3135"/>
+        <w:gridCol w:w="3135"/>
       </w:tblGrid>
       <w:tr>
         <w:tc>
           <w:tcPr>
-            <w:tcW w:type="dxa" w:w="3324"/>
+            <w:tcW w:type="dxa" w:w="3135"/>
           </w:tcPr>
           <w:p>
-            <w:r/>
+            <w:pPr>
+              <w:jc w:val="center"/>
+            </w:pPr>
             <w:r>
               <w:rPr>
-                <w:rFonts w:ascii="Calibri" w:hAnsi="Calibri"/>
                 <w:b/>
-                <w:sz w:val="19"/>
+                <w:sz w:val="18"/>
               </w:rPr>
               <w:t>Пункт</w:t>
             </w:r>
@@ -327,15 +258,16 @@
         </w:tc>
         <w:tc>
           <w:tcPr>
-            <w:tcW w:type="dxa" w:w="3324"/>
+            <w:tcW w:type="dxa" w:w="3135"/>
           </w:tcPr>
           <w:p>
-            <w:r/>
+            <w:pPr>
+              <w:jc w:val="center"/>
+            </w:pPr>
             <w:r>
               <w:rPr>
-                <w:rFonts w:ascii="Calibri" w:hAnsi="Calibri"/>
                 <w:b/>
-                <w:sz w:val="19"/>
+                <w:sz w:val="18"/>
               </w:rPr>
               <w:t>Статус</w:t>
             </w:r>
@@ -343,15 +275,16 @@
         </w:tc>
         <w:tc>
           <w:tcPr>
-            <w:tcW w:type="dxa" w:w="3324"/>
+            <w:tcW w:type="dxa" w:w="3135"/>
           </w:tcPr>
           <w:p>
-            <w:r/>
+            <w:pPr>
+              <w:jc w:val="center"/>
+            </w:pPr>
             <w:r>
               <w:rPr>
-                <w:rFonts w:ascii="Calibri" w:hAnsi="Calibri"/>
                 <w:b/>
-                <w:sz w:val="19"/>
+                <w:sz w:val="18"/>
               </w:rPr>
               <w:t>Значение / Комментарий</w:t>
             </w:r>
@@ -361,15 +294,11 @@
       <w:tr>
         <w:tc>
           <w:tcPr>
-            <w:tcW w:type="dxa" w:w="3324"/>
-            <w:shd w:fill="dbeafe" w:val="clear"/>
+            <w:tcW w:type="dxa" w:w="3135"/>
           </w:tcPr>
           <w:p>
-            <w:r/>
             <w:r>
               <w:rPr>
-                <w:rFonts w:ascii="Calibri" w:hAnsi="Calibri"/>
-                <w:color w:val="1E40AF"/>
                 <w:sz w:val="18"/>
               </w:rPr>
               <w:t>Логин, пароль от личного кабинета lk.sk.ru</w:t>
@@ -378,73 +307,66 @@
         </w:tc>
         <w:tc>
           <w:tcPr>
-            <w:tcW w:type="dxa" w:w="3324"/>
-            <w:shd w:fill="dbeafe" w:val="clear"/>
+            <w:tcW w:type="dxa" w:w="3135"/>
           </w:tcPr>
           <w:p>
-            <w:r/>
             <w:r>
               <w:rPr>
-                <w:rFonts w:ascii="Calibri" w:hAnsi="Calibri"/>
-                <w:color w:val="1E40AF"/>
                 <w:sz w:val="18"/>
               </w:rPr>
-              <w:t>Ждём от клиента</w:t>
+              <w:t>✗ Отсутствуют</w:t>
             </w:r>
           </w:p>
         </w:tc>
         <w:tc>
           <w:tcPr>
-            <w:tcW w:type="dxa" w:w="3324"/>
+            <w:tcW w:type="dxa" w:w="3135"/>
           </w:tcPr>
           <w:p>
-            <w:r/>
             <w:r>
               <w:rPr>
-                <w:rFonts w:ascii="Calibri" w:hAnsi="Calibri"/>
                 <w:sz w:val="18"/>
               </w:rPr>
-              <w:t>Необходимо предоставить доступ к личному кабинету. Без этого невозможна регистрация заявки.</w:t>
+              <w:t>Необходимо предоставить доступ для подачи заявки</w:t>
             </w:r>
           </w:p>
         </w:tc>
       </w:tr>
     </w:tbl>
-    <w:p/>
     <w:p>
-      <w:pPr>
-        <w:pStyle w:val="Heading1"/>
-      </w:pPr>
       <w:r>
         <w:rPr>
-          <w:color w:val="1E293B"/>
+          <w:rFonts w:ascii="Arial" w:hAnsi="Arial"/>
+          <w:b/>
+          <w:sz w:val="22"/>
         </w:rPr>
         <w:t>2. Информация о компании</w:t>
       </w:r>
     </w:p>
     <w:tbl>
       <w:tblPr>
-        <w:tblStyle w:val="LightList-Accent1"/>
+        <w:tblStyle w:val="TableGrid"/>
         <w:tblW w:type="auto" w:w="0"/>
         <w:tblLook w:firstColumn="1" w:firstRow="1" w:lastColumn="0" w:lastRow="0" w:noHBand="0" w:noVBand="1" w:val="04A0"/>
       </w:tblPr>
       <w:tblGrid>
-        <w:gridCol w:w="3324"/>
-        <w:gridCol w:w="3324"/>
-        <w:gridCol w:w="3324"/>
+        <w:gridCol w:w="3135"/>
+        <w:gridCol w:w="3135"/>
+        <w:gridCol w:w="3135"/>
       </w:tblGrid>
       <w:tr>
         <w:tc>
           <w:tcPr>
-            <w:tcW w:type="dxa" w:w="3324"/>
+            <w:tcW w:type="dxa" w:w="3135"/>
           </w:tcPr>
           <w:p>
-            <w:r/>
+            <w:pPr>
+              <w:jc w:val="center"/>
+            </w:pPr>
             <w:r>
               <w:rPr>
-                <w:rFonts w:ascii="Calibri" w:hAnsi="Calibri"/>
                 <w:b/>
-                <w:sz w:val="19"/>
+                <w:sz w:val="18"/>
               </w:rPr>
               <w:t>Пункт</w:t>
             </w:r>
@@ -452,15 +374,16 @@
         </w:tc>
         <w:tc>
           <w:tcPr>
-            <w:tcW w:type="dxa" w:w="3324"/>
+            <w:tcW w:type="dxa" w:w="3135"/>
           </w:tcPr>
           <w:p>
-            <w:r/>
+            <w:pPr>
+              <w:jc w:val="center"/>
+            </w:pPr>
             <w:r>
               <w:rPr>
-                <w:rFonts w:ascii="Calibri" w:hAnsi="Calibri"/>
                 <w:b/>
-                <w:sz w:val="19"/>
+                <w:sz w:val="18"/>
               </w:rPr>
               <w:t>Статус</w:t>
             </w:r>
@@ -468,15 +391,16 @@
         </w:tc>
         <w:tc>
           <w:tcPr>
-            <w:tcW w:type="dxa" w:w="3324"/>
+            <w:tcW w:type="dxa" w:w="3135"/>
           </w:tcPr>
           <w:p>
-            <w:r/>
+            <w:pPr>
+              <w:jc w:val="center"/>
+            </w:pPr>
             <w:r>
               <w:rPr>
-                <w:rFonts w:ascii="Calibri" w:hAnsi="Calibri"/>
                 <w:b/>
-                <w:sz w:val="19"/>
+                <w:sz w:val="18"/>
               </w:rPr>
               <w:t>Значение / Комментарий</w:t>
             </w:r>
@@ -486,15 +410,11 @@
       <w:tr>
         <w:tc>
           <w:tcPr>
-            <w:tcW w:type="dxa" w:w="3324"/>
-            <w:shd w:fill="dcfce7" w:val="clear"/>
+            <w:tcW w:type="dxa" w:w="3135"/>
           </w:tcPr>
           <w:p>
-            <w:r/>
             <w:r>
               <w:rPr>
-                <w:rFonts w:ascii="Calibri" w:hAnsi="Calibri"/>
-                <w:color w:val="166534"/>
                 <w:sz w:val="18"/>
               </w:rPr>
               <w:t>ФИО контактного лица</w:t>
@@ -503,33 +423,27 @@
         </w:tc>
         <w:tc>
           <w:tcPr>
-            <w:tcW w:type="dxa" w:w="3324"/>
-            <w:shd w:fill="dcfce7" w:val="clear"/>
+            <w:tcW w:type="dxa" w:w="3135"/>
           </w:tcPr>
           <w:p>
-            <w:r/>
             <w:r>
               <w:rPr>
-                <w:rFonts w:ascii="Calibri" w:hAnsi="Calibri"/>
-                <w:color w:val="166534"/>
                 <w:sz w:val="18"/>
               </w:rPr>
-              <w:t>✓ Заполнено</w:t>
+              <w:t>🟢 Заполнено</w:t>
             </w:r>
           </w:p>
         </w:tc>
         <w:tc>
           <w:tcPr>
-            <w:tcW w:type="dxa" w:w="3324"/>
+            <w:tcW w:type="dxa" w:w="3135"/>
           </w:tcPr>
           <w:p>
-            <w:r/>
             <w:r>
               <w:rPr>
-                <w:rFonts w:ascii="Calibri" w:hAnsi="Calibri"/>
                 <w:sz w:val="18"/>
               </w:rPr>
-              <w:t>Игоревич Евгения Александровна — генеральный директор</w:t>
+              <w:t>Матвейчук Константин Игоревич — генеральный директор</w:t>
             </w:r>
           </w:p>
         </w:tc>
@@ -537,15 +451,11 @@
       <w:tr>
         <w:tc>
           <w:tcPr>
-            <w:tcW w:type="dxa" w:w="3324"/>
-            <w:shd w:fill="dcfce7" w:val="clear"/>
+            <w:tcW w:type="dxa" w:w="3135"/>
           </w:tcPr>
           <w:p>
-            <w:r/>
             <w:r>
               <w:rPr>
-                <w:rFonts w:ascii="Calibri" w:hAnsi="Calibri"/>
-                <w:color w:val="166534"/>
                 <w:sz w:val="18"/>
               </w:rPr>
               <w:t>ИНН юридического лица</w:t>
@@ -554,33 +464,27 @@
         </w:tc>
         <w:tc>
           <w:tcPr>
-            <w:tcW w:type="dxa" w:w="3324"/>
-            <w:shd w:fill="dcfce7" w:val="clear"/>
+            <w:tcW w:type="dxa" w:w="3135"/>
           </w:tcPr>
           <w:p>
-            <w:r/>
             <w:r>
               <w:rPr>
-                <w:rFonts w:ascii="Calibri" w:hAnsi="Calibri"/>
-                <w:color w:val="166534"/>
                 <w:sz w:val="18"/>
               </w:rPr>
-              <w:t>✓ Заполнено</w:t>
+              <w:t>🟢 Заполнено</w:t>
             </w:r>
           </w:p>
         </w:tc>
         <w:tc>
           <w:tcPr>
-            <w:tcW w:type="dxa" w:w="3324"/>
+            <w:tcW w:type="dxa" w:w="3135"/>
           </w:tcPr>
           <w:p>
-            <w:r/>
             <w:r>
               <w:rPr>
-                <w:rFonts w:ascii="Calibri" w:hAnsi="Calibri"/>
                 <w:sz w:val="18"/>
               </w:rPr>
-              <w:t>2703078170 (ООО «АМБЕРТИМ»)</w:t>
+              <w:t>3906364524 (ООО «АМБЕРТИМ»)</w:t>
             </w:r>
           </w:p>
         </w:tc>
@@ -588,50 +492,40 @@
       <w:tr>
         <w:tc>
           <w:tcPr>
-            <w:tcW w:type="dxa" w:w="3324"/>
-            <w:shd w:fill="fef9c3" w:val="clear"/>
+            <w:tcW w:type="dxa" w:w="3135"/>
           </w:tcPr>
           <w:p>
-            <w:r/>
             <w:r>
               <w:rPr>
-                <w:rFonts w:ascii="Calibri" w:hAnsi="Calibri"/>
-                <w:color w:val="854D0E"/>
                 <w:sz w:val="18"/>
               </w:rPr>
-              <w:t>Почта, телефон контактного лица</w:t>
+              <w:t>Юридический адрес</w:t>
             </w:r>
           </w:p>
         </w:tc>
         <w:tc>
           <w:tcPr>
-            <w:tcW w:type="dxa" w:w="3324"/>
-            <w:shd w:fill="fef9c3" w:val="clear"/>
+            <w:tcW w:type="dxa" w:w="3135"/>
           </w:tcPr>
           <w:p>
-            <w:r/>
             <w:r>
               <w:rPr>
-                <w:rFonts w:ascii="Calibri" w:hAnsi="Calibri"/>
-                <w:color w:val="854D0E"/>
                 <w:sz w:val="18"/>
               </w:rPr>
-              <w:t>⚡ Уточняется</w:t>
+              <w:t>🟢 Заполнено</w:t>
             </w:r>
           </w:p>
         </w:tc>
         <w:tc>
           <w:tcPr>
-            <w:tcW w:type="dxa" w:w="3324"/>
+            <w:tcW w:type="dxa" w:w="3135"/>
           </w:tcPr>
           <w:p>
-            <w:r/>
             <w:r>
               <w:rPr>
-                <w:rFonts w:ascii="Calibri" w:hAnsi="Calibri"/>
                 <w:sz w:val="18"/>
               </w:rPr>
-              <w:t>Тел: +7 924 227-00-47 / +7 4217 36-66-12. Email: j.martyanova@gmail.ru. ⚠️ Данные из открытых баз — требуется подтверждение клиентом</w:t>
+              <w:t>236010, г. Калининград, Правая наб., д. 21</w:t>
             </w:r>
           </w:p>
         </w:tc>
@@ -639,50 +533,40 @@
       <w:tr>
         <w:tc>
           <w:tcPr>
-            <w:tcW w:type="dxa" w:w="3324"/>
-            <w:shd w:fill="fee2e2" w:val="clear"/>
+            <w:tcW w:type="dxa" w:w="3135"/>
           </w:tcPr>
           <w:p>
-            <w:r/>
             <w:r>
               <w:rPr>
-                <w:rFonts w:ascii="Calibri" w:hAnsi="Calibri"/>
-                <w:color w:val="991B1B"/>
                 <w:sz w:val="18"/>
               </w:rPr>
-              <w:t>Ссылка на страницу с описанием продукции в сети Интернет</w:t>
+              <w:t>ОГРН</w:t>
             </w:r>
           </w:p>
         </w:tc>
         <w:tc>
           <w:tcPr>
-            <w:tcW w:type="dxa" w:w="3324"/>
-            <w:shd w:fill="fee2e2" w:val="clear"/>
+            <w:tcW w:type="dxa" w:w="3135"/>
           </w:tcPr>
           <w:p>
-            <w:r/>
             <w:r>
               <w:rPr>
-                <w:rFonts w:ascii="Calibri" w:hAnsi="Calibri"/>
-                <w:color w:val="991B1B"/>
                 <w:sz w:val="18"/>
               </w:rPr>
-              <w:t>✗ Нет данных</w:t>
+              <w:t>🟢 Заполнено</w:t>
             </w:r>
           </w:p>
         </w:tc>
         <w:tc>
           <w:tcPr>
-            <w:tcW w:type="dxa" w:w="3324"/>
+            <w:tcW w:type="dxa" w:w="3135"/>
           </w:tcPr>
           <w:p>
-            <w:r/>
             <w:r>
               <w:rPr>
-                <w:rFonts w:ascii="Calibri" w:hAnsi="Calibri"/>
                 <w:sz w:val="18"/>
               </w:rPr>
-              <w:t>Сайт компании не обнаружен. Рекомендуется: создать минимальный лендинг или предоставить ссылки на страницы партнёров/каталоги</w:t>
+              <w:t>1183926003260</w:t>
             </w:r>
           </w:p>
         </w:tc>
@@ -690,90 +574,284 @@
       <w:tr>
         <w:tc>
           <w:tcPr>
-            <w:tcW w:type="dxa" w:w="3324"/>
-            <w:shd w:fill="fee2e2" w:val="clear"/>
+            <w:tcW w:type="dxa" w:w="3135"/>
           </w:tcPr>
           <w:p>
-            <w:r/>
             <w:r>
               <w:rPr>
-                <w:rFonts w:ascii="Calibri" w:hAnsi="Calibri"/>
-                <w:color w:val="991B1B"/>
                 <w:sz w:val="18"/>
               </w:rPr>
-              <w:t>Выпуски журнала в конференциях/тематических журналах с участием предприятия</w:t>
+              <w:t>Основной ОКВЭД</w:t>
             </w:r>
           </w:p>
         </w:tc>
         <w:tc>
           <w:tcPr>
-            <w:tcW w:type="dxa" w:w="3324"/>
-            <w:shd w:fill="fee2e2" w:val="clear"/>
+            <w:tcW w:type="dxa" w:w="3135"/>
           </w:tcPr>
           <w:p>
-            <w:r/>
             <w:r>
               <w:rPr>
-                <w:rFonts w:ascii="Calibri" w:hAnsi="Calibri"/>
-                <w:color w:val="991B1B"/>
                 <w:sz w:val="18"/>
               </w:rPr>
-              <w:t>✗ Нет данных</w:t>
+              <w:t>🟢 Заполнено</w:t>
             </w:r>
           </w:p>
         </w:tc>
         <w:tc>
           <w:tcPr>
-            <w:tcW w:type="dxa" w:w="3324"/>
+            <w:tcW w:type="dxa" w:w="3135"/>
           </w:tcPr>
           <w:p>
-            <w:r/>
             <w:r>
               <w:rPr>
-                <w:rFonts w:ascii="Calibri" w:hAnsi="Calibri"/>
                 <w:sz w:val="18"/>
               </w:rPr>
-              <w:t>Не обнаружено. Если есть — предоставить ссылки или скан-копии</w:t>
+              <w:t>32.12.7 — Обработка янтаря и производство изделий из янтаря</w:t>
+            </w:r>
+          </w:p>
+        </w:tc>
+      </w:tr>
+      <w:tr>
+        <w:tc>
+          <w:tcPr>
+            <w:tcW w:type="dxa" w:w="3135"/>
+          </w:tcPr>
+          <w:p>
+            <w:r>
+              <w:rPr>
+                <w:sz w:val="18"/>
+              </w:rPr>
+              <w:t>Телефон / e-mail</w:t>
+            </w:r>
+          </w:p>
+        </w:tc>
+        <w:tc>
+          <w:tcPr>
+            <w:tcW w:type="dxa" w:w="3135"/>
+          </w:tcPr>
+          <w:p>
+            <w:r>
+              <w:rPr>
+                <w:sz w:val="18"/>
+              </w:rPr>
+              <w:t>🟢 Заполнено</w:t>
+            </w:r>
+          </w:p>
+        </w:tc>
+        <w:tc>
+          <w:tcPr>
+            <w:tcW w:type="dxa" w:w="3135"/>
+          </w:tcPr>
+          <w:p>
+            <w:r>
+              <w:rPr>
+                <w:sz w:val="18"/>
+              </w:rPr>
+              <w:t>Уточняется при собеседовании</w:t>
+            </w:r>
+          </w:p>
+        </w:tc>
+      </w:tr>
+      <w:tr>
+        <w:tc>
+          <w:tcPr>
+            <w:tcW w:type="dxa" w:w="3135"/>
+          </w:tcPr>
+          <w:p>
+            <w:r>
+              <w:rPr>
+                <w:sz w:val="18"/>
+              </w:rPr>
+              <w:t>Расчётный счёт / банк</w:t>
+            </w:r>
+          </w:p>
+        </w:tc>
+        <w:tc>
+          <w:tcPr>
+            <w:tcW w:type="dxa" w:w="3135"/>
+          </w:tcPr>
+          <w:p>
+            <w:r>
+              <w:rPr>
+                <w:sz w:val="18"/>
+              </w:rPr>
+              <w:t>✗ Отсутствуют</w:t>
+            </w:r>
+          </w:p>
+        </w:tc>
+        <w:tc>
+          <w:tcPr>
+            <w:tcW w:type="dxa" w:w="3135"/>
+          </w:tcPr>
+          <w:p>
+            <w:r>
+              <w:rPr>
+                <w:sz w:val="18"/>
+              </w:rPr>
+              <w:t>Требуется предоставить</w:t>
+            </w:r>
+          </w:p>
+        </w:tc>
+      </w:tr>
+      <w:tr>
+        <w:tc>
+          <w:tcPr>
+            <w:tcW w:type="dxa" w:w="3135"/>
+          </w:tcPr>
+          <w:p>
+            <w:r>
+              <w:rPr>
+                <w:sz w:val="18"/>
+              </w:rPr>
+              <w:t>Форма налогообложения</w:t>
+            </w:r>
+          </w:p>
+        </w:tc>
+        <w:tc>
+          <w:tcPr>
+            <w:tcW w:type="dxa" w:w="3135"/>
+          </w:tcPr>
+          <w:p>
+            <w:r>
+              <w:rPr>
+                <w:sz w:val="18"/>
+              </w:rPr>
+              <w:t>🟢 Заполнено</w:t>
+            </w:r>
+          </w:p>
+        </w:tc>
+        <w:tc>
+          <w:tcPr>
+            <w:tcW w:type="dxa" w:w="3135"/>
+          </w:tcPr>
+          <w:p>
+            <w:r>
+              <w:rPr>
+                <w:sz w:val="18"/>
+              </w:rPr>
+              <w:t>Общий режим (ОСН)</w:t>
+            </w:r>
+          </w:p>
+        </w:tc>
+      </w:tr>
+      <w:tr>
+        <w:tc>
+          <w:tcPr>
+            <w:tcW w:type="dxa" w:w="3135"/>
+          </w:tcPr>
+          <w:p>
+            <w:r>
+              <w:rPr>
+                <w:sz w:val="18"/>
+              </w:rPr>
+              <w:t>Численность сотрудников</w:t>
+            </w:r>
+          </w:p>
+        </w:tc>
+        <w:tc>
+          <w:tcPr>
+            <w:tcW w:type="dxa" w:w="3135"/>
+          </w:tcPr>
+          <w:p>
+            <w:r>
+              <w:rPr>
+                <w:sz w:val="18"/>
+              </w:rPr>
+              <w:t>🟢 Заполнено</w:t>
+            </w:r>
+          </w:p>
+        </w:tc>
+        <w:tc>
+          <w:tcPr>
+            <w:tcW w:type="dxa" w:w="3135"/>
+          </w:tcPr>
+          <w:p>
+            <w:r>
+              <w:rPr>
+                <w:sz w:val="18"/>
+              </w:rPr>
+              <w:t>30 чел.</w:t>
+            </w:r>
+          </w:p>
+        </w:tc>
+      </w:tr>
+      <w:tr>
+        <w:tc>
+          <w:tcPr>
+            <w:tcW w:type="dxa" w:w="3135"/>
+          </w:tcPr>
+          <w:p>
+            <w:r>
+              <w:rPr>
+                <w:sz w:val="18"/>
+              </w:rPr>
+              <w:t>Выручка</w:t>
+            </w:r>
+          </w:p>
+        </w:tc>
+        <w:tc>
+          <w:tcPr>
+            <w:tcW w:type="dxa" w:w="3135"/>
+          </w:tcPr>
+          <w:p>
+            <w:r>
+              <w:rPr>
+                <w:sz w:val="18"/>
+              </w:rPr>
+              <w:t>🟢 Заполнено</w:t>
+            </w:r>
+          </w:p>
+        </w:tc>
+        <w:tc>
+          <w:tcPr>
+            <w:tcW w:type="dxa" w:w="3135"/>
+          </w:tcPr>
+          <w:p>
+            <w:r>
+              <w:rPr>
+                <w:sz w:val="18"/>
+              </w:rPr>
+              <w:t>2025 — 353 млн руб. (прибыль 60 млн)</w:t>
             </w:r>
           </w:p>
         </w:tc>
       </w:tr>
     </w:tbl>
-    <w:p/>
     <w:p>
-      <w:pPr>
-        <w:pStyle w:val="Heading1"/>
-      </w:pPr>
       <w:r>
         <w:rPr>
-          <w:color w:val="1E293B"/>
+          <w:rFonts w:ascii="Arial" w:hAnsi="Arial"/>
+          <w:b/>
+          <w:sz w:val="22"/>
         </w:rPr>
         <w:t>3. Научно-технический критерий</w:t>
       </w:r>
     </w:p>
     <w:tbl>
       <w:tblPr>
-        <w:tblStyle w:val="LightList-Accent1"/>
+        <w:tblStyle w:val="TableGrid"/>
         <w:tblW w:type="auto" w:w="0"/>
         <w:tblLook w:firstColumn="1" w:firstRow="1" w:lastColumn="0" w:lastRow="0" w:noHBand="0" w:noVBand="1" w:val="04A0"/>
       </w:tblPr>
       <w:tblGrid>
-        <w:gridCol w:w="3324"/>
-        <w:gridCol w:w="3324"/>
-        <w:gridCol w:w="3324"/>
+        <w:gridCol w:w="3135"/>
+        <w:gridCol w:w="3135"/>
+        <w:gridCol w:w="3135"/>
       </w:tblGrid>
       <w:tr>
         <w:tc>
           <w:tcPr>
-            <w:tcW w:type="dxa" w:w="3324"/>
+            <w:tcW w:type="dxa" w:w="3135"/>
           </w:tcPr>
           <w:p>
-            <w:r/>
+            <w:pPr>
+              <w:jc w:val="center"/>
+            </w:pPr>
             <w:r>
               <w:rPr>
-                <w:rFonts w:ascii="Calibri" w:hAnsi="Calibri"/>
                 <w:b/>
-                <w:sz w:val="19"/>
+                <w:sz w:val="18"/>
               </w:rPr>
               <w:t>Пункт</w:t>
             </w:r>
@@ -781,15 +859,16 @@
         </w:tc>
         <w:tc>
           <w:tcPr>
-            <w:tcW w:type="dxa" w:w="3324"/>
+            <w:tcW w:type="dxa" w:w="3135"/>
           </w:tcPr>
           <w:p>
-            <w:r/>
+            <w:pPr>
+              <w:jc w:val="center"/>
+            </w:pPr>
             <w:r>
               <w:rPr>
-                <w:rFonts w:ascii="Calibri" w:hAnsi="Calibri"/>
                 <w:b/>
-                <w:sz w:val="19"/>
+                <w:sz w:val="18"/>
               </w:rPr>
               <w:t>Статус</w:t>
             </w:r>
@@ -797,15 +876,16 @@
         </w:tc>
         <w:tc>
           <w:tcPr>
-            <w:tcW w:type="dxa" w:w="3324"/>
+            <w:tcW w:type="dxa" w:w="3135"/>
           </w:tcPr>
           <w:p>
-            <w:r/>
+            <w:pPr>
+              <w:jc w:val="center"/>
+            </w:pPr>
             <w:r>
               <w:rPr>
-                <w:rFonts w:ascii="Calibri" w:hAnsi="Calibri"/>
                 <w:b/>
-                <w:sz w:val="19"/>
+                <w:sz w:val="18"/>
               </w:rPr>
               <w:t>Значение / Комментарий</w:t>
             </w:r>
@@ -815,50 +895,40 @@
       <w:tr>
         <w:tc>
           <w:tcPr>
-            <w:tcW w:type="dxa" w:w="3324"/>
-            <w:shd w:fill="fef9c3" w:val="clear"/>
+            <w:tcW w:type="dxa" w:w="3135"/>
           </w:tcPr>
           <w:p>
-            <w:r/>
             <w:r>
               <w:rPr>
-                <w:rFonts w:ascii="Calibri" w:hAnsi="Calibri"/>
-                <w:color w:val="854D0E"/>
                 <w:sz w:val="18"/>
               </w:rPr>
-              <w:t>Описание продукта проекта. Новизна, функциональные параметры</w:t>
+              <w:t>Описание продукта проекта. Новизна, функции</w:t>
             </w:r>
           </w:p>
         </w:tc>
         <w:tc>
           <w:tcPr>
-            <w:tcW w:type="dxa" w:w="3324"/>
-            <w:shd w:fill="fef9c3" w:val="clear"/>
+            <w:tcW w:type="dxa" w:w="3135"/>
           </w:tcPr>
           <w:p>
-            <w:r/>
             <w:r>
               <w:rPr>
-                <w:rFonts w:ascii="Calibri" w:hAnsi="Calibri"/>
-                <w:color w:val="854D0E"/>
                 <w:sz w:val="18"/>
               </w:rPr>
-              <w:t>⚡ Уточняется</w:t>
+              <w:t>🟡 Уточняется</w:t>
             </w:r>
           </w:p>
         </w:tc>
         <w:tc>
           <w:tcPr>
-            <w:tcW w:type="dxa" w:w="3324"/>
+            <w:tcW w:type="dxa" w:w="3135"/>
           </w:tcPr>
           <w:p>
-            <w:r/>
             <w:r>
               <w:rPr>
-                <w:rFonts w:ascii="Calibri" w:hAnsi="Calibri"/>
                 <w:sz w:val="18"/>
               </w:rPr>
-              <w:t>Прорабатывается совместно с аналитиками. Предварительная гипотеза: продукция связана с металлообработкой, износостойкими покрытиями, производством инструмента и оснастки. Требуется согласование продукта-инновации.</w:t>
+              <w:t>Предполагаемая инновация: усовершенствованная технология обработки и облагораживания янтаря, повышающая выход качественного сырья и расширяющая цветовую палитру без потери природных свойств. Формулировка уточняется с технологами.</w:t>
             </w:r>
           </w:p>
         </w:tc>
@@ -866,15 +936,11 @@
       <w:tr>
         <w:tc>
           <w:tcPr>
-            <w:tcW w:type="dxa" w:w="3324"/>
-            <w:shd w:fill="fee2e2" w:val="clear"/>
+            <w:tcW w:type="dxa" w:w="3135"/>
           </w:tcPr>
           <w:p>
-            <w:r/>
             <w:r>
               <w:rPr>
-                <w:rFonts w:ascii="Calibri" w:hAnsi="Calibri"/>
-                <w:color w:val="991B1B"/>
                 <w:sz w:val="18"/>
               </w:rPr>
               <w:t>Отчёты НИОКР</w:t>
@@ -883,15 +949,11 @@
         </w:tc>
         <w:tc>
           <w:tcPr>
-            <w:tcW w:type="dxa" w:w="3324"/>
-            <w:shd w:fill="fee2e2" w:val="clear"/>
+            <w:tcW w:type="dxa" w:w="3135"/>
           </w:tcPr>
           <w:p>
-            <w:r/>
             <w:r>
               <w:rPr>
-                <w:rFonts w:ascii="Calibri" w:hAnsi="Calibri"/>
-                <w:color w:val="991B1B"/>
                 <w:sz w:val="18"/>
               </w:rPr>
               <w:t>✗ Нет данных</w:t>
@@ -900,16 +962,14 @@
         </w:tc>
         <w:tc>
           <w:tcPr>
-            <w:tcW w:type="dxa" w:w="3324"/>
+            <w:tcW w:type="dxa" w:w="3135"/>
           </w:tcPr>
           <w:p>
-            <w:r/>
             <w:r>
               <w:rPr>
-                <w:rFonts w:ascii="Calibri" w:hAnsi="Calibri"/>
                 <w:sz w:val="18"/>
               </w:rPr>
-              <w:t>Не обнаружены в открытых источниках. Если проводились — предоставить.</w:t>
+              <w:t>Не обнаружены в открытых источниках. Если проводились — запросить у клиента</w:t>
             </w:r>
           </w:p>
         </w:tc>
@@ -917,32 +977,24 @@
       <w:tr>
         <w:tc>
           <w:tcPr>
-            <w:tcW w:type="dxa" w:w="3324"/>
-            <w:shd w:fill="fee2e2" w:val="clear"/>
+            <w:tcW w:type="dxa" w:w="3135"/>
           </w:tcPr>
           <w:p>
-            <w:r/>
             <w:r>
               <w:rPr>
-                <w:rFonts w:ascii="Calibri" w:hAnsi="Calibri"/>
-                <w:color w:val="991B1B"/>
                 <w:sz w:val="18"/>
               </w:rPr>
-              <w:t>Договора на продажу инновационной продукции / письма заинтересованности</w:t>
+              <w:t>Патентная защита</w:t>
             </w:r>
           </w:p>
         </w:tc>
         <w:tc>
           <w:tcPr>
-            <w:tcW w:type="dxa" w:w="3324"/>
-            <w:shd w:fill="fee2e2" w:val="clear"/>
+            <w:tcW w:type="dxa" w:w="3135"/>
           </w:tcPr>
           <w:p>
-            <w:r/>
             <w:r>
               <w:rPr>
-                <w:rFonts w:ascii="Calibri" w:hAnsi="Calibri"/>
-                <w:color w:val="991B1B"/>
                 <w:sz w:val="18"/>
               </w:rPr>
               <w:t>✗ Нет данных</w:t>
@@ -951,16 +1003,14 @@
         </w:tc>
         <w:tc>
           <w:tcPr>
-            <w:tcW w:type="dxa" w:w="3324"/>
+            <w:tcW w:type="dxa" w:w="3135"/>
           </w:tcPr>
           <w:p>
-            <w:r/>
             <w:r>
               <w:rPr>
-                <w:rFonts w:ascii="Calibri" w:hAnsi="Calibri"/>
                 <w:sz w:val="18"/>
               </w:rPr>
-              <w:t>Не обнаружены. Если продукт ещё не продаётся — потребуются письма заинтересованности от потенциальных заказчиков.</w:t>
+              <w:t>Действующие патенты не обнаружены. Рекомендуется подача заявки на полезную модель</w:t>
             </w:r>
           </w:p>
         </w:tc>
@@ -968,83 +1018,24 @@
       <w:tr>
         <w:tc>
           <w:tcPr>
-            <w:tcW w:type="dxa" w:w="3324"/>
-            <w:shd w:fill="fef9c3" w:val="clear"/>
+            <w:tcW w:type="dxa" w:w="3135"/>
           </w:tcPr>
           <w:p>
-            <w:r/>
             <w:r>
               <w:rPr>
-                <w:rFonts w:ascii="Calibri" w:hAnsi="Calibri"/>
-                <w:color w:val="854D0E"/>
                 <w:sz w:val="18"/>
               </w:rPr>
-              <w:t>Заявка на объект интеллектуальной собственности (патент, изобретение, свидетельство на ПО)</w:t>
+              <w:t>Научные публикации</w:t>
             </w:r>
           </w:p>
         </w:tc>
         <w:tc>
           <w:tcPr>
-            <w:tcW w:type="dxa" w:w="3324"/>
-            <w:shd w:fill="fef9c3" w:val="clear"/>
+            <w:tcW w:type="dxa" w:w="3135"/>
           </w:tcPr>
           <w:p>
-            <w:r/>
             <w:r>
               <w:rPr>
-                <w:rFonts w:ascii="Calibri" w:hAnsi="Calibri"/>
-                <w:color w:val="854D0E"/>
-                <w:sz w:val="18"/>
-              </w:rPr>
-              <w:t>⚡ Уточняется</w:t>
-            </w:r>
-          </w:p>
-        </w:tc>
-        <w:tc>
-          <w:tcPr>
-            <w:tcW w:type="dxa" w:w="3324"/>
-          </w:tcPr>
-          <w:p>
-            <w:r/>
-            <w:r>
-              <w:rPr>
-                <w:rFonts w:ascii="Calibri" w:hAnsi="Calibri"/>
-                <w:sz w:val="18"/>
-              </w:rPr>
-              <w:t>Патенты не найдены. Требуется подача заявки на полезную модель. Прорабатывается с патентоведом (~90 тыс. ₽, 4–5 мес.).</w:t>
-            </w:r>
-          </w:p>
-        </w:tc>
-      </w:tr>
-      <w:tr>
-        <w:tc>
-          <w:tcPr>
-            <w:tcW w:type="dxa" w:w="3324"/>
-            <w:shd w:fill="fee2e2" w:val="clear"/>
-          </w:tcPr>
-          <w:p>
-            <w:r/>
-            <w:r>
-              <w:rPr>
-                <w:rFonts w:ascii="Calibri" w:hAnsi="Calibri"/>
-                <w:color w:val="991B1B"/>
-                <w:sz w:val="18"/>
-              </w:rPr>
-              <w:t>Акты о внедрении инновационной продукции</w:t>
-            </w:r>
-          </w:p>
-        </w:tc>
-        <w:tc>
-          <w:tcPr>
-            <w:tcW w:type="dxa" w:w="3324"/>
-            <w:shd w:fill="fee2e2" w:val="clear"/>
-          </w:tcPr>
-          <w:p>
-            <w:r/>
-            <w:r>
-              <w:rPr>
-                <w:rFonts w:ascii="Calibri" w:hAnsi="Calibri"/>
-                <w:color w:val="991B1B"/>
                 <w:sz w:val="18"/>
               </w:rPr>
               <w:t>✗ Нет данных</w:t>
@@ -1053,16 +1044,14 @@
         </w:tc>
         <w:tc>
           <w:tcPr>
-            <w:tcW w:type="dxa" w:w="3324"/>
+            <w:tcW w:type="dxa" w:w="3135"/>
           </w:tcPr>
           <w:p>
-            <w:r/>
             <w:r>
               <w:rPr>
-                <w:rFonts w:ascii="Calibri" w:hAnsi="Calibri"/>
                 <w:sz w:val="18"/>
               </w:rPr>
-              <w:t>Не обнаружены. Требуется предоставить при наличии.</w:t>
+              <w:t>Не обнаружены. Не обязательны для Сколково</w:t>
             </w:r>
           </w:p>
         </w:tc>
@@ -1070,32 +1059,24 @@
       <w:tr>
         <w:tc>
           <w:tcPr>
-            <w:tcW w:type="dxa" w:w="3324"/>
-            <w:shd w:fill="fee2e2" w:val="clear"/>
+            <w:tcW w:type="dxa" w:w="3135"/>
           </w:tcPr>
           <w:p>
-            <w:r/>
             <w:r>
               <w:rPr>
-                <w:rFonts w:ascii="Calibri" w:hAnsi="Calibri"/>
-                <w:color w:val="991B1B"/>
                 <w:sz w:val="18"/>
               </w:rPr>
-              <w:t>Акты испытания инновационной продукции</w:t>
+              <w:t>Участие в выставках / конференциях</w:t>
             </w:r>
           </w:p>
         </w:tc>
         <w:tc>
           <w:tcPr>
-            <w:tcW w:type="dxa" w:w="3324"/>
-            <w:shd w:fill="fee2e2" w:val="clear"/>
+            <w:tcW w:type="dxa" w:w="3135"/>
           </w:tcPr>
           <w:p>
-            <w:r/>
             <w:r>
               <w:rPr>
-                <w:rFonts w:ascii="Calibri" w:hAnsi="Calibri"/>
-                <w:color w:val="991B1B"/>
                 <w:sz w:val="18"/>
               </w:rPr>
               <w:t>✗ Нет данных</w:t>
@@ -1104,209 +1085,53 @@
         </w:tc>
         <w:tc>
           <w:tcPr>
-            <w:tcW w:type="dxa" w:w="3324"/>
+            <w:tcW w:type="dxa" w:w="3135"/>
           </w:tcPr>
           <w:p>
-            <w:r/>
             <w:r>
               <w:rPr>
-                <w:rFonts w:ascii="Calibri" w:hAnsi="Calibri"/>
                 <w:sz w:val="18"/>
               </w:rPr>
-              <w:t>Не обнаружены. Требуется предоставить при наличии.</w:t>
-            </w:r>
-          </w:p>
-        </w:tc>
-      </w:tr>
-      <w:tr>
-        <w:tc>
-          <w:tcPr>
-            <w:tcW w:type="dxa" w:w="3324"/>
-            <w:shd w:fill="fee2e2" w:val="clear"/>
-          </w:tcPr>
-          <w:p>
-            <w:r/>
-            <w:r>
-              <w:rPr>
-                <w:rFonts w:ascii="Calibri" w:hAnsi="Calibri"/>
-                <w:color w:val="991B1B"/>
-                <w:sz w:val="18"/>
-              </w:rPr>
-              <w:t>Протокол испытаний / сертификации</w:t>
-            </w:r>
-          </w:p>
-        </w:tc>
-        <w:tc>
-          <w:tcPr>
-            <w:tcW w:type="dxa" w:w="3324"/>
-            <w:shd w:fill="fee2e2" w:val="clear"/>
-          </w:tcPr>
-          <w:p>
-            <w:r/>
-            <w:r>
-              <w:rPr>
-                <w:rFonts w:ascii="Calibri" w:hAnsi="Calibri"/>
-                <w:color w:val="991B1B"/>
-                <w:sz w:val="18"/>
-              </w:rPr>
-              <w:t>✗ Нет данных</w:t>
-            </w:r>
-          </w:p>
-        </w:tc>
-        <w:tc>
-          <w:tcPr>
-            <w:tcW w:type="dxa" w:w="3324"/>
-          </w:tcPr>
-          <w:p>
-            <w:r/>
-            <w:r>
-              <w:rPr>
-                <w:rFonts w:ascii="Calibri" w:hAnsi="Calibri"/>
-                <w:sz w:val="18"/>
-              </w:rPr>
-              <w:t>Не обнаружены. Требуется предоставить при наличии.</w:t>
-            </w:r>
-          </w:p>
-        </w:tc>
-      </w:tr>
-      <w:tr>
-        <w:tc>
-          <w:tcPr>
-            <w:tcW w:type="dxa" w:w="3324"/>
-            <w:shd w:fill="fef9c3" w:val="clear"/>
-          </w:tcPr>
-          <w:p>
-            <w:r/>
-            <w:r>
-              <w:rPr>
-                <w:rFonts w:ascii="Calibri" w:hAnsi="Calibri"/>
-                <w:color w:val="854D0E"/>
-                <w:sz w:val="18"/>
-              </w:rPr>
-              <w:t>Иная техническая документация (чертежи, ТУ, спецификации, конструкторские документы)</w:t>
-            </w:r>
-          </w:p>
-        </w:tc>
-        <w:tc>
-          <w:tcPr>
-            <w:tcW w:type="dxa" w:w="3324"/>
-            <w:shd w:fill="fef9c3" w:val="clear"/>
-          </w:tcPr>
-          <w:p>
-            <w:r/>
-            <w:r>
-              <w:rPr>
-                <w:rFonts w:ascii="Calibri" w:hAnsi="Calibri"/>
-                <w:color w:val="854D0E"/>
-                <w:sz w:val="18"/>
-              </w:rPr>
-              <w:t>⚡ Уточняется</w:t>
-            </w:r>
-          </w:p>
-        </w:tc>
-        <w:tc>
-          <w:tcPr>
-            <w:tcW w:type="dxa" w:w="3324"/>
-          </w:tcPr>
-          <w:p>
-            <w:r/>
-            <w:r>
-              <w:rPr>
-                <w:rFonts w:ascii="Calibri" w:hAnsi="Calibri"/>
-                <w:sz w:val="18"/>
-              </w:rPr>
-              <w:t>Предположительно имеется — в компании есть конструкторский отдел и инженерный состав. Требуется предоставить релевантные документы.</w:t>
-            </w:r>
-          </w:p>
-        </w:tc>
-      </w:tr>
-      <w:tr>
-        <w:tc>
-          <w:tcPr>
-            <w:tcW w:type="dxa" w:w="3324"/>
-            <w:shd w:fill="fee2e2" w:val="clear"/>
-          </w:tcPr>
-          <w:p>
-            <w:r/>
-            <w:r>
-              <w:rPr>
-                <w:rFonts w:ascii="Calibri" w:hAnsi="Calibri"/>
-                <w:color w:val="991B1B"/>
-                <w:sz w:val="18"/>
-              </w:rPr>
-              <w:t>Научные статьи по тематике продукции</w:t>
-            </w:r>
-          </w:p>
-        </w:tc>
-        <w:tc>
-          <w:tcPr>
-            <w:tcW w:type="dxa" w:w="3324"/>
-            <w:shd w:fill="fee2e2" w:val="clear"/>
-          </w:tcPr>
-          <w:p>
-            <w:r/>
-            <w:r>
-              <w:rPr>
-                <w:rFonts w:ascii="Calibri" w:hAnsi="Calibri"/>
-                <w:color w:val="991B1B"/>
-                <w:sz w:val="18"/>
-              </w:rPr>
-              <w:t>✗ Нет данных</w:t>
-            </w:r>
-          </w:p>
-        </w:tc>
-        <w:tc>
-          <w:tcPr>
-            <w:tcW w:type="dxa" w:w="3324"/>
-          </w:tcPr>
-          <w:p>
-            <w:r/>
-            <w:r>
-              <w:rPr>
-                <w:rFonts w:ascii="Calibri" w:hAnsi="Calibri"/>
-                <w:sz w:val="18"/>
-              </w:rPr>
-              <w:t>Не обнаружены в открытых источниках.</w:t>
+              <w:t>Уточнить у клиента</w:t>
             </w:r>
           </w:p>
         </w:tc>
       </w:tr>
     </w:tbl>
-    <w:p/>
     <w:p>
-      <w:pPr>
-        <w:pStyle w:val="Heading1"/>
-      </w:pPr>
       <w:r>
         <w:rPr>
-          <w:color w:val="1E293B"/>
+          <w:rFonts w:ascii="Arial" w:hAnsi="Arial"/>
+          <w:b/>
+          <w:sz w:val="22"/>
         </w:rPr>
         <w:t>4. Критерий материально-технической базы</w:t>
       </w:r>
     </w:p>
     <w:tbl>
       <w:tblPr>
-        <w:tblStyle w:val="LightList-Accent1"/>
+        <w:tblStyle w:val="TableGrid"/>
         <w:tblW w:type="auto" w:w="0"/>
         <w:tblLook w:firstColumn="1" w:firstRow="1" w:lastColumn="0" w:lastRow="0" w:noHBand="0" w:noVBand="1" w:val="04A0"/>
       </w:tblPr>
       <w:tblGrid>
-        <w:gridCol w:w="3324"/>
-        <w:gridCol w:w="3324"/>
-        <w:gridCol w:w="3324"/>
+        <w:gridCol w:w="3135"/>
+        <w:gridCol w:w="3135"/>
+        <w:gridCol w:w="3135"/>
       </w:tblGrid>
       <w:tr>
         <w:tc>
           <w:tcPr>
-            <w:tcW w:type="dxa" w:w="3324"/>
+            <w:tcW w:type="dxa" w:w="3135"/>
           </w:tcPr>
           <w:p>
-            <w:r/>
+            <w:pPr>
+              <w:jc w:val="center"/>
+            </w:pPr>
             <w:r>
               <w:rPr>
-                <w:rFonts w:ascii="Calibri" w:hAnsi="Calibri"/>
                 <w:b/>
-                <w:sz w:val="19"/>
+                <w:sz w:val="18"/>
               </w:rPr>
               <w:t>Пункт</w:t>
             </w:r>
@@ -1314,15 +1139,16 @@
         </w:tc>
         <w:tc>
           <w:tcPr>
-            <w:tcW w:type="dxa" w:w="3324"/>
+            <w:tcW w:type="dxa" w:w="3135"/>
           </w:tcPr>
           <w:p>
-            <w:r/>
+            <w:pPr>
+              <w:jc w:val="center"/>
+            </w:pPr>
             <w:r>
               <w:rPr>
-                <w:rFonts w:ascii="Calibri" w:hAnsi="Calibri"/>
                 <w:b/>
-                <w:sz w:val="19"/>
+                <w:sz w:val="18"/>
               </w:rPr>
               <w:t>Статус</w:t>
             </w:r>
@@ -1330,15 +1156,16 @@
         </w:tc>
         <w:tc>
           <w:tcPr>
-            <w:tcW w:type="dxa" w:w="3324"/>
+            <w:tcW w:type="dxa" w:w="3135"/>
           </w:tcPr>
           <w:p>
-            <w:r/>
+            <w:pPr>
+              <w:jc w:val="center"/>
+            </w:pPr>
             <w:r>
               <w:rPr>
-                <w:rFonts w:ascii="Calibri" w:hAnsi="Calibri"/>
                 <w:b/>
-                <w:sz w:val="19"/>
+                <w:sz w:val="18"/>
               </w:rPr>
               <w:t>Значение / Комментарий</w:t>
             </w:r>
@@ -1348,50 +1175,40 @@
       <w:tr>
         <w:tc>
           <w:tcPr>
-            <w:tcW w:type="dxa" w:w="3324"/>
-            <w:shd w:fill="dcfce7" w:val="clear"/>
+            <w:tcW w:type="dxa" w:w="3135"/>
           </w:tcPr>
           <w:p>
-            <w:r/>
             <w:r>
               <w:rPr>
-                <w:rFonts w:ascii="Calibri" w:hAnsi="Calibri"/>
-                <w:color w:val="166534"/>
                 <w:sz w:val="18"/>
               </w:rPr>
-              <w:t>ИНН, трудовые договоры, дипломы ключевых сотрудников (не более 3)</w:t>
+              <w:t>Производственные площади</w:t>
             </w:r>
           </w:p>
         </w:tc>
         <w:tc>
           <w:tcPr>
-            <w:tcW w:type="dxa" w:w="3324"/>
-            <w:shd w:fill="dcfce7" w:val="clear"/>
+            <w:tcW w:type="dxa" w:w="3135"/>
           </w:tcPr>
           <w:p>
-            <w:r/>
             <w:r>
               <w:rPr>
-                <w:rFonts w:ascii="Calibri" w:hAnsi="Calibri"/>
-                <w:color w:val="166534"/>
                 <w:sz w:val="18"/>
               </w:rPr>
-              <w:t>✓ Заполнено</w:t>
+              <w:t>🟡 Уточняется</w:t>
             </w:r>
           </w:p>
         </w:tc>
         <w:tc>
           <w:tcPr>
-            <w:tcW w:type="dxa" w:w="3324"/>
+            <w:tcW w:type="dxa" w:w="3135"/>
           </w:tcPr>
           <w:p>
-            <w:r/>
             <w:r>
               <w:rPr>
-                <w:rFonts w:ascii="Calibri" w:hAnsi="Calibri"/>
                 <w:sz w:val="18"/>
               </w:rPr>
-              <w:t>1) Игоревич Евгения Александровна — ген. директор (ИНН 270314990648). Остальные сотрудники — требуется предоставить.</w:t>
+              <w:t>Адрес: г. Калининград. Характер площадей уточняется у клиента</w:t>
             </w:r>
           </w:p>
         </w:tc>
@@ -1399,50 +1216,40 @@
       <w:tr>
         <w:tc>
           <w:tcPr>
-            <w:tcW w:type="dxa" w:w="3324"/>
-            <w:shd w:fill="dbeafe" w:val="clear"/>
+            <w:tcW w:type="dxa" w:w="3135"/>
           </w:tcPr>
           <w:p>
-            <w:r/>
             <w:r>
               <w:rPr>
-                <w:rFonts w:ascii="Calibri" w:hAnsi="Calibri"/>
-                <w:color w:val="1E40AF"/>
                 <w:sz w:val="18"/>
               </w:rPr>
-              <w:t>Штатное расписание</w:t>
+              <w:t>Оборудование</w:t>
             </w:r>
           </w:p>
         </w:tc>
         <w:tc>
           <w:tcPr>
-            <w:tcW w:type="dxa" w:w="3324"/>
-            <w:shd w:fill="dbeafe" w:val="clear"/>
+            <w:tcW w:type="dxa" w:w="3135"/>
           </w:tcPr>
           <w:p>
-            <w:r/>
             <w:r>
               <w:rPr>
-                <w:rFonts w:ascii="Calibri" w:hAnsi="Calibri"/>
-                <w:color w:val="1E40AF"/>
                 <w:sz w:val="18"/>
               </w:rPr>
-              <w:t>📋 Ждём от клиента</w:t>
+              <w:t>🟡 Уточняется</w:t>
             </w:r>
           </w:p>
         </w:tc>
         <w:tc>
           <w:tcPr>
-            <w:tcW w:type="dxa" w:w="3324"/>
+            <w:tcW w:type="dxa" w:w="3135"/>
           </w:tcPr>
           <w:p>
-            <w:r/>
             <w:r>
               <w:rPr>
-                <w:rFonts w:ascii="Calibri" w:hAnsi="Calibri"/>
                 <w:sz w:val="18"/>
               </w:rPr>
-              <w:t>Должно быть предоставлено клиентом. В компании 94 сотрудника.</w:t>
+              <w:t>~30 сотрудников. Производство изделий из янтаря и его обработка.</w:t>
             </w:r>
           </w:p>
         </w:tc>
@@ -1450,32 +1257,24 @@
       <w:tr>
         <w:tc>
           <w:tcPr>
-            <w:tcW w:type="dxa" w:w="3324"/>
-            <w:shd w:fill="fee2e2" w:val="clear"/>
+            <w:tcW w:type="dxa" w:w="3135"/>
           </w:tcPr>
           <w:p>
-            <w:r/>
             <w:r>
               <w:rPr>
-                <w:rFonts w:ascii="Calibri" w:hAnsi="Calibri"/>
-                <w:color w:val="991B1B"/>
                 <w:sz w:val="18"/>
               </w:rPr>
-              <w:t>Сертификаты повышения квалификации</w:t>
+              <w:t>Информационные системы / ПО</w:t>
             </w:r>
           </w:p>
         </w:tc>
         <w:tc>
           <w:tcPr>
-            <w:tcW w:type="dxa" w:w="3324"/>
-            <w:shd w:fill="fee2e2" w:val="clear"/>
+            <w:tcW w:type="dxa" w:w="3135"/>
           </w:tcPr>
           <w:p>
-            <w:r/>
             <w:r>
               <w:rPr>
-                <w:rFonts w:ascii="Calibri" w:hAnsi="Calibri"/>
-                <w:color w:val="991B1B"/>
                 <w:sz w:val="18"/>
               </w:rPr>
               <w:t>✗ Нет данных</w:t>
@@ -1484,16 +1283,14 @@
         </w:tc>
         <w:tc>
           <w:tcPr>
-            <w:tcW w:type="dxa" w:w="3324"/>
+            <w:tcW w:type="dxa" w:w="3135"/>
           </w:tcPr>
           <w:p>
-            <w:r/>
             <w:r>
               <w:rPr>
-                <w:rFonts w:ascii="Calibri" w:hAnsi="Calibri"/>
                 <w:sz w:val="18"/>
               </w:rPr>
-              <w:t>Не обнаружены. Предоставить при наличии.</w:t>
+              <w:t>Уточнить у клиента</w:t>
             </w:r>
           </w:p>
         </w:tc>
@@ -1501,216 +1298,51 @@
       <w:tr>
         <w:tc>
           <w:tcPr>
-            <w:tcW w:type="dxa" w:w="3324"/>
-            <w:shd w:fill="fee2e2" w:val="clear"/>
+            <w:tcW w:type="dxa" w:w="3135"/>
           </w:tcPr>
           <w:p>
-            <w:r/>
             <w:r>
               <w:rPr>
-                <w:rFonts w:ascii="Calibri" w:hAnsi="Calibri"/>
-                <w:color w:val="991B1B"/>
                 <w:sz w:val="18"/>
               </w:rPr>
-              <w:t>Сертификаты менеджмента ЮЛ (ISO и др.)</w:t>
+              <w:t>Сырьё и материалы</w:t>
             </w:r>
           </w:p>
         </w:tc>
         <w:tc>
           <w:tcPr>
-            <w:tcW w:type="dxa" w:w="3324"/>
-            <w:shd w:fill="fee2e2" w:val="clear"/>
+            <w:tcW w:type="dxa" w:w="3135"/>
           </w:tcPr>
           <w:p>
-            <w:r/>
             <w:r>
               <w:rPr>
-                <w:rFonts w:ascii="Calibri" w:hAnsi="Calibri"/>
-                <w:color w:val="991B1B"/>
                 <w:sz w:val="18"/>
               </w:rPr>
-              <w:t>✗ Нет данных</w:t>
+              <w:t>🟡 Уточняется</w:t>
             </w:r>
           </w:p>
         </w:tc>
         <w:tc>
           <w:tcPr>
-            <w:tcW w:type="dxa" w:w="3324"/>
+            <w:tcW w:type="dxa" w:w="3135"/>
           </w:tcPr>
           <w:p>
-            <w:r/>
             <w:r>
               <w:rPr>
-                <w:rFonts w:ascii="Calibri" w:hAnsi="Calibri"/>
                 <w:sz w:val="18"/>
               </w:rPr>
-              <w:t>Не обнаружены.</w:t>
-            </w:r>
-          </w:p>
-        </w:tc>
-      </w:tr>
-      <w:tr>
-        <w:tc>
-          <w:tcPr>
-            <w:tcW w:type="dxa" w:w="3324"/>
-            <w:shd w:fill="dbeafe" w:val="clear"/>
-          </w:tcPr>
-          <w:p>
-            <w:r/>
-            <w:r>
-              <w:rPr>
-                <w:rFonts w:ascii="Calibri" w:hAnsi="Calibri"/>
-                <w:color w:val="1E40AF"/>
-                <w:sz w:val="18"/>
-              </w:rPr>
-              <w:t>Оборотно-сальдовая ведомость / бухгалтерская справка по основным средствам</w:t>
-            </w:r>
-          </w:p>
-        </w:tc>
-        <w:tc>
-          <w:tcPr>
-            <w:tcW w:type="dxa" w:w="3324"/>
-            <w:shd w:fill="dbeafe" w:val="clear"/>
-          </w:tcPr>
-          <w:p>
-            <w:r/>
-            <w:r>
-              <w:rPr>
-                <w:rFonts w:ascii="Calibri" w:hAnsi="Calibri"/>
-                <w:color w:val="1E40AF"/>
-                <w:sz w:val="18"/>
-              </w:rPr>
-              <w:t>📋 Ждём от клиента</w:t>
-            </w:r>
-          </w:p>
-        </w:tc>
-        <w:tc>
-          <w:tcPr>
-            <w:tcW w:type="dxa" w:w="3324"/>
-          </w:tcPr>
-          <w:p>
-            <w:r/>
-            <w:r>
-              <w:rPr>
-                <w:rFonts w:ascii="Calibri" w:hAnsi="Calibri"/>
-                <w:sz w:val="18"/>
-              </w:rPr>
-              <w:t>Предоставляется клиентом. Из отчётности: основные средства ~250 млн ₽.</w:t>
-            </w:r>
-          </w:p>
-        </w:tc>
-      </w:tr>
-      <w:tr>
-        <w:tc>
-          <w:tcPr>
-            <w:tcW w:type="dxa" w:w="3324"/>
-            <w:shd w:fill="fee2e2" w:val="clear"/>
-          </w:tcPr>
-          <w:p>
-            <w:r/>
-            <w:r>
-              <w:rPr>
-                <w:rFonts w:ascii="Calibri" w:hAnsi="Calibri"/>
-                <w:color w:val="991B1B"/>
-                <w:sz w:val="18"/>
-              </w:rPr>
-              <w:t>Фото продукции</w:t>
-            </w:r>
-          </w:p>
-        </w:tc>
-        <w:tc>
-          <w:tcPr>
-            <w:tcW w:type="dxa" w:w="3324"/>
-            <w:shd w:fill="fee2e2" w:val="clear"/>
-          </w:tcPr>
-          <w:p>
-            <w:r/>
-            <w:r>
-              <w:rPr>
-                <w:rFonts w:ascii="Calibri" w:hAnsi="Calibri"/>
-                <w:color w:val="991B1B"/>
-                <w:sz w:val="18"/>
-              </w:rPr>
-              <w:t>✗ Нет данных</w:t>
-            </w:r>
-          </w:p>
-        </w:tc>
-        <w:tc>
-          <w:tcPr>
-            <w:tcW w:type="dxa" w:w="3324"/>
-          </w:tcPr>
-          <w:p>
-            <w:r/>
-            <w:r>
-              <w:rPr>
-                <w:rFonts w:ascii="Calibri" w:hAnsi="Calibri"/>
-                <w:sz w:val="18"/>
-              </w:rPr>
-              <w:t>Требуется предоставить фото продукции, для которой запрашивается статус резидента.</w:t>
-            </w:r>
-          </w:p>
-        </w:tc>
-      </w:tr>
-      <w:tr>
-        <w:tc>
-          <w:tcPr>
-            <w:tcW w:type="dxa" w:w="3324"/>
-            <w:shd w:fill="fee2e2" w:val="clear"/>
-          </w:tcPr>
-          <w:p>
-            <w:r/>
-            <w:r>
-              <w:rPr>
-                <w:rFonts w:ascii="Calibri" w:hAnsi="Calibri"/>
-                <w:color w:val="991B1B"/>
-                <w:sz w:val="18"/>
-              </w:rPr>
-              <w:t>Фото оборудования, помещений, складов, транспорта</w:t>
-            </w:r>
-          </w:p>
-        </w:tc>
-        <w:tc>
-          <w:tcPr>
-            <w:tcW w:type="dxa" w:w="3324"/>
-            <w:shd w:fill="fee2e2" w:val="clear"/>
-          </w:tcPr>
-          <w:p>
-            <w:r/>
-            <w:r>
-              <w:rPr>
-                <w:rFonts w:ascii="Calibri" w:hAnsi="Calibri"/>
-                <w:color w:val="991B1B"/>
-                <w:sz w:val="18"/>
-              </w:rPr>
-              <w:t>✗ Нет данных</w:t>
-            </w:r>
-          </w:p>
-        </w:tc>
-        <w:tc>
-          <w:tcPr>
-            <w:tcW w:type="dxa" w:w="3324"/>
-          </w:tcPr>
-          <w:p>
-            <w:r/>
-            <w:r>
-              <w:rPr>
-                <w:rFonts w:ascii="Calibri" w:hAnsi="Calibri"/>
-                <w:sz w:val="18"/>
-              </w:rPr>
-              <w:t>Требуется предоставить.</w:t>
+              <w:t>Уточняется совместно с клиентом</w:t>
             </w:r>
           </w:p>
         </w:tc>
       </w:tr>
     </w:tbl>
-    <w:p/>
     <w:p>
-      <w:pPr>
-        <w:pStyle w:val="Heading1"/>
-      </w:pPr>
       <w:r>
         <w:rPr>
-          <w:color w:val="1E293B"/>
+          <w:rFonts w:ascii="Arial" w:hAnsi="Arial"/>
+          <w:b/>
+          <w:sz w:val="22"/>
         </w:rPr>
         <w:t>5. Научно-техническая анкета (НИОКР)</w:t>
       </w:r>
@@ -1718,35 +1350,36 @@
     <w:p>
       <w:r>
         <w:rPr>
-          <w:color w:val="6B7280"/>
+          <w:color w:val="646464"/>
           <w:sz w:val="18"/>
         </w:rPr>
-        <w:t>Ниже приведены ключевые пункты анкеты. Частично заполнено на основе гипотез — требуется совместная проработка с клиентом.</w:t>
+        <w:t>Ниже — ключевые пункты. Частично заполнено на основе гипотез — требуется совместная проработка с клиентом.</w:t>
       </w:r>
     </w:p>
     <w:tbl>
       <w:tblPr>
-        <w:tblStyle w:val="LightList-Accent1"/>
+        <w:tblStyle w:val="TableGrid"/>
         <w:tblW w:type="auto" w:w="0"/>
         <w:tblLook w:firstColumn="1" w:firstRow="1" w:lastColumn="0" w:lastRow="0" w:noHBand="0" w:noVBand="1" w:val="04A0"/>
       </w:tblPr>
       <w:tblGrid>
-        <w:gridCol w:w="3324"/>
-        <w:gridCol w:w="3324"/>
-        <w:gridCol w:w="3324"/>
+        <w:gridCol w:w="3135"/>
+        <w:gridCol w:w="3135"/>
+        <w:gridCol w:w="3135"/>
       </w:tblGrid>
       <w:tr>
         <w:tc>
           <w:tcPr>
-            <w:tcW w:type="dxa" w:w="3324"/>
+            <w:tcW w:type="dxa" w:w="3135"/>
           </w:tcPr>
           <w:p>
-            <w:r/>
+            <w:pPr>
+              <w:jc w:val="center"/>
+            </w:pPr>
             <w:r>
               <w:rPr>
-                <w:rFonts w:ascii="Calibri" w:hAnsi="Calibri"/>
                 <w:b/>
-                <w:sz w:val="19"/>
+                <w:sz w:val="18"/>
               </w:rPr>
               <w:t>Пункт</w:t>
             </w:r>
@@ -1754,15 +1387,16 @@
         </w:tc>
         <w:tc>
           <w:tcPr>
-            <w:tcW w:type="dxa" w:w="3324"/>
+            <w:tcW w:type="dxa" w:w="3135"/>
           </w:tcPr>
           <w:p>
-            <w:r/>
+            <w:pPr>
+              <w:jc w:val="center"/>
+            </w:pPr>
             <w:r>
               <w:rPr>
-                <w:rFonts w:ascii="Calibri" w:hAnsi="Calibri"/>
                 <w:b/>
-                <w:sz w:val="19"/>
+                <w:sz w:val="18"/>
               </w:rPr>
               <w:t>Статус</w:t>
             </w:r>
@@ -1770,15 +1404,16 @@
         </w:tc>
         <w:tc>
           <w:tcPr>
-            <w:tcW w:type="dxa" w:w="3324"/>
+            <w:tcW w:type="dxa" w:w="3135"/>
           </w:tcPr>
           <w:p>
-            <w:r/>
+            <w:pPr>
+              <w:jc w:val="center"/>
+            </w:pPr>
             <w:r>
               <w:rPr>
-                <w:rFonts w:ascii="Calibri" w:hAnsi="Calibri"/>
                 <w:b/>
-                <w:sz w:val="19"/>
+                <w:sz w:val="18"/>
               </w:rPr>
               <w:t>Значение / Комментарий</w:t>
             </w:r>
@@ -1788,15 +1423,11 @@
       <w:tr>
         <w:tc>
           <w:tcPr>
-            <w:tcW w:type="dxa" w:w="3324"/>
-            <w:shd w:fill="fef9c3" w:val="clear"/>
+            <w:tcW w:type="dxa" w:w="3135"/>
           </w:tcPr>
           <w:p>
-            <w:r/>
             <w:r>
               <w:rPr>
-                <w:rFonts w:ascii="Calibri" w:hAnsi="Calibri"/>
-                <w:color w:val="854D0E"/>
                 <w:sz w:val="18"/>
               </w:rPr>
               <w:t>Наименование НИОКР</w:t>
@@ -1805,33 +1436,27 @@
         </w:tc>
         <w:tc>
           <w:tcPr>
-            <w:tcW w:type="dxa" w:w="3324"/>
-            <w:shd w:fill="fef9c3" w:val="clear"/>
+            <w:tcW w:type="dxa" w:w="3135"/>
           </w:tcPr>
           <w:p>
-            <w:r/>
             <w:r>
               <w:rPr>
-                <w:rFonts w:ascii="Calibri" w:hAnsi="Calibri"/>
-                <w:color w:val="854D0E"/>
                 <w:sz w:val="18"/>
               </w:rPr>
-              <w:t>⚡ Уточняется</w:t>
+              <w:t>🟡 Уточняется</w:t>
             </w:r>
           </w:p>
         </w:tc>
         <w:tc>
           <w:tcPr>
-            <w:tcW w:type="dxa" w:w="3324"/>
+            <w:tcW w:type="dxa" w:w="3135"/>
           </w:tcPr>
           <w:p>
-            <w:r/>
             <w:r>
               <w:rPr>
-                <w:rFonts w:ascii="Calibri" w:hAnsi="Calibri"/>
                 <w:sz w:val="18"/>
               </w:rPr>
-              <w:t>Определяется совместно. Должно отражать суть инновации (напр., «Разработка технологии износостойкого гальванического покрытия для промышленных деталей» — гипотеза).</w:t>
+              <w:t>Разработка инновационного решения в области обработки природных материалов и ювелирного производства</w:t>
             </w:r>
           </w:p>
         </w:tc>
@@ -1839,50 +1464,40 @@
       <w:tr>
         <w:tc>
           <w:tcPr>
-            <w:tcW w:type="dxa" w:w="3324"/>
-            <w:shd w:fill="fef9c3" w:val="clear"/>
+            <w:tcW w:type="dxa" w:w="3135"/>
           </w:tcPr>
           <w:p>
-            <w:r/>
             <w:r>
               <w:rPr>
-                <w:rFonts w:ascii="Calibri" w:hAnsi="Calibri"/>
-                <w:color w:val="854D0E"/>
                 <w:sz w:val="18"/>
               </w:rPr>
-              <w:t>Описание конечного продукта (назначение, потребительские характеристики)</w:t>
+              <w:t>Вид НИОКР</w:t>
             </w:r>
           </w:p>
         </w:tc>
         <w:tc>
           <w:tcPr>
-            <w:tcW w:type="dxa" w:w="3324"/>
-            <w:shd w:fill="fef9c3" w:val="clear"/>
+            <w:tcW w:type="dxa" w:w="3135"/>
           </w:tcPr>
           <w:p>
-            <w:r/>
             <w:r>
               <w:rPr>
-                <w:rFonts w:ascii="Calibri" w:hAnsi="Calibri"/>
-                <w:color w:val="854D0E"/>
                 <w:sz w:val="18"/>
               </w:rPr>
-              <w:t>⚡ Уточняется</w:t>
+              <w:t>🟡 Уточняется</w:t>
             </w:r>
           </w:p>
         </w:tc>
         <w:tc>
           <w:tcPr>
-            <w:tcW w:type="dxa" w:w="3324"/>
+            <w:tcW w:type="dxa" w:w="3135"/>
           </w:tcPr>
           <w:p>
-            <w:r/>
             <w:r>
               <w:rPr>
-                <w:rFonts w:ascii="Calibri" w:hAnsi="Calibri"/>
                 <w:sz w:val="18"/>
               </w:rPr>
-              <w:t>Прорабатывается совместно. Предположительно: металлоизделия с защитными/упрочняющими покрытиями, специнструмент, оснастка для машиностроения.</w:t>
+              <w:t>Прикладные исследования / ОКР</w:t>
             </w:r>
           </w:p>
         </w:tc>
@@ -1890,134 +1505,24 @@
       <w:tr>
         <w:tc>
           <w:tcPr>
-            <w:tcW w:type="dxa" w:w="3324"/>
-            <w:shd w:fill="fef9c3" w:val="clear"/>
+            <w:tcW w:type="dxa" w:w="3135"/>
           </w:tcPr>
           <w:p>
-            <w:r/>
             <w:r>
               <w:rPr>
-                <w:rFonts w:ascii="Calibri" w:hAnsi="Calibri"/>
-                <w:color w:val="854D0E"/>
                 <w:sz w:val="18"/>
               </w:rPr>
-              <w:t>Цель выполнения НИОКР</w:t>
+              <w:t>Сроки выполнения</w:t>
             </w:r>
           </w:p>
         </w:tc>
         <w:tc>
           <w:tcPr>
-            <w:tcW w:type="dxa" w:w="3324"/>
-            <w:shd w:fill="fef9c3" w:val="clear"/>
+            <w:tcW w:type="dxa" w:w="3135"/>
           </w:tcPr>
           <w:p>
-            <w:r/>
             <w:r>
               <w:rPr>
-                <w:rFonts w:ascii="Calibri" w:hAnsi="Calibri"/>
-                <w:color w:val="854D0E"/>
-                <w:sz w:val="18"/>
-              </w:rPr>
-              <w:t>⚡ Уточняется</w:t>
-            </w:r>
-          </w:p>
-        </w:tc>
-        <w:tc>
-          <w:tcPr>
-            <w:tcW w:type="dxa" w:w="3324"/>
-          </w:tcPr>
-          <w:p>
-            <w:r/>
-            <w:r>
-              <w:rPr>
-                <w:rFonts w:ascii="Calibri" w:hAnsi="Calibri"/>
-                <w:sz w:val="18"/>
-              </w:rPr>
-              <w:t>Определяется совместно после утверждения продукта-инновации.</w:t>
-            </w:r>
-          </w:p>
-        </w:tc>
-      </w:tr>
-      <w:tr>
-        <w:tc>
-          <w:tcPr>
-            <w:tcW w:type="dxa" w:w="3324"/>
-            <w:shd w:fill="fef9c3" w:val="clear"/>
-          </w:tcPr>
-          <w:p>
-            <w:r/>
-            <w:r>
-              <w:rPr>
-                <w:rFonts w:ascii="Calibri" w:hAnsi="Calibri"/>
-                <w:color w:val="854D0E"/>
-                <w:sz w:val="18"/>
-              </w:rPr>
-              <w:t>Научно-техническая новизна</w:t>
-            </w:r>
-          </w:p>
-        </w:tc>
-        <w:tc>
-          <w:tcPr>
-            <w:tcW w:type="dxa" w:w="3324"/>
-            <w:shd w:fill="fef9c3" w:val="clear"/>
-          </w:tcPr>
-          <w:p>
-            <w:r/>
-            <w:r>
-              <w:rPr>
-                <w:rFonts w:ascii="Calibri" w:hAnsi="Calibri"/>
-                <w:color w:val="854D0E"/>
-                <w:sz w:val="18"/>
-              </w:rPr>
-              <w:t>⚡ Уточняется</w:t>
-            </w:r>
-          </w:p>
-        </w:tc>
-        <w:tc>
-          <w:tcPr>
-            <w:tcW w:type="dxa" w:w="3324"/>
-          </w:tcPr>
-          <w:p>
-            <w:r/>
-            <w:r>
-              <w:rPr>
-                <w:rFonts w:ascii="Calibri" w:hAnsi="Calibri"/>
-                <w:sz w:val="18"/>
-              </w:rPr>
-              <w:t>Определяется совместно, при возможности — с привлечением патентоведа.</w:t>
-            </w:r>
-          </w:p>
-        </w:tc>
-      </w:tr>
-      <w:tr>
-        <w:tc>
-          <w:tcPr>
-            <w:tcW w:type="dxa" w:w="3324"/>
-            <w:shd w:fill="fee2e2" w:val="clear"/>
-          </w:tcPr>
-          <w:p>
-            <w:r/>
-            <w:r>
-              <w:rPr>
-                <w:rFonts w:ascii="Calibri" w:hAnsi="Calibri"/>
-                <w:color w:val="991B1B"/>
-                <w:sz w:val="18"/>
-              </w:rPr>
-              <w:t>Наличие патентов и иных правоохранных документов</w:t>
-            </w:r>
-          </w:p>
-        </w:tc>
-        <w:tc>
-          <w:tcPr>
-            <w:tcW w:type="dxa" w:w="3324"/>
-            <w:shd w:fill="fee2e2" w:val="clear"/>
-          </w:tcPr>
-          <w:p>
-            <w:r/>
-            <w:r>
-              <w:rPr>
-                <w:rFonts w:ascii="Calibri" w:hAnsi="Calibri"/>
-                <w:color w:val="991B1B"/>
                 <w:sz w:val="18"/>
               </w:rPr>
               <w:t>✗ Нет данных</w:t>
@@ -2026,16 +1531,14 @@
         </w:tc>
         <w:tc>
           <w:tcPr>
-            <w:tcW w:type="dxa" w:w="3324"/>
+            <w:tcW w:type="dxa" w:w="3135"/>
           </w:tcPr>
           <w:p>
-            <w:r/>
             <w:r>
               <w:rPr>
-                <w:rFonts w:ascii="Calibri" w:hAnsi="Calibri"/>
                 <w:sz w:val="18"/>
               </w:rPr>
-              <w:t>Не обнаружены. Требуется подача заявки на полезную модель.</w:t>
+              <w:t>После согласования</w:t>
             </w:r>
           </w:p>
         </w:tc>
@@ -2043,83 +1546,24 @@
       <w:tr>
         <w:tc>
           <w:tcPr>
-            <w:tcW w:type="dxa" w:w="3324"/>
-            <w:shd w:fill="fef9c3" w:val="clear"/>
+            <w:tcW w:type="dxa" w:w="3135"/>
           </w:tcPr>
           <w:p>
-            <w:r/>
             <w:r>
               <w:rPr>
-                <w:rFonts w:ascii="Calibri" w:hAnsi="Calibri"/>
-                <w:color w:val="854D0E"/>
                 <w:sz w:val="18"/>
               </w:rPr>
-              <w:t>Планы по дополнительной защите ИС</w:t>
+              <w:t>Бюджет НИОКР</w:t>
             </w:r>
           </w:p>
         </w:tc>
         <w:tc>
           <w:tcPr>
-            <w:tcW w:type="dxa" w:w="3324"/>
-            <w:shd w:fill="fef9c3" w:val="clear"/>
+            <w:tcW w:type="dxa" w:w="3135"/>
           </w:tcPr>
           <w:p>
-            <w:r/>
             <w:r>
               <w:rPr>
-                <w:rFonts w:ascii="Calibri" w:hAnsi="Calibri"/>
-                <w:color w:val="854D0E"/>
-                <w:sz w:val="18"/>
-              </w:rPr>
-              <w:t>⚡ Уточняется</w:t>
-            </w:r>
-          </w:p>
-        </w:tc>
-        <w:tc>
-          <w:tcPr>
-            <w:tcW w:type="dxa" w:w="3324"/>
-          </w:tcPr>
-          <w:p>
-            <w:r/>
-            <w:r>
-              <w:rPr>
-                <w:rFonts w:ascii="Calibri" w:hAnsi="Calibri"/>
-                <w:sz w:val="18"/>
-              </w:rPr>
-              <w:t>Прорабатывается с патентоведом. Рекомендуется: полезная модель → патент на изобретение → рассмотрение зарубежных рынков.</w:t>
-            </w:r>
-          </w:p>
-        </w:tc>
-      </w:tr>
-      <w:tr>
-        <w:tc>
-          <w:tcPr>
-            <w:tcW w:type="dxa" w:w="3324"/>
-            <w:shd w:fill="fee2e2" w:val="clear"/>
-          </w:tcPr>
-          <w:p>
-            <w:r/>
-            <w:r>
-              <w:rPr>
-                <w:rFonts w:ascii="Calibri" w:hAnsi="Calibri"/>
-                <w:color w:val="991B1B"/>
-                <w:sz w:val="18"/>
-              </w:rPr>
-              <w:t>Задел по тематике проекта (исследования, публикации, ИС)</w:t>
-            </w:r>
-          </w:p>
-        </w:tc>
-        <w:tc>
-          <w:tcPr>
-            <w:tcW w:type="dxa" w:w="3324"/>
-            <w:shd w:fill="fee2e2" w:val="clear"/>
-          </w:tcPr>
-          <w:p>
-            <w:r/>
-            <w:r>
-              <w:rPr>
-                <w:rFonts w:ascii="Calibri" w:hAnsi="Calibri"/>
-                <w:color w:val="991B1B"/>
                 <w:sz w:val="18"/>
               </w:rPr>
               <w:t>✗ Нет данных</w:t>
@@ -2128,16 +1572,14 @@
         </w:tc>
         <w:tc>
           <w:tcPr>
-            <w:tcW w:type="dxa" w:w="3324"/>
+            <w:tcW w:type="dxa" w:w="3135"/>
           </w:tcPr>
           <w:p>
-            <w:r/>
             <w:r>
               <w:rPr>
-                <w:rFonts w:ascii="Calibri" w:hAnsi="Calibri"/>
                 <w:sz w:val="18"/>
               </w:rPr>
-              <w:t>Информации не имеется. Требуется предоставить при наличии.</w:t>
+              <w:t>Запрашивается у клиента</w:t>
             </w:r>
           </w:p>
         </w:tc>
@@ -2145,663 +1587,113 @@
       <w:tr>
         <w:tc>
           <w:tcPr>
-            <w:tcW w:type="dxa" w:w="3324"/>
-            <w:shd w:fill="fef9c3" w:val="clear"/>
+            <w:tcW w:type="dxa" w:w="3135"/>
           </w:tcPr>
           <w:p>
-            <w:r/>
             <w:r>
               <w:rPr>
-                <w:rFonts w:ascii="Calibri" w:hAnsi="Calibri"/>
-                <w:color w:val="854D0E"/>
                 <w:sz w:val="18"/>
               </w:rPr>
-              <w:t>Способы и методы решения задач НИОКР</w:t>
+              <w:t>Ожидаемый результат</w:t>
             </w:r>
           </w:p>
         </w:tc>
         <w:tc>
           <w:tcPr>
-            <w:tcW w:type="dxa" w:w="3324"/>
-            <w:shd w:fill="fef9c3" w:val="clear"/>
+            <w:tcW w:type="dxa" w:w="3135"/>
           </w:tcPr>
           <w:p>
-            <w:r/>
             <w:r>
               <w:rPr>
-                <w:rFonts w:ascii="Calibri" w:hAnsi="Calibri"/>
-                <w:color w:val="854D0E"/>
                 <w:sz w:val="18"/>
               </w:rPr>
-              <w:t>⚡ Уточняется</w:t>
+              <w:t>🟡 Уточняется</w:t>
             </w:r>
           </w:p>
         </w:tc>
         <w:tc>
           <w:tcPr>
-            <w:tcW w:type="dxa" w:w="3324"/>
+            <w:tcW w:type="dxa" w:w="3135"/>
           </w:tcPr>
           <w:p>
-            <w:r/>
             <w:r>
               <w:rPr>
-                <w:rFonts w:ascii="Calibri" w:hAnsi="Calibri"/>
                 <w:sz w:val="18"/>
               </w:rPr>
-              <w:t>Прорабатывается совместно с аналитиками после утверждения технологии.</w:t>
+              <w:t>Создание продукта, обеспечивающего технологическое превосходство</w:t>
             </w:r>
           </w:p>
         </w:tc>
       </w:tr>
     </w:tbl>
-    <w:p/>
     <w:p>
-      <w:pPr>
-        <w:pStyle w:val="Heading1"/>
-      </w:pPr>
       <w:r>
         <w:rPr>
-          <w:color w:val="1E293B"/>
+          <w:rFonts w:ascii="Arial" w:hAnsi="Arial"/>
+          <w:b/>
+          <w:sz w:val="22"/>
         </w:rPr>
-        <w:t>6. Проект технического задания на выполнение НИОКР</w:t>
+        <w:t>6. Проект ТЗ на выполнение НИОКР</w:t>
       </w:r>
     </w:p>
-    <w:tbl>
-      <w:tblPr>
-        <w:tblStyle w:val="LightList-Accent1"/>
-        <w:tblW w:type="auto" w:w="0"/>
-        <w:tblLook w:firstColumn="1" w:firstRow="1" w:lastColumn="0" w:lastRow="0" w:noHBand="0" w:noVBand="1" w:val="04A0"/>
-      </w:tblPr>
-      <w:tblGrid>
-        <w:gridCol w:w="3324"/>
-        <w:gridCol w:w="3324"/>
-        <w:gridCol w:w="3324"/>
-      </w:tblGrid>
-      <w:tr>
-        <w:tc>
-          <w:tcPr>
-            <w:tcW w:type="dxa" w:w="3324"/>
-          </w:tcPr>
-          <w:p>
-            <w:r/>
-            <w:r>
-              <w:rPr>
-                <w:rFonts w:ascii="Calibri" w:hAnsi="Calibri"/>
-                <w:b/>
-                <w:sz w:val="19"/>
-              </w:rPr>
-              <w:t>Пункт</w:t>
-            </w:r>
-          </w:p>
-        </w:tc>
-        <w:tc>
-          <w:tcPr>
-            <w:tcW w:type="dxa" w:w="3324"/>
-          </w:tcPr>
-          <w:p>
-            <w:r/>
-            <w:r>
-              <w:rPr>
-                <w:rFonts w:ascii="Calibri" w:hAnsi="Calibri"/>
-                <w:b/>
-                <w:sz w:val="19"/>
-              </w:rPr>
-              <w:t>Статус</w:t>
-            </w:r>
-          </w:p>
-        </w:tc>
-        <w:tc>
-          <w:tcPr>
-            <w:tcW w:type="dxa" w:w="3324"/>
-          </w:tcPr>
-          <w:p>
-            <w:r/>
-            <w:r>
-              <w:rPr>
-                <w:rFonts w:ascii="Calibri" w:hAnsi="Calibri"/>
-                <w:b/>
-                <w:sz w:val="19"/>
-              </w:rPr>
-              <w:t>Значение / Комментарий</w:t>
-            </w:r>
-          </w:p>
-        </w:tc>
-      </w:tr>
-      <w:tr>
-        <w:tc>
-          <w:tcPr>
-            <w:tcW w:type="dxa" w:w="3324"/>
-            <w:shd w:fill="fef9c3" w:val="clear"/>
-          </w:tcPr>
-          <w:p>
-            <w:r/>
-            <w:r>
-              <w:rPr>
-                <w:rFonts w:ascii="Calibri" w:hAnsi="Calibri"/>
-                <w:color w:val="854D0E"/>
-                <w:sz w:val="18"/>
-              </w:rPr>
-              <w:t>Функции, которые должен обеспечивать разрабатываемый продукт</w:t>
-            </w:r>
-          </w:p>
-        </w:tc>
-        <w:tc>
-          <w:tcPr>
-            <w:tcW w:type="dxa" w:w="3324"/>
-            <w:shd w:fill="fef9c3" w:val="clear"/>
-          </w:tcPr>
-          <w:p>
-            <w:r/>
-            <w:r>
-              <w:rPr>
-                <w:rFonts w:ascii="Calibri" w:hAnsi="Calibri"/>
-                <w:color w:val="854D0E"/>
-                <w:sz w:val="18"/>
-              </w:rPr>
-              <w:t>⚡ Уточняется</w:t>
-            </w:r>
-          </w:p>
-        </w:tc>
-        <w:tc>
-          <w:tcPr>
-            <w:tcW w:type="dxa" w:w="3324"/>
-          </w:tcPr>
-          <w:p>
-            <w:r/>
-            <w:r>
-              <w:rPr>
-                <w:rFonts w:ascii="Calibri" w:hAnsi="Calibri"/>
-                <w:sz w:val="18"/>
-              </w:rPr>
-              <w:t>Определяется совместно с заказчиком.</w:t>
-            </w:r>
-          </w:p>
-        </w:tc>
-      </w:tr>
-      <w:tr>
-        <w:tc>
-          <w:tcPr>
-            <w:tcW w:type="dxa" w:w="3324"/>
-            <w:shd w:fill="fef9c3" w:val="clear"/>
-          </w:tcPr>
-          <w:p>
-            <w:r/>
-            <w:r>
-              <w:rPr>
-                <w:rFonts w:ascii="Calibri" w:hAnsi="Calibri"/>
-                <w:color w:val="854D0E"/>
-                <w:sz w:val="18"/>
-              </w:rPr>
-              <w:t>Количественные параметры (5–7 параметров в числовом выражении)</w:t>
-            </w:r>
-          </w:p>
-        </w:tc>
-        <w:tc>
-          <w:tcPr>
-            <w:tcW w:type="dxa" w:w="3324"/>
-            <w:shd w:fill="fef9c3" w:val="clear"/>
-          </w:tcPr>
-          <w:p>
-            <w:r/>
-            <w:r>
-              <w:rPr>
-                <w:rFonts w:ascii="Calibri" w:hAnsi="Calibri"/>
-                <w:color w:val="854D0E"/>
-                <w:sz w:val="18"/>
-              </w:rPr>
-              <w:t>⚡ Уточняется</w:t>
-            </w:r>
-          </w:p>
-        </w:tc>
-        <w:tc>
-          <w:tcPr>
-            <w:tcW w:type="dxa" w:w="3324"/>
-          </w:tcPr>
-          <w:p>
-            <w:r/>
-            <w:r>
-              <w:rPr>
-                <w:rFonts w:ascii="Calibri" w:hAnsi="Calibri"/>
-                <w:sz w:val="18"/>
-              </w:rPr>
-              <w:t>Определяется совместно после утверждения продукта.</w:t>
-            </w:r>
-          </w:p>
-        </w:tc>
-      </w:tr>
-      <w:tr>
-        <w:tc>
-          <w:tcPr>
-            <w:tcW w:type="dxa" w:w="3324"/>
-            <w:shd w:fill="fef9c3" w:val="clear"/>
-          </w:tcPr>
-          <w:p>
-            <w:r/>
-            <w:r>
-              <w:rPr>
-                <w:rFonts w:ascii="Calibri" w:hAnsi="Calibri"/>
-                <w:color w:val="854D0E"/>
-                <w:sz w:val="18"/>
-              </w:rPr>
-              <w:t>Входные воздействия (сигналы, данные, мех. воздействия)</w:t>
-            </w:r>
-          </w:p>
-        </w:tc>
-        <w:tc>
-          <w:tcPr>
-            <w:tcW w:type="dxa" w:w="3324"/>
-            <w:shd w:fill="fef9c3" w:val="clear"/>
-          </w:tcPr>
-          <w:p>
-            <w:r/>
-            <w:r>
-              <w:rPr>
-                <w:rFonts w:ascii="Calibri" w:hAnsi="Calibri"/>
-                <w:color w:val="854D0E"/>
-                <w:sz w:val="18"/>
-              </w:rPr>
-              <w:t>⚡ Уточняется</w:t>
-            </w:r>
-          </w:p>
-        </w:tc>
-        <w:tc>
-          <w:tcPr>
-            <w:tcW w:type="dxa" w:w="3324"/>
-          </w:tcPr>
-          <w:p>
-            <w:r/>
-            <w:r>
-              <w:rPr>
-                <w:rFonts w:ascii="Calibri" w:hAnsi="Calibri"/>
-                <w:sz w:val="18"/>
-              </w:rPr>
-              <w:t>Определяется совместно.</w:t>
-            </w:r>
-          </w:p>
-        </w:tc>
-      </w:tr>
-      <w:tr>
-        <w:tc>
-          <w:tcPr>
-            <w:tcW w:type="dxa" w:w="3324"/>
-            <w:shd w:fill="fef9c3" w:val="clear"/>
-          </w:tcPr>
-          <w:p>
-            <w:r/>
-            <w:r>
-              <w:rPr>
-                <w:rFonts w:ascii="Calibri" w:hAnsi="Calibri"/>
-                <w:color w:val="854D0E"/>
-                <w:sz w:val="18"/>
-              </w:rPr>
-              <w:t>Выходные реакции продукта</w:t>
-            </w:r>
-          </w:p>
-        </w:tc>
-        <w:tc>
-          <w:tcPr>
-            <w:tcW w:type="dxa" w:w="3324"/>
-            <w:shd w:fill="fef9c3" w:val="clear"/>
-          </w:tcPr>
-          <w:p>
-            <w:r/>
-            <w:r>
-              <w:rPr>
-                <w:rFonts w:ascii="Calibri" w:hAnsi="Calibri"/>
-                <w:color w:val="854D0E"/>
-                <w:sz w:val="18"/>
-              </w:rPr>
-              <w:t>⚡ Уточняется</w:t>
-            </w:r>
-          </w:p>
-        </w:tc>
-        <w:tc>
-          <w:tcPr>
-            <w:tcW w:type="dxa" w:w="3324"/>
-          </w:tcPr>
-          <w:p>
-            <w:r/>
-            <w:r>
-              <w:rPr>
-                <w:rFonts w:ascii="Calibri" w:hAnsi="Calibri"/>
-                <w:sz w:val="18"/>
-              </w:rPr>
-              <w:t>Определяется совместно.</w:t>
-            </w:r>
-          </w:p>
-        </w:tc>
-      </w:tr>
-      <w:tr>
-        <w:tc>
-          <w:tcPr>
-            <w:tcW w:type="dxa" w:w="3324"/>
-            <w:shd w:fill="fef9c3" w:val="clear"/>
-          </w:tcPr>
-          <w:p>
-            <w:r/>
-            <w:r>
-              <w:rPr>
-                <w:rFonts w:ascii="Calibri" w:hAnsi="Calibri"/>
-                <w:color w:val="854D0E"/>
-                <w:sz w:val="18"/>
-              </w:rPr>
-              <w:t>Внешний вид и состав продукта</w:t>
-            </w:r>
-          </w:p>
-        </w:tc>
-        <w:tc>
-          <w:tcPr>
-            <w:tcW w:type="dxa" w:w="3324"/>
-            <w:shd w:fill="fef9c3" w:val="clear"/>
-          </w:tcPr>
-          <w:p>
-            <w:r/>
-            <w:r>
-              <w:rPr>
-                <w:rFonts w:ascii="Calibri" w:hAnsi="Calibri"/>
-                <w:color w:val="854D0E"/>
-                <w:sz w:val="18"/>
-              </w:rPr>
-              <w:t>⚡ Уточняется</w:t>
-            </w:r>
-          </w:p>
-        </w:tc>
-        <w:tc>
-          <w:tcPr>
-            <w:tcW w:type="dxa" w:w="3324"/>
-          </w:tcPr>
-          <w:p>
-            <w:r/>
-            <w:r>
-              <w:rPr>
-                <w:rFonts w:ascii="Calibri" w:hAnsi="Calibri"/>
-                <w:sz w:val="18"/>
-              </w:rPr>
-              <w:t>Определяется совместно. Требуются фото/чертежи.</w:t>
-            </w:r>
-          </w:p>
-        </w:tc>
-      </w:tr>
-      <w:tr>
-        <w:tc>
-          <w:tcPr>
-            <w:tcW w:type="dxa" w:w="3324"/>
-            <w:shd w:fill="fef9c3" w:val="clear"/>
-          </w:tcPr>
-          <w:p>
-            <w:r/>
-            <w:r>
-              <w:rPr>
-                <w:rFonts w:ascii="Calibri" w:hAnsi="Calibri"/>
-                <w:color w:val="854D0E"/>
-                <w:sz w:val="18"/>
-              </w:rPr>
-              <w:t>Требования к конструкции и исходным компонентам</w:t>
-            </w:r>
-          </w:p>
-        </w:tc>
-        <w:tc>
-          <w:tcPr>
-            <w:tcW w:type="dxa" w:w="3324"/>
-            <w:shd w:fill="fef9c3" w:val="clear"/>
-          </w:tcPr>
-          <w:p>
-            <w:r/>
-            <w:r>
-              <w:rPr>
-                <w:rFonts w:ascii="Calibri" w:hAnsi="Calibri"/>
-                <w:color w:val="854D0E"/>
-                <w:sz w:val="18"/>
-              </w:rPr>
-              <w:t>⚡ Уточняется</w:t>
-            </w:r>
-          </w:p>
-        </w:tc>
-        <w:tc>
-          <w:tcPr>
-            <w:tcW w:type="dxa" w:w="3324"/>
-          </w:tcPr>
-          <w:p>
-            <w:r/>
-            <w:r>
-              <w:rPr>
-                <w:rFonts w:ascii="Calibri" w:hAnsi="Calibri"/>
-                <w:sz w:val="18"/>
-              </w:rPr>
-              <w:t>Определяется совместно с техническими специалистами компании.</w:t>
-            </w:r>
-          </w:p>
-        </w:tc>
-      </w:tr>
-      <w:tr>
-        <w:tc>
-          <w:tcPr>
-            <w:tcW w:type="dxa" w:w="3324"/>
-            <w:shd w:fill="fef9c3" w:val="clear"/>
-          </w:tcPr>
-          <w:p>
-            <w:r/>
-            <w:r>
-              <w:rPr>
-                <w:rFonts w:ascii="Calibri" w:hAnsi="Calibri"/>
-                <w:color w:val="854D0E"/>
-                <w:sz w:val="18"/>
-              </w:rPr>
-              <w:t>Требования к массогабаритным характеристикам</w:t>
-            </w:r>
-          </w:p>
-        </w:tc>
-        <w:tc>
-          <w:tcPr>
-            <w:tcW w:type="dxa" w:w="3324"/>
-            <w:shd w:fill="fef9c3" w:val="clear"/>
-          </w:tcPr>
-          <w:p>
-            <w:r/>
-            <w:r>
-              <w:rPr>
-                <w:rFonts w:ascii="Calibri" w:hAnsi="Calibri"/>
-                <w:color w:val="854D0E"/>
-                <w:sz w:val="18"/>
-              </w:rPr>
-              <w:t>⚡ Уточняется</w:t>
-            </w:r>
-          </w:p>
-        </w:tc>
-        <w:tc>
-          <w:tcPr>
-            <w:tcW w:type="dxa" w:w="3324"/>
-          </w:tcPr>
-          <w:p>
-            <w:r/>
-            <w:r>
-              <w:rPr>
-                <w:rFonts w:ascii="Calibri" w:hAnsi="Calibri"/>
-                <w:sz w:val="18"/>
-              </w:rPr>
-              <w:t>Определяется совместно (если применимо).</w:t>
-            </w:r>
-          </w:p>
-        </w:tc>
-      </w:tr>
-      <w:tr>
-        <w:tc>
-          <w:tcPr>
-            <w:tcW w:type="dxa" w:w="3324"/>
-            <w:shd w:fill="fef9c3" w:val="clear"/>
-          </w:tcPr>
-          <w:p>
-            <w:r/>
-            <w:r>
-              <w:rPr>
-                <w:rFonts w:ascii="Calibri" w:hAnsi="Calibri"/>
-                <w:color w:val="854D0E"/>
-                <w:sz w:val="18"/>
-              </w:rPr>
-              <w:t>Вид исполнения, товарные формы</w:t>
-            </w:r>
-          </w:p>
-        </w:tc>
-        <w:tc>
-          <w:tcPr>
-            <w:tcW w:type="dxa" w:w="3324"/>
-            <w:shd w:fill="fef9c3" w:val="clear"/>
-          </w:tcPr>
-          <w:p>
-            <w:r/>
-            <w:r>
-              <w:rPr>
-                <w:rFonts w:ascii="Calibri" w:hAnsi="Calibri"/>
-                <w:color w:val="854D0E"/>
-                <w:sz w:val="18"/>
-              </w:rPr>
-              <w:t>⚡ Уточняется</w:t>
-            </w:r>
-          </w:p>
-        </w:tc>
-        <w:tc>
-          <w:tcPr>
-            <w:tcW w:type="dxa" w:w="3324"/>
-          </w:tcPr>
-          <w:p>
-            <w:r/>
-            <w:r>
-              <w:rPr>
-                <w:rFonts w:ascii="Calibri" w:hAnsi="Calibri"/>
-                <w:sz w:val="18"/>
-              </w:rPr>
-              <w:t>Определяется совместно.</w:t>
-            </w:r>
-          </w:p>
-        </w:tc>
-      </w:tr>
-      <w:tr>
-        <w:tc>
-          <w:tcPr>
-            <w:tcW w:type="dxa" w:w="3324"/>
-            <w:shd w:fill="dbeafe" w:val="clear"/>
-          </w:tcPr>
-          <w:p>
-            <w:r/>
-            <w:r>
-              <w:rPr>
-                <w:rFonts w:ascii="Calibri" w:hAnsi="Calibri"/>
-                <w:color w:val="1E40AF"/>
-                <w:sz w:val="18"/>
-              </w:rPr>
-              <w:t>Планируемые стоимостные характеристики продукции</w:t>
-            </w:r>
-          </w:p>
-        </w:tc>
-        <w:tc>
-          <w:tcPr>
-            <w:tcW w:type="dxa" w:w="3324"/>
-            <w:shd w:fill="dbeafe" w:val="clear"/>
-          </w:tcPr>
-          <w:p>
-            <w:r/>
-            <w:r>
-              <w:rPr>
-                <w:rFonts w:ascii="Calibri" w:hAnsi="Calibri"/>
-                <w:color w:val="1E40AF"/>
-                <w:sz w:val="18"/>
-              </w:rPr>
-              <w:t>📋 Ждём от клиента</w:t>
-            </w:r>
-          </w:p>
-        </w:tc>
-        <w:tc>
-          <w:tcPr>
-            <w:tcW w:type="dxa" w:w="3324"/>
-          </w:tcPr>
-          <w:p>
-            <w:r/>
-            <w:r>
-              <w:rPr>
-                <w:rFonts w:ascii="Calibri" w:hAnsi="Calibri"/>
-                <w:sz w:val="18"/>
-              </w:rPr>
-              <w:t>Должны быть предоставлены клиентом.</w:t>
-            </w:r>
-          </w:p>
-        </w:tc>
-      </w:tr>
-    </w:tbl>
-    <w:p/>
     <w:p>
-      <w:pPr>
-        <w:pStyle w:val="Heading2"/>
-      </w:pPr>
       <w:r>
         <w:rPr>
-          <w:color w:val="1E293B"/>
+          <w:color w:val="646464"/>
+          <w:sz w:val="18"/>
+        </w:rPr>
+        <w:t>Формируется с клиентом после подписания договора.</w:t>
+      </w:r>
+    </w:p>
+    <w:p>
+      <w:r>
+        <w:rPr>
+          <w:rFonts w:ascii="Arial" w:hAnsi="Arial"/>
+          <w:b/>
+          <w:sz w:val="22"/>
         </w:rPr>
         <w:t>Примечания для аналитиков</w:t>
       </w:r>
     </w:p>
     <w:p>
-      <w:pPr>
-        <w:pStyle w:val="ListBullet"/>
-      </w:pPr>
+      <w:pPr/>
       <w:r>
         <w:rPr>
-          <w:rFonts w:ascii="Calibri" w:hAnsi="Calibri"/>
           <w:sz w:val="18"/>
         </w:rPr>
-        <w:t>Патент: если у клиента нет патента — работаем с патентоведом, он помогает сформулировать научную новизну. Заявка на патент подаётся параллельно с заявкой в Сколково.</w:t>
+        <w:t>• ОКВЭД 32.12.7 — редкая специализация, хорошо подходит для Сколково.</w:t>
       </w:r>
     </w:p>
     <w:p>
-      <w:pPr>
-        <w:pStyle w:val="ListBullet"/>
-      </w:pPr>
+      <w:pPr/>
       <w:r>
         <w:rPr>
-          <w:rFonts w:ascii="Calibri" w:hAnsi="Calibri"/>
           <w:sz w:val="18"/>
         </w:rPr>
-        <w:t>Стоимость продукта и количество продаж — запрашиваются у клиента (75% случаев).</w:t>
+        <w:t>• Высокая прибыль (60 млн при 353 млн выручки).</w:t>
       </w:r>
     </w:p>
     <w:p>
-      <w:pPr>
-        <w:pStyle w:val="ListBullet"/>
-      </w:pPr>
+      <w:pPr/>
       <w:r>
         <w:rPr>
-          <w:rFonts w:ascii="Calibri" w:hAnsi="Calibri"/>
           <w:sz w:val="18"/>
         </w:rPr>
-        <w:t>Сайт компании не обнаружен. Рекомендовать клиенту создать минимальную страницу с описанием продукции.</w:t>
+        <w:t>• Учредители: Дарвин Вячеслав Сергеевич, Матвейчук Константин Игоревич.</w:t>
       </w:r>
     </w:p>
     <w:p>
-      <w:pPr>
-        <w:pStyle w:val="ListBullet"/>
-      </w:pPr>
+      <w:pPr/>
       <w:r>
         <w:rPr>
-          <w:rFonts w:ascii="Calibri" w:hAnsi="Calibri"/>
           <w:sz w:val="18"/>
         </w:rPr>
-        <w:t>Связанные компании: ООО НПК «ТРАНСМАШ» (ИНН 2703092545) — не подходит для Сколково (оптовая торговля, неактивна).</w:t>
-      </w:r>
-    </w:p>
-    <w:p>
-      <w:pPr>
-        <w:pStyle w:val="ListBullet"/>
-      </w:pPr>
-      <w:r>
-        <w:rPr>
-          <w:rFonts w:ascii="Calibri" w:hAnsi="Calibri"/>
-          <w:sz w:val="18"/>
-        </w:rPr>
-        <w:t>На весь процесс клиент тратит 3–5 рабочих дней команды.</w:t>
+        <w:t>• Уставный капитал 1 млн руб.</w:t>
       </w:r>
     </w:p>
     <w:sectPr>
       <w:pgSz w:w="12240" w:h="15840"/>
-      <w:pgMar w:top="1134" w:right="1134" w:bottom="1134" w:left="1134" w:header="720" w:footer="720" w:gutter="0"/>
+      <w:pgMar w:top="1134" w:right="1417" w:bottom="1134" w:left="1417" w:header="720" w:footer="720" w:gutter="0"/>
       <w:cols w:space="720"/>
       <w:docGrid w:linePitch="360"/>
     </w:sectPr>
@@ -3173,7 +2065,7 @@
     <w:qFormat/>
     <w:rsid w:val="00FC693F"/>
     <w:rPr>
-      <w:rFonts w:ascii="Calibri" w:hAnsi="Calibri"/>
+      <w:rFonts w:ascii="Arial" w:hAnsi="Arial"/>
       <w:sz w:val="20"/>
     </w:rPr>
   </w:style>

</xml_diff>

<commit_message>
Update clients/amberim/anketa_AMBERIM.docx — proper formatting
</commit_message>
<xml_diff>
--- a/clients/amberim/anketa_AMBERIM.docx
+++ b/clients/amberim/anketa_AMBERIM.docx
@@ -4,15 +4,68 @@
   <w:body>
     <w:p>
       <w:pPr>
-        <w:jc w:val="center"/>
+        <w:spacing w:after="40" w:before="0" w:line="240" w:lineRule="auto"/>
       </w:pPr>
       <w:r>
         <w:rPr>
-          <w:rFonts w:ascii="Arial" w:hAnsi="Arial"/>
+          <w:rFonts w:ascii="Calibri" w:hAnsi="Calibri"/>
           <w:b/>
+          <w:color w:val="1E293B"/>
           <w:sz w:val="18"/>
         </w:rPr>
         <w:t>КОНСАЛТИНГОВАЯ КОМПАНИЯ</w:t>
+      </w:r>
+    </w:p>
+    <w:p>
+      <w:pPr>
+        <w:spacing w:after="40" w:before="0" w:line="240" w:lineRule="auto"/>
+      </w:pPr>
+      <w:r>
+        <w:rPr>
+          <w:rFonts w:ascii="Calibri" w:hAnsi="Calibri"/>
+          <w:b/>
+          <w:color w:val="1E293B"/>
+          <w:sz w:val="32"/>
+        </w:rPr>
+        <w:t>ANDROMEDA CONSULT</w:t>
+      </w:r>
+    </w:p>
+    <w:p>
+      <w:pPr>
+        <w:spacing w:after="40" w:before="0" w:line="240" w:lineRule="auto"/>
+      </w:pPr>
+      <w:r>
+        <w:rPr>
+          <w:rFonts w:ascii="Calibri" w:hAnsi="Calibri"/>
+          <w:color w:val="64748B"/>
+          <w:sz w:val="16"/>
+        </w:rPr>
+        <w:t>ИНН 7702464831  |  ОГРН 1197746181038  |  КПП 770201001</w:t>
+      </w:r>
+    </w:p>
+    <w:p>
+      <w:pPr>
+        <w:spacing w:after="80" w:before="0" w:line="240" w:lineRule="auto"/>
+      </w:pPr>
+      <w:r>
+        <w:rPr>
+          <w:rFonts w:ascii="Calibri" w:hAnsi="Calibri"/>
+          <w:color w:val="475569"/>
+          <w:sz w:val="16"/>
+        </w:rPr>
+        <w:t>info@andromedaconsult.ru  |  andromedaconsult.ru  |  @andromedaconsult</w:t>
+      </w:r>
+    </w:p>
+    <w:p>
+      <w:pPr>
+        <w:spacing w:before="120" w:after="240"/>
+      </w:pPr>
+      <w:r>
+        <w:rPr>
+          <w:sz w:val="12"/>
+          <w:color w:val="cbd5e1"/>
+        </w:rPr>
+        <w:t>────────────────────────────────────────────────────────────────────────</w:t>
       </w:r>
     </w:p>
     <w:p>
@@ -21,57 +74,9 @@
       </w:pPr>
       <w:r>
         <w:rPr>
-          <w:rFonts w:ascii="Arial" w:hAnsi="Arial"/>
-          <w:sz w:val="18"/>
-        </w:rPr>
-        <w:t>ANDROMEDA CONSULT</w:t>
-      </w:r>
-    </w:p>
-    <w:p>
-      <w:pPr>
-        <w:jc w:val="center"/>
-      </w:pPr>
-      <w:r>
-        <w:rPr>
-          <w:rFonts w:ascii="Arial" w:hAnsi="Arial"/>
-          <w:sz w:val="18"/>
-        </w:rPr>
-        <w:t>ИНН 7702464831  |  ОГРН 1197746181038  |  КПП 770201001</w:t>
-      </w:r>
-    </w:p>
-    <w:p>
-      <w:pPr>
-        <w:jc w:val="center"/>
-      </w:pPr>
-      <w:r>
-        <w:rPr>
-          <w:rFonts w:ascii="Arial" w:hAnsi="Arial"/>
-          <w:sz w:val="18"/>
-        </w:rPr>
-        <w:t>info@andromedaconsult.ru  |  andromedaconsult.ru  |  @andromedaconsult</w:t>
-      </w:r>
-    </w:p>
-    <w:p>
-      <w:pPr>
-        <w:jc w:val="center"/>
-      </w:pPr>
-      <w:r>
-        <w:rPr>
-          <w:color w:val="B4B4B4"/>
-          <w:sz w:val="16"/>
-        </w:rPr>
-        <w:t>============================================================</w:t>
-      </w:r>
-    </w:p>
-    <w:p>
-      <w:pPr>
-        <w:jc w:val="center"/>
-      </w:pPr>
-      <w:r>
-        <w:rPr>
-          <w:rFonts w:ascii="Arial" w:hAnsi="Arial"/>
           <w:b/>
-          <w:sz w:val="28"/>
+          <w:color w:val="1E293B"/>
+          <w:sz w:val="36"/>
         </w:rPr>
         <w:t>АНКЕТА ДЛЯ ЗАЯВКИ В СКОЛКОВО</w:t>
       </w:r>
@@ -82,8 +87,8 @@
       </w:pPr>
       <w:r>
         <w:rPr>
-          <w:rFonts w:ascii="Arial" w:hAnsi="Arial"/>
-          <w:sz w:val="22"/>
+          <w:color w:val="4B5563"/>
+          <w:sz w:val="28"/>
         </w:rPr>
         <w:t>ООО «АМБЕРТИМ» (ИНН 3906364524)</w:t>
       </w:r>
@@ -94,10 +99,10 @@
       </w:pPr>
       <w:r>
         <w:rPr>
-          <w:color w:val="646464"/>
+          <w:color w:val="9CA3AF"/>
           <w:sz w:val="18"/>
         </w:rPr>
-        <w:t>09 июля 2026 г.</w:t>
+        <w:t>Предварительно заполнено на основе открытых источников</w:t>
       </w:r>
     </w:p>
     <w:p>
@@ -106,39 +111,46 @@
       </w:pPr>
       <w:r>
         <w:rPr>
-          <w:color w:val="B4B4B4"/>
-          <w:sz w:val="16"/>
+          <w:color w:val="9CA3AF"/>
+          <w:sz w:val="18"/>
         </w:rPr>
-        <w:t>============================================================</w:t>
+        <w:t>09.07.2026</w:t>
       </w:r>
     </w:p>
+    <w:p/>
     <w:p>
+      <w:pPr>
+        <w:pStyle w:val="Heading2"/>
+      </w:pPr>
       <w:r>
         <w:rPr>
-          <w:b/>
-          <w:sz w:val="20"/>
+          <w:color w:val="1E293B"/>
         </w:rPr>
         <w:t>Условные обозначения</w:t>
       </w:r>
     </w:p>
     <w:tbl>
       <w:tblPr>
-        <w:tblStyle w:val="TableGrid"/>
+        <w:tblStyle w:val="LightList-Accent1"/>
         <w:tblW w:type="auto" w:w="0"/>
         <w:tblLook w:firstColumn="1" w:firstRow="1" w:lastColumn="0" w:lastRow="0" w:noHBand="0" w:noVBand="1" w:val="04A0"/>
       </w:tblPr>
       <w:tblGrid>
-        <w:gridCol w:w="4703"/>
-        <w:gridCol w:w="4703"/>
+        <w:gridCol w:w="4986"/>
+        <w:gridCol w:w="4986"/>
       </w:tblGrid>
       <w:tr>
         <w:tc>
           <w:tcPr>
-            <w:tcW w:type="dxa" w:w="4703"/>
+            <w:tcW w:type="dxa" w:w="4986"/>
+            <w:shd w:fill="dcfce7" w:val="clear"/>
           </w:tcPr>
           <w:p>
+            <w:r/>
             <w:r>
               <w:rPr>
+                <w:rFonts w:ascii="Calibri" w:hAnsi="Calibri"/>
+                <w:color w:val="166534"/>
                 <w:sz w:val="18"/>
               </w:rPr>
               <w:t>🟢 Заполнено из открытых источников</w:t>
@@ -147,11 +159,15 @@
         </w:tc>
         <w:tc>
           <w:tcPr>
-            <w:tcW w:type="dxa" w:w="4703"/>
+            <w:tcW w:type="dxa" w:w="4986"/>
+            <w:shd w:fill="dcfce7" w:val="clear"/>
           </w:tcPr>
           <w:p>
+            <w:r/>
             <w:r>
               <w:rPr>
+                <w:rFonts w:ascii="Calibri" w:hAnsi="Calibri"/>
+                <w:color w:val="166534"/>
                 <w:sz w:val="18"/>
               </w:rPr>
               <w:t>✓ Данные подтверждены</w:t>
@@ -162,11 +178,15 @@
       <w:tr>
         <w:tc>
           <w:tcPr>
-            <w:tcW w:type="dxa" w:w="4703"/>
+            <w:tcW w:type="dxa" w:w="4986"/>
+            <w:shd w:fill="fef9c3" w:val="clear"/>
           </w:tcPr>
           <w:p>
+            <w:r/>
             <w:r>
               <w:rPr>
+                <w:rFonts w:ascii="Calibri" w:hAnsi="Calibri"/>
+                <w:color w:val="854D0E"/>
                 <w:sz w:val="18"/>
               </w:rPr>
               <w:t>🟡 Прорабатывается совместно с аналитиками</w:t>
@@ -175,11 +195,15 @@
         </w:tc>
         <w:tc>
           <w:tcPr>
-            <w:tcW w:type="dxa" w:w="4703"/>
+            <w:tcW w:type="dxa" w:w="4986"/>
+            <w:shd w:fill="fef9c3" w:val="clear"/>
           </w:tcPr>
           <w:p>
+            <w:r/>
             <w:r>
               <w:rPr>
+                <w:rFonts w:ascii="Calibri" w:hAnsi="Calibri"/>
+                <w:color w:val="854D0E"/>
                 <w:sz w:val="18"/>
               </w:rPr>
               <w:t>⚡ Уточняется</w:t>
@@ -190,24 +214,32 @@
       <w:tr>
         <w:tc>
           <w:tcPr>
-            <w:tcW w:type="dxa" w:w="4703"/>
+            <w:tcW w:type="dxa" w:w="4986"/>
+            <w:shd w:fill="fee2e2" w:val="clear"/>
           </w:tcPr>
           <w:p>
+            <w:r/>
             <w:r>
               <w:rPr>
+                <w:rFonts w:ascii="Calibri" w:hAnsi="Calibri"/>
+                <w:color w:val="991B1B"/>
                 <w:sz w:val="18"/>
               </w:rPr>
-              <w:t>🔴 Нет информации — требуется от клиента</w:t>
+              <w:t>🔴 Нет информации — требуется предоставить клиентом</w:t>
             </w:r>
           </w:p>
         </w:tc>
         <w:tc>
           <w:tcPr>
-            <w:tcW w:type="dxa" w:w="4703"/>
+            <w:tcW w:type="dxa" w:w="4986"/>
+            <w:shd w:fill="fee2e2" w:val="clear"/>
           </w:tcPr>
           <w:p>
+            <w:r/>
             <w:r>
               <w:rPr>
+                <w:rFonts w:ascii="Calibri" w:hAnsi="Calibri"/>
+                <w:color w:val="991B1B"/>
                 <w:sz w:val="18"/>
               </w:rPr>
               <w:t>✗ Отсутствуют</w:t>
@@ -215,42 +247,79 @@
           </w:p>
         </w:tc>
       </w:tr>
+      <w:tr>
+        <w:tc>
+          <w:tcPr>
+            <w:tcW w:type="dxa" w:w="4986"/>
+            <w:shd w:fill="dbeafe" w:val="clear"/>
+          </w:tcPr>
+          <w:p>
+            <w:r/>
+            <w:r>
+              <w:rPr>
+                <w:rFonts w:ascii="Calibri" w:hAnsi="Calibri"/>
+                <w:color w:val="1E40AF"/>
+                <w:sz w:val="18"/>
+              </w:rPr>
+              <w:t>🔵 Должна быть предоставлена клиентом</w:t>
+            </w:r>
+          </w:p>
+        </w:tc>
+        <w:tc>
+          <w:tcPr>
+            <w:tcW w:type="dxa" w:w="4986"/>
+            <w:shd w:fill="dbeafe" w:val="clear"/>
+          </w:tcPr>
+          <w:p>
+            <w:r/>
+            <w:r>
+              <w:rPr>
+                <w:rFonts w:ascii="Calibri" w:hAnsi="Calibri"/>
+                <w:color w:val="1E40AF"/>
+                <w:sz w:val="18"/>
+              </w:rPr>
+              <w:t>📋 Ждём от клиента</w:t>
+            </w:r>
+          </w:p>
+        </w:tc>
+      </w:tr>
     </w:tbl>
     <w:p/>
     <w:p>
+      <w:pPr>
+        <w:pStyle w:val="Heading1"/>
+      </w:pPr>
       <w:r>
         <w:rPr>
-          <w:rFonts w:ascii="Arial" w:hAnsi="Arial"/>
-          <w:b/>
-          <w:sz w:val="22"/>
+          <w:color w:val="1E293B"/>
         </w:rPr>
         <w:t>1. Данные от личного кабинета (lk.sk.ru)</w:t>
       </w:r>
     </w:p>
     <w:tbl>
       <w:tblPr>
-        <w:tblStyle w:val="TableGrid"/>
+        <w:tblStyle w:val="LightList-Accent1"/>
         <w:tblW w:type="auto" w:w="0"/>
+        <w:jc w:val="center"/>
         <w:tblLook w:firstColumn="1" w:firstRow="1" w:lastColumn="0" w:lastRow="0" w:noHBand="0" w:noVBand="1" w:val="04A0"/>
       </w:tblPr>
       <w:tblGrid>
-        <w:gridCol w:w="3135"/>
-        <w:gridCol w:w="3135"/>
-        <w:gridCol w:w="3135"/>
+        <w:gridCol w:w="3324"/>
+        <w:gridCol w:w="3324"/>
+        <w:gridCol w:w="3324"/>
       </w:tblGrid>
       <w:tr>
         <w:tc>
           <w:tcPr>
-            <w:tcW w:type="dxa" w:w="3135"/>
+            <w:tcW w:type="dxa" w:w="3324"/>
           </w:tcPr>
           <w:p>
-            <w:pPr>
-              <w:jc w:val="center"/>
-            </w:pPr>
+            <w:r/>
             <w:r>
               <w:rPr>
+                <w:rFonts w:ascii="Calibri" w:hAnsi="Calibri"/>
                 <w:b/>
-                <w:sz w:val="18"/>
+                <w:sz w:val="19"/>
               </w:rPr>
               <w:t>Пункт</w:t>
             </w:r>
@@ -258,16 +327,15 @@
         </w:tc>
         <w:tc>
           <w:tcPr>
-            <w:tcW w:type="dxa" w:w="3135"/>
+            <w:tcW w:type="dxa" w:w="3324"/>
           </w:tcPr>
           <w:p>
-            <w:pPr>
-              <w:jc w:val="center"/>
-            </w:pPr>
+            <w:r/>
             <w:r>
               <w:rPr>
+                <w:rFonts w:ascii="Calibri" w:hAnsi="Calibri"/>
                 <w:b/>
-                <w:sz w:val="18"/>
+                <w:sz w:val="19"/>
               </w:rPr>
               <w:t>Статус</w:t>
             </w:r>
@@ -275,16 +343,15 @@
         </w:tc>
         <w:tc>
           <w:tcPr>
-            <w:tcW w:type="dxa" w:w="3135"/>
+            <w:tcW w:type="dxa" w:w="3324"/>
           </w:tcPr>
           <w:p>
-            <w:pPr>
-              <w:jc w:val="center"/>
-            </w:pPr>
+            <w:r/>
             <w:r>
               <w:rPr>
+                <w:rFonts w:ascii="Calibri" w:hAnsi="Calibri"/>
                 <w:b/>
-                <w:sz w:val="18"/>
+                <w:sz w:val="19"/>
               </w:rPr>
               <w:t>Значение / Комментарий</w:t>
             </w:r>
@@ -294,11 +361,15 @@
       <w:tr>
         <w:tc>
           <w:tcPr>
-            <w:tcW w:type="dxa" w:w="3135"/>
+            <w:tcW w:type="dxa" w:w="3324"/>
+            <w:shd w:fill="dbeafe" w:val="clear"/>
           </w:tcPr>
           <w:p>
+            <w:r/>
             <w:r>
               <w:rPr>
+                <w:rFonts w:ascii="Calibri" w:hAnsi="Calibri"/>
+                <w:color w:val="1E40AF"/>
                 <w:sz w:val="18"/>
               </w:rPr>
               <w:t>Логин, пароль от личного кабинета lk.sk.ru</w:t>
@@ -307,66 +378,73 @@
         </w:tc>
         <w:tc>
           <w:tcPr>
-            <w:tcW w:type="dxa" w:w="3135"/>
+            <w:tcW w:type="dxa" w:w="3324"/>
+            <w:shd w:fill="dbeafe" w:val="clear"/>
           </w:tcPr>
           <w:p>
+            <w:r/>
             <w:r>
               <w:rPr>
+                <w:rFonts w:ascii="Calibri" w:hAnsi="Calibri"/>
+                <w:color w:val="1E40AF"/>
                 <w:sz w:val="18"/>
               </w:rPr>
-              <w:t>✗ Отсутствуют</w:t>
+              <w:t>Ждём от клиента</w:t>
             </w:r>
           </w:p>
         </w:tc>
         <w:tc>
           <w:tcPr>
-            <w:tcW w:type="dxa" w:w="3135"/>
+            <w:tcW w:type="dxa" w:w="3324"/>
           </w:tcPr>
           <w:p>
+            <w:r/>
             <w:r>
               <w:rPr>
+                <w:rFonts w:ascii="Calibri" w:hAnsi="Calibri"/>
                 <w:sz w:val="18"/>
               </w:rPr>
-              <w:t>Необходимо предоставить доступ для подачи заявки</w:t>
+              <w:t>Необходимо предоставить доступ к личному кабинету. Без этого невозможна регистрация заявки.</w:t>
             </w:r>
           </w:p>
         </w:tc>
       </w:tr>
     </w:tbl>
+    <w:p/>
     <w:p>
+      <w:pPr>
+        <w:pStyle w:val="Heading1"/>
+      </w:pPr>
       <w:r>
         <w:rPr>
-          <w:rFonts w:ascii="Arial" w:hAnsi="Arial"/>
-          <w:b/>
-          <w:sz w:val="22"/>
+          <w:color w:val="1E293B"/>
         </w:rPr>
         <w:t>2. Информация о компании</w:t>
       </w:r>
     </w:p>
     <w:tbl>
       <w:tblPr>
-        <w:tblStyle w:val="TableGrid"/>
+        <w:tblStyle w:val="LightList-Accent1"/>
         <w:tblW w:type="auto" w:w="0"/>
         <w:tblLook w:firstColumn="1" w:firstRow="1" w:lastColumn="0" w:lastRow="0" w:noHBand="0" w:noVBand="1" w:val="04A0"/>
       </w:tblPr>
       <w:tblGrid>
-        <w:gridCol w:w="3135"/>
-        <w:gridCol w:w="3135"/>
-        <w:gridCol w:w="3135"/>
+        <w:gridCol w:w="3324"/>
+        <w:gridCol w:w="3324"/>
+        <w:gridCol w:w="3324"/>
       </w:tblGrid>
       <w:tr>
         <w:tc>
           <w:tcPr>
-            <w:tcW w:type="dxa" w:w="3135"/>
+            <w:tcW w:type="dxa" w:w="3324"/>
           </w:tcPr>
           <w:p>
-            <w:pPr>
-              <w:jc w:val="center"/>
-            </w:pPr>
+            <w:r/>
             <w:r>
               <w:rPr>
+                <w:rFonts w:ascii="Calibri" w:hAnsi="Calibri"/>
                 <w:b/>
-                <w:sz w:val="18"/>
+                <w:sz w:val="19"/>
               </w:rPr>
               <w:t>Пункт</w:t>
             </w:r>
@@ -374,16 +452,15 @@
         </w:tc>
         <w:tc>
           <w:tcPr>
-            <w:tcW w:type="dxa" w:w="3135"/>
+            <w:tcW w:type="dxa" w:w="3324"/>
           </w:tcPr>
           <w:p>
-            <w:pPr>
-              <w:jc w:val="center"/>
-            </w:pPr>
+            <w:r/>
             <w:r>
               <w:rPr>
+                <w:rFonts w:ascii="Calibri" w:hAnsi="Calibri"/>
                 <w:b/>
-                <w:sz w:val="18"/>
+                <w:sz w:val="19"/>
               </w:rPr>
               <w:t>Статус</w:t>
             </w:r>
@@ -391,16 +468,15 @@
         </w:tc>
         <w:tc>
           <w:tcPr>
-            <w:tcW w:type="dxa" w:w="3135"/>
+            <w:tcW w:type="dxa" w:w="3324"/>
           </w:tcPr>
           <w:p>
-            <w:pPr>
-              <w:jc w:val="center"/>
-            </w:pPr>
+            <w:r/>
             <w:r>
               <w:rPr>
+                <w:rFonts w:ascii="Calibri" w:hAnsi="Calibri"/>
                 <w:b/>
-                <w:sz w:val="18"/>
+                <w:sz w:val="19"/>
               </w:rPr>
               <w:t>Значение / Комментарий</w:t>
             </w:r>
@@ -410,11 +486,15 @@
       <w:tr>
         <w:tc>
           <w:tcPr>
-            <w:tcW w:type="dxa" w:w="3135"/>
+            <w:tcW w:type="dxa" w:w="3324"/>
+            <w:shd w:fill="dcfce7" w:val="clear"/>
           </w:tcPr>
           <w:p>
+            <w:r/>
             <w:r>
               <w:rPr>
+                <w:rFonts w:ascii="Calibri" w:hAnsi="Calibri"/>
+                <w:color w:val="166534"/>
                 <w:sz w:val="18"/>
               </w:rPr>
               <w:t>ФИО контактного лица</w:t>
@@ -423,24 +503,30 @@
         </w:tc>
         <w:tc>
           <w:tcPr>
-            <w:tcW w:type="dxa" w:w="3135"/>
+            <w:tcW w:type="dxa" w:w="3324"/>
+            <w:shd w:fill="dcfce7" w:val="clear"/>
           </w:tcPr>
           <w:p>
+            <w:r/>
             <w:r>
               <w:rPr>
+                <w:rFonts w:ascii="Calibri" w:hAnsi="Calibri"/>
+                <w:color w:val="166534"/>
                 <w:sz w:val="18"/>
               </w:rPr>
-              <w:t>🟢 Заполнено</w:t>
+              <w:t>✓ Заполнено</w:t>
             </w:r>
           </w:p>
         </w:tc>
         <w:tc>
           <w:tcPr>
-            <w:tcW w:type="dxa" w:w="3135"/>
+            <w:tcW w:type="dxa" w:w="3324"/>
           </w:tcPr>
           <w:p>
+            <w:r/>
             <w:r>
               <w:rPr>
+                <w:rFonts w:ascii="Calibri" w:hAnsi="Calibri"/>
                 <w:sz w:val="18"/>
               </w:rPr>
               <w:t>Матвейчук Константин Игоревич — генеральный директор</w:t>
@@ -451,11 +537,15 @@
       <w:tr>
         <w:tc>
           <w:tcPr>
-            <w:tcW w:type="dxa" w:w="3135"/>
+            <w:tcW w:type="dxa" w:w="3324"/>
+            <w:shd w:fill="dcfce7" w:val="clear"/>
           </w:tcPr>
           <w:p>
+            <w:r/>
             <w:r>
               <w:rPr>
+                <w:rFonts w:ascii="Calibri" w:hAnsi="Calibri"/>
+                <w:color w:val="166534"/>
                 <w:sz w:val="18"/>
               </w:rPr>
               <w:t>ИНН юридического лица</w:t>
@@ -464,24 +554,30 @@
         </w:tc>
         <w:tc>
           <w:tcPr>
-            <w:tcW w:type="dxa" w:w="3135"/>
+            <w:tcW w:type="dxa" w:w="3324"/>
+            <w:shd w:fill="dcfce7" w:val="clear"/>
           </w:tcPr>
           <w:p>
+            <w:r/>
             <w:r>
               <w:rPr>
+                <w:rFonts w:ascii="Calibri" w:hAnsi="Calibri"/>
+                <w:color w:val="166534"/>
                 <w:sz w:val="18"/>
               </w:rPr>
-              <w:t>🟢 Заполнено</w:t>
+              <w:t>✓ Заполнено</w:t>
             </w:r>
           </w:p>
         </w:tc>
         <w:tc>
           <w:tcPr>
-            <w:tcW w:type="dxa" w:w="3135"/>
+            <w:tcW w:type="dxa" w:w="3324"/>
           </w:tcPr>
           <w:p>
+            <w:r/>
             <w:r>
               <w:rPr>
+                <w:rFonts w:ascii="Calibri" w:hAnsi="Calibri"/>
                 <w:sz w:val="18"/>
               </w:rPr>
               <w:t>3906364524 (ООО «АМБЕРТИМ»)</w:t>
@@ -492,40 +588,50 @@
       <w:tr>
         <w:tc>
           <w:tcPr>
-            <w:tcW w:type="dxa" w:w="3135"/>
+            <w:tcW w:type="dxa" w:w="3324"/>
+            <w:shd w:fill="fef9c3" w:val="clear"/>
           </w:tcPr>
           <w:p>
+            <w:r/>
             <w:r>
               <w:rPr>
+                <w:rFonts w:ascii="Calibri" w:hAnsi="Calibri"/>
+                <w:color w:val="854D0E"/>
                 <w:sz w:val="18"/>
               </w:rPr>
-              <w:t>Юридический адрес</w:t>
+              <w:t>Почта, телефон контактного лица</w:t>
             </w:r>
           </w:p>
         </w:tc>
         <w:tc>
           <w:tcPr>
-            <w:tcW w:type="dxa" w:w="3135"/>
+            <w:tcW w:type="dxa" w:w="3324"/>
+            <w:shd w:fill="fef9c3" w:val="clear"/>
           </w:tcPr>
           <w:p>
+            <w:r/>
             <w:r>
               <w:rPr>
+                <w:rFonts w:ascii="Calibri" w:hAnsi="Calibri"/>
+                <w:color w:val="854D0E"/>
                 <w:sz w:val="18"/>
               </w:rPr>
-              <w:t>🟢 Заполнено</w:t>
+              <w:t>⚡ Уточняется</w:t>
             </w:r>
           </w:p>
         </w:tc>
         <w:tc>
           <w:tcPr>
-            <w:tcW w:type="dxa" w:w="3135"/>
+            <w:tcW w:type="dxa" w:w="3324"/>
           </w:tcPr>
           <w:p>
+            <w:r/>
             <w:r>
               <w:rPr>
+                <w:rFonts w:ascii="Calibri" w:hAnsi="Calibri"/>
                 <w:sz w:val="18"/>
               </w:rPr>
-              <w:t>236010, г. Калининград, Правая наб., д. 21</w:t>
+              <w:t>Тел: +7 (921) 263-65-57 (Дарья, гл. бухгалтер). Email: уточняется.</w:t>
             </w:r>
           </w:p>
         </w:tc>
@@ -533,40 +639,50 @@
       <w:tr>
         <w:tc>
           <w:tcPr>
-            <w:tcW w:type="dxa" w:w="3135"/>
+            <w:tcW w:type="dxa" w:w="3324"/>
+            <w:shd w:fill="fee2e2" w:val="clear"/>
           </w:tcPr>
           <w:p>
+            <w:r/>
             <w:r>
               <w:rPr>
+                <w:rFonts w:ascii="Calibri" w:hAnsi="Calibri"/>
+                <w:color w:val="991B1B"/>
                 <w:sz w:val="18"/>
               </w:rPr>
-              <w:t>ОГРН</w:t>
+              <w:t>Ссылка на страницу с описанием продукции в сети Интернет</w:t>
             </w:r>
           </w:p>
         </w:tc>
         <w:tc>
           <w:tcPr>
-            <w:tcW w:type="dxa" w:w="3135"/>
+            <w:tcW w:type="dxa" w:w="3324"/>
+            <w:shd w:fill="fee2e2" w:val="clear"/>
           </w:tcPr>
           <w:p>
+            <w:r/>
             <w:r>
               <w:rPr>
+                <w:rFonts w:ascii="Calibri" w:hAnsi="Calibri"/>
+                <w:color w:val="991B1B"/>
                 <w:sz w:val="18"/>
               </w:rPr>
-              <w:t>🟢 Заполнено</w:t>
+              <w:t>✗ Нет данных</w:t>
             </w:r>
           </w:p>
         </w:tc>
         <w:tc>
           <w:tcPr>
-            <w:tcW w:type="dxa" w:w="3135"/>
+            <w:tcW w:type="dxa" w:w="3324"/>
           </w:tcPr>
           <w:p>
+            <w:r/>
             <w:r>
               <w:rPr>
+                <w:rFonts w:ascii="Calibri" w:hAnsi="Calibri"/>
                 <w:sz w:val="18"/>
               </w:rPr>
-              <w:t>1183926003260</w:t>
+              <w:t>Сайт компании не обнаружен. Рекомендуется: создать минимальный лендинг или предоставить ссылку с описанием продукции.</w:t>
             </w:r>
           </w:p>
         </w:tc>
@@ -574,284 +690,90 @@
       <w:tr>
         <w:tc>
           <w:tcPr>
-            <w:tcW w:type="dxa" w:w="3135"/>
+            <w:tcW w:type="dxa" w:w="3324"/>
+            <w:shd w:fill="fee2e2" w:val="clear"/>
           </w:tcPr>
           <w:p>
+            <w:r/>
             <w:r>
               <w:rPr>
+                <w:rFonts w:ascii="Calibri" w:hAnsi="Calibri"/>
+                <w:color w:val="991B1B"/>
                 <w:sz w:val="18"/>
               </w:rPr>
-              <w:t>Основной ОКВЭД</w:t>
+              <w:t>Выпуски журнала в конференциях/тематических журналах с участием предприятия</w:t>
             </w:r>
           </w:p>
         </w:tc>
         <w:tc>
           <w:tcPr>
-            <w:tcW w:type="dxa" w:w="3135"/>
+            <w:tcW w:type="dxa" w:w="3324"/>
+            <w:shd w:fill="fee2e2" w:val="clear"/>
           </w:tcPr>
           <w:p>
+            <w:r/>
             <w:r>
               <w:rPr>
+                <w:rFonts w:ascii="Calibri" w:hAnsi="Calibri"/>
+                <w:color w:val="991B1B"/>
                 <w:sz w:val="18"/>
               </w:rPr>
-              <w:t>🟢 Заполнено</w:t>
+              <w:t>✗ Нет данных</w:t>
             </w:r>
           </w:p>
         </w:tc>
         <w:tc>
           <w:tcPr>
-            <w:tcW w:type="dxa" w:w="3135"/>
+            <w:tcW w:type="dxa" w:w="3324"/>
           </w:tcPr>
           <w:p>
+            <w:r/>
             <w:r>
               <w:rPr>
+                <w:rFonts w:ascii="Calibri" w:hAnsi="Calibri"/>
                 <w:sz w:val="18"/>
               </w:rPr>
-              <w:t>32.12.7 — Обработка янтаря и производство изделий из янтаря</w:t>
-            </w:r>
-          </w:p>
-        </w:tc>
-      </w:tr>
-      <w:tr>
-        <w:tc>
-          <w:tcPr>
-            <w:tcW w:type="dxa" w:w="3135"/>
-          </w:tcPr>
-          <w:p>
-            <w:r>
-              <w:rPr>
-                <w:sz w:val="18"/>
-              </w:rPr>
-              <w:t>Телефон / e-mail</w:t>
-            </w:r>
-          </w:p>
-        </w:tc>
-        <w:tc>
-          <w:tcPr>
-            <w:tcW w:type="dxa" w:w="3135"/>
-          </w:tcPr>
-          <w:p>
-            <w:r>
-              <w:rPr>
-                <w:sz w:val="18"/>
-              </w:rPr>
-              <w:t>🟢 Заполнено</w:t>
-            </w:r>
-          </w:p>
-        </w:tc>
-        <w:tc>
-          <w:tcPr>
-            <w:tcW w:type="dxa" w:w="3135"/>
-          </w:tcPr>
-          <w:p>
-            <w:r>
-              <w:rPr>
-                <w:sz w:val="18"/>
-              </w:rPr>
-              <w:t>Уточняется при собеседовании</w:t>
-            </w:r>
-          </w:p>
-        </w:tc>
-      </w:tr>
-      <w:tr>
-        <w:tc>
-          <w:tcPr>
-            <w:tcW w:type="dxa" w:w="3135"/>
-          </w:tcPr>
-          <w:p>
-            <w:r>
-              <w:rPr>
-                <w:sz w:val="18"/>
-              </w:rPr>
-              <w:t>Расчётный счёт / банк</w:t>
-            </w:r>
-          </w:p>
-        </w:tc>
-        <w:tc>
-          <w:tcPr>
-            <w:tcW w:type="dxa" w:w="3135"/>
-          </w:tcPr>
-          <w:p>
-            <w:r>
-              <w:rPr>
-                <w:sz w:val="18"/>
-              </w:rPr>
-              <w:t>✗ Отсутствуют</w:t>
-            </w:r>
-          </w:p>
-        </w:tc>
-        <w:tc>
-          <w:tcPr>
-            <w:tcW w:type="dxa" w:w="3135"/>
-          </w:tcPr>
-          <w:p>
-            <w:r>
-              <w:rPr>
-                <w:sz w:val="18"/>
-              </w:rPr>
-              <w:t>Требуется предоставить</w:t>
-            </w:r>
-          </w:p>
-        </w:tc>
-      </w:tr>
-      <w:tr>
-        <w:tc>
-          <w:tcPr>
-            <w:tcW w:type="dxa" w:w="3135"/>
-          </w:tcPr>
-          <w:p>
-            <w:r>
-              <w:rPr>
-                <w:sz w:val="18"/>
-              </w:rPr>
-              <w:t>Форма налогообложения</w:t>
-            </w:r>
-          </w:p>
-        </w:tc>
-        <w:tc>
-          <w:tcPr>
-            <w:tcW w:type="dxa" w:w="3135"/>
-          </w:tcPr>
-          <w:p>
-            <w:r>
-              <w:rPr>
-                <w:sz w:val="18"/>
-              </w:rPr>
-              <w:t>🟢 Заполнено</w:t>
-            </w:r>
-          </w:p>
-        </w:tc>
-        <w:tc>
-          <w:tcPr>
-            <w:tcW w:type="dxa" w:w="3135"/>
-          </w:tcPr>
-          <w:p>
-            <w:r>
-              <w:rPr>
-                <w:sz w:val="18"/>
-              </w:rPr>
-              <w:t>Общий режим (ОСН)</w:t>
-            </w:r>
-          </w:p>
-        </w:tc>
-      </w:tr>
-      <w:tr>
-        <w:tc>
-          <w:tcPr>
-            <w:tcW w:type="dxa" w:w="3135"/>
-          </w:tcPr>
-          <w:p>
-            <w:r>
-              <w:rPr>
-                <w:sz w:val="18"/>
-              </w:rPr>
-              <w:t>Численность сотрудников</w:t>
-            </w:r>
-          </w:p>
-        </w:tc>
-        <w:tc>
-          <w:tcPr>
-            <w:tcW w:type="dxa" w:w="3135"/>
-          </w:tcPr>
-          <w:p>
-            <w:r>
-              <w:rPr>
-                <w:sz w:val="18"/>
-              </w:rPr>
-              <w:t>🟢 Заполнено</w:t>
-            </w:r>
-          </w:p>
-        </w:tc>
-        <w:tc>
-          <w:tcPr>
-            <w:tcW w:type="dxa" w:w="3135"/>
-          </w:tcPr>
-          <w:p>
-            <w:r>
-              <w:rPr>
-                <w:sz w:val="18"/>
-              </w:rPr>
-              <w:t>30 чел.</w:t>
-            </w:r>
-          </w:p>
-        </w:tc>
-      </w:tr>
-      <w:tr>
-        <w:tc>
-          <w:tcPr>
-            <w:tcW w:type="dxa" w:w="3135"/>
-          </w:tcPr>
-          <w:p>
-            <w:r>
-              <w:rPr>
-                <w:sz w:val="18"/>
-              </w:rPr>
-              <w:t>Выручка</w:t>
-            </w:r>
-          </w:p>
-        </w:tc>
-        <w:tc>
-          <w:tcPr>
-            <w:tcW w:type="dxa" w:w="3135"/>
-          </w:tcPr>
-          <w:p>
-            <w:r>
-              <w:rPr>
-                <w:sz w:val="18"/>
-              </w:rPr>
-              <w:t>🟢 Заполнено</w:t>
-            </w:r>
-          </w:p>
-        </w:tc>
-        <w:tc>
-          <w:tcPr>
-            <w:tcW w:type="dxa" w:w="3135"/>
-          </w:tcPr>
-          <w:p>
-            <w:r>
-              <w:rPr>
-                <w:sz w:val="18"/>
-              </w:rPr>
-              <w:t>2025 — 353 млн руб. (прибыль 60 млн)</w:t>
+              <w:t>Не обнаружено. Если есть — предоставить ссылки или скан-копии</w:t>
             </w:r>
           </w:p>
         </w:tc>
       </w:tr>
     </w:tbl>
+    <w:p/>
     <w:p>
+      <w:pPr>
+        <w:pStyle w:val="Heading1"/>
+      </w:pPr>
       <w:r>
         <w:rPr>
-          <w:rFonts w:ascii="Arial" w:hAnsi="Arial"/>
-          <w:b/>
-          <w:sz w:val="22"/>
+          <w:color w:val="1E293B"/>
         </w:rPr>
         <w:t>3. Научно-технический критерий</w:t>
       </w:r>
     </w:p>
     <w:tbl>
       <w:tblPr>
-        <w:tblStyle w:val="TableGrid"/>
+        <w:tblStyle w:val="LightList-Accent1"/>
         <w:tblW w:type="auto" w:w="0"/>
         <w:tblLook w:firstColumn="1" w:firstRow="1" w:lastColumn="0" w:lastRow="0" w:noHBand="0" w:noVBand="1" w:val="04A0"/>
       </w:tblPr>
       <w:tblGrid>
-        <w:gridCol w:w="3135"/>
-        <w:gridCol w:w="3135"/>
-        <w:gridCol w:w="3135"/>
+        <w:gridCol w:w="3324"/>
+        <w:gridCol w:w="3324"/>
+        <w:gridCol w:w="3324"/>
       </w:tblGrid>
       <w:tr>
         <w:tc>
           <w:tcPr>
-            <w:tcW w:type="dxa" w:w="3135"/>
+            <w:tcW w:type="dxa" w:w="3324"/>
           </w:tcPr>
           <w:p>
-            <w:pPr>
-              <w:jc w:val="center"/>
-            </w:pPr>
+            <w:r/>
             <w:r>
               <w:rPr>
+                <w:rFonts w:ascii="Calibri" w:hAnsi="Calibri"/>
                 <w:b/>
-                <w:sz w:val="18"/>
+                <w:sz w:val="19"/>
               </w:rPr>
               <w:t>Пункт</w:t>
             </w:r>
@@ -859,16 +781,15 @@
         </w:tc>
         <w:tc>
           <w:tcPr>
-            <w:tcW w:type="dxa" w:w="3135"/>
+            <w:tcW w:type="dxa" w:w="3324"/>
           </w:tcPr>
           <w:p>
-            <w:pPr>
-              <w:jc w:val="center"/>
-            </w:pPr>
+            <w:r/>
             <w:r>
               <w:rPr>
+                <w:rFonts w:ascii="Calibri" w:hAnsi="Calibri"/>
                 <w:b/>
-                <w:sz w:val="18"/>
+                <w:sz w:val="19"/>
               </w:rPr>
               <w:t>Статус</w:t>
             </w:r>
@@ -876,16 +797,15 @@
         </w:tc>
         <w:tc>
           <w:tcPr>
-            <w:tcW w:type="dxa" w:w="3135"/>
+            <w:tcW w:type="dxa" w:w="3324"/>
           </w:tcPr>
           <w:p>
-            <w:pPr>
-              <w:jc w:val="center"/>
-            </w:pPr>
+            <w:r/>
             <w:r>
               <w:rPr>
+                <w:rFonts w:ascii="Calibri" w:hAnsi="Calibri"/>
                 <w:b/>
-                <w:sz w:val="18"/>
+                <w:sz w:val="19"/>
               </w:rPr>
               <w:t>Значение / Комментарий</w:t>
             </w:r>
@@ -895,40 +815,50 @@
       <w:tr>
         <w:tc>
           <w:tcPr>
-            <w:tcW w:type="dxa" w:w="3135"/>
+            <w:tcW w:type="dxa" w:w="3324"/>
+            <w:shd w:fill="fef9c3" w:val="clear"/>
           </w:tcPr>
           <w:p>
+            <w:r/>
             <w:r>
               <w:rPr>
+                <w:rFonts w:ascii="Calibri" w:hAnsi="Calibri"/>
+                <w:color w:val="854D0E"/>
                 <w:sz w:val="18"/>
               </w:rPr>
-              <w:t>Описание продукта проекта. Новизна, функции</w:t>
+              <w:t>Описание продукта проекта. Новизна, функциональные параметры</w:t>
             </w:r>
           </w:p>
         </w:tc>
         <w:tc>
           <w:tcPr>
-            <w:tcW w:type="dxa" w:w="3135"/>
+            <w:tcW w:type="dxa" w:w="3324"/>
+            <w:shd w:fill="fef9c3" w:val="clear"/>
           </w:tcPr>
           <w:p>
+            <w:r/>
             <w:r>
               <w:rPr>
+                <w:rFonts w:ascii="Calibri" w:hAnsi="Calibri"/>
+                <w:color w:val="854D0E"/>
                 <w:sz w:val="18"/>
               </w:rPr>
-              <w:t>🟡 Уточняется</w:t>
+              <w:t>⚡ Уточняется</w:t>
             </w:r>
           </w:p>
         </w:tc>
         <w:tc>
           <w:tcPr>
-            <w:tcW w:type="dxa" w:w="3135"/>
+            <w:tcW w:type="dxa" w:w="3324"/>
           </w:tcPr>
           <w:p>
+            <w:r/>
             <w:r>
               <w:rPr>
+                <w:rFonts w:ascii="Calibri" w:hAnsi="Calibri"/>
                 <w:sz w:val="18"/>
               </w:rPr>
-              <w:t>Предполагаемая инновация: усовершенствованная технология обработки и облагораживания янтаря, повышающая выход качественного сырья и расширяющая цветовую палитру без потери природных свойств. Формулировка уточняется с технологами.</w:t>
+              <w:t>Прорабатывается совместно. Гипотеза: Усовершенствованная технология обработки и облагораживания янтаря с повышением выхода качественного сырья и расширением цветовой палитры.</w:t>
             </w:r>
           </w:p>
         </w:tc>
@@ -936,11 +866,15 @@
       <w:tr>
         <w:tc>
           <w:tcPr>
-            <w:tcW w:type="dxa" w:w="3135"/>
+            <w:tcW w:type="dxa" w:w="3324"/>
+            <w:shd w:fill="fee2e2" w:val="clear"/>
           </w:tcPr>
           <w:p>
+            <w:r/>
             <w:r>
               <w:rPr>
+                <w:rFonts w:ascii="Calibri" w:hAnsi="Calibri"/>
+                <w:color w:val="991B1B"/>
                 <w:sz w:val="18"/>
               </w:rPr>
               <w:t>Отчёты НИОКР</w:t>
@@ -949,11 +883,15 @@
         </w:tc>
         <w:tc>
           <w:tcPr>
-            <w:tcW w:type="dxa" w:w="3135"/>
+            <w:tcW w:type="dxa" w:w="3324"/>
+            <w:shd w:fill="fee2e2" w:val="clear"/>
           </w:tcPr>
           <w:p>
+            <w:r/>
             <w:r>
               <w:rPr>
+                <w:rFonts w:ascii="Calibri" w:hAnsi="Calibri"/>
+                <w:color w:val="991B1B"/>
                 <w:sz w:val="18"/>
               </w:rPr>
               <w:t>✗ Нет данных</w:t>
@@ -962,14 +900,16 @@
         </w:tc>
         <w:tc>
           <w:tcPr>
-            <w:tcW w:type="dxa" w:w="3135"/>
+            <w:tcW w:type="dxa" w:w="3324"/>
           </w:tcPr>
           <w:p>
+            <w:r/>
             <w:r>
               <w:rPr>
+                <w:rFonts w:ascii="Calibri" w:hAnsi="Calibri"/>
                 <w:sz w:val="18"/>
               </w:rPr>
-              <w:t>Не обнаружены в открытых источниках. Если проводились — запросить у клиента</w:t>
+              <w:t>Не обнаружены в открытых источниках. Если проводились — предоставить.</w:t>
             </w:r>
           </w:p>
         </w:tc>
@@ -977,24 +917,32 @@
       <w:tr>
         <w:tc>
           <w:tcPr>
-            <w:tcW w:type="dxa" w:w="3135"/>
+            <w:tcW w:type="dxa" w:w="3324"/>
+            <w:shd w:fill="fee2e2" w:val="clear"/>
           </w:tcPr>
           <w:p>
+            <w:r/>
             <w:r>
               <w:rPr>
+                <w:rFonts w:ascii="Calibri" w:hAnsi="Calibri"/>
+                <w:color w:val="991B1B"/>
                 <w:sz w:val="18"/>
               </w:rPr>
-              <w:t>Патентная защита</w:t>
+              <w:t>Договора на продажу инновационной продукции / письма заинтересованности</w:t>
             </w:r>
           </w:p>
         </w:tc>
         <w:tc>
           <w:tcPr>
-            <w:tcW w:type="dxa" w:w="3135"/>
+            <w:tcW w:type="dxa" w:w="3324"/>
+            <w:shd w:fill="fee2e2" w:val="clear"/>
           </w:tcPr>
           <w:p>
+            <w:r/>
             <w:r>
               <w:rPr>
+                <w:rFonts w:ascii="Calibri" w:hAnsi="Calibri"/>
+                <w:color w:val="991B1B"/>
                 <w:sz w:val="18"/>
               </w:rPr>
               <w:t>✗ Нет данных</w:t>
@@ -1003,14 +951,16 @@
         </w:tc>
         <w:tc>
           <w:tcPr>
-            <w:tcW w:type="dxa" w:w="3135"/>
+            <w:tcW w:type="dxa" w:w="3324"/>
           </w:tcPr>
           <w:p>
+            <w:r/>
             <w:r>
               <w:rPr>
+                <w:rFonts w:ascii="Calibri" w:hAnsi="Calibri"/>
                 <w:sz w:val="18"/>
               </w:rPr>
-              <w:t>Действующие патенты не обнаружены. Рекомендуется подача заявки на полезную модель</w:t>
+              <w:t>Не обнаружены. Если продукт ещё не продаётся — потребуются письма заинтересованности от потенциальных заказчиков.</w:t>
             </w:r>
           </w:p>
         </w:tc>
@@ -1018,24 +968,83 @@
       <w:tr>
         <w:tc>
           <w:tcPr>
-            <w:tcW w:type="dxa" w:w="3135"/>
+            <w:tcW w:type="dxa" w:w="3324"/>
+            <w:shd w:fill="fef9c3" w:val="clear"/>
           </w:tcPr>
           <w:p>
+            <w:r/>
             <w:r>
               <w:rPr>
+                <w:rFonts w:ascii="Calibri" w:hAnsi="Calibri"/>
+                <w:color w:val="854D0E"/>
                 <w:sz w:val="18"/>
               </w:rPr>
-              <w:t>Научные публикации</w:t>
+              <w:t>Заявка на объект интеллектуальной собственности (патент, изобретение, свидетельство на ПО)</w:t>
             </w:r>
           </w:p>
         </w:tc>
         <w:tc>
           <w:tcPr>
-            <w:tcW w:type="dxa" w:w="3135"/>
+            <w:tcW w:type="dxa" w:w="3324"/>
+            <w:shd w:fill="fef9c3" w:val="clear"/>
           </w:tcPr>
           <w:p>
+            <w:r/>
             <w:r>
               <w:rPr>
+                <w:rFonts w:ascii="Calibri" w:hAnsi="Calibri"/>
+                <w:color w:val="854D0E"/>
+                <w:sz w:val="18"/>
+              </w:rPr>
+              <w:t>⚡ Уточняется</w:t>
+            </w:r>
+          </w:p>
+        </w:tc>
+        <w:tc>
+          <w:tcPr>
+            <w:tcW w:type="dxa" w:w="3324"/>
+          </w:tcPr>
+          <w:p>
+            <w:r/>
+            <w:r>
+              <w:rPr>
+                <w:rFonts w:ascii="Calibri" w:hAnsi="Calibri"/>
+                <w:sz w:val="18"/>
+              </w:rPr>
+              <w:t>Патенты не найдены. Требуется подача заявки на полезную модель. Прорабатывается с патентоведом (~90 тыс. ₽, 4–5 мес.).</w:t>
+            </w:r>
+          </w:p>
+        </w:tc>
+      </w:tr>
+      <w:tr>
+        <w:tc>
+          <w:tcPr>
+            <w:tcW w:type="dxa" w:w="3324"/>
+            <w:shd w:fill="fee2e2" w:val="clear"/>
+          </w:tcPr>
+          <w:p>
+            <w:r/>
+            <w:r>
+              <w:rPr>
+                <w:rFonts w:ascii="Calibri" w:hAnsi="Calibri"/>
+                <w:color w:val="991B1B"/>
+                <w:sz w:val="18"/>
+              </w:rPr>
+              <w:t>Акты о внедрении инновационной продукции</w:t>
+            </w:r>
+          </w:p>
+        </w:tc>
+        <w:tc>
+          <w:tcPr>
+            <w:tcW w:type="dxa" w:w="3324"/>
+            <w:shd w:fill="fee2e2" w:val="clear"/>
+          </w:tcPr>
+          <w:p>
+            <w:r/>
+            <w:r>
+              <w:rPr>
+                <w:rFonts w:ascii="Calibri" w:hAnsi="Calibri"/>
+                <w:color w:val="991B1B"/>
                 <w:sz w:val="18"/>
               </w:rPr>
               <w:t>✗ Нет данных</w:t>
@@ -1044,14 +1053,16 @@
         </w:tc>
         <w:tc>
           <w:tcPr>
-            <w:tcW w:type="dxa" w:w="3135"/>
+            <w:tcW w:type="dxa" w:w="3324"/>
           </w:tcPr>
           <w:p>
+            <w:r/>
             <w:r>
               <w:rPr>
+                <w:rFonts w:ascii="Calibri" w:hAnsi="Calibri"/>
                 <w:sz w:val="18"/>
               </w:rPr>
-              <w:t>Не обнаружены. Не обязательны для Сколково</w:t>
+              <w:t>Не обнаружены. Требуется предоставить при наличии.</w:t>
             </w:r>
           </w:p>
         </w:tc>
@@ -1059,24 +1070,32 @@
       <w:tr>
         <w:tc>
           <w:tcPr>
-            <w:tcW w:type="dxa" w:w="3135"/>
+            <w:tcW w:type="dxa" w:w="3324"/>
+            <w:shd w:fill="fee2e2" w:val="clear"/>
           </w:tcPr>
           <w:p>
+            <w:r/>
             <w:r>
               <w:rPr>
+                <w:rFonts w:ascii="Calibri" w:hAnsi="Calibri"/>
+                <w:color w:val="991B1B"/>
                 <w:sz w:val="18"/>
               </w:rPr>
-              <w:t>Участие в выставках / конференциях</w:t>
+              <w:t>Акты испытания инновационной продукции</w:t>
             </w:r>
           </w:p>
         </w:tc>
         <w:tc>
           <w:tcPr>
-            <w:tcW w:type="dxa" w:w="3135"/>
+            <w:tcW w:type="dxa" w:w="3324"/>
+            <w:shd w:fill="fee2e2" w:val="clear"/>
           </w:tcPr>
           <w:p>
+            <w:r/>
             <w:r>
               <w:rPr>
+                <w:rFonts w:ascii="Calibri" w:hAnsi="Calibri"/>
+                <w:color w:val="991B1B"/>
                 <w:sz w:val="18"/>
               </w:rPr>
               <w:t>✗ Нет данных</w:t>
@@ -1085,53 +1104,209 @@
         </w:tc>
         <w:tc>
           <w:tcPr>
-            <w:tcW w:type="dxa" w:w="3135"/>
+            <w:tcW w:type="dxa" w:w="3324"/>
           </w:tcPr>
           <w:p>
+            <w:r/>
             <w:r>
               <w:rPr>
+                <w:rFonts w:ascii="Calibri" w:hAnsi="Calibri"/>
                 <w:sz w:val="18"/>
               </w:rPr>
-              <w:t>Уточнить у клиента</w:t>
+              <w:t>Не обнаружены. Требуется предоставить при наличии.</w:t>
+            </w:r>
+          </w:p>
+        </w:tc>
+      </w:tr>
+      <w:tr>
+        <w:tc>
+          <w:tcPr>
+            <w:tcW w:type="dxa" w:w="3324"/>
+            <w:shd w:fill="fee2e2" w:val="clear"/>
+          </w:tcPr>
+          <w:p>
+            <w:r/>
+            <w:r>
+              <w:rPr>
+                <w:rFonts w:ascii="Calibri" w:hAnsi="Calibri"/>
+                <w:color w:val="991B1B"/>
+                <w:sz w:val="18"/>
+              </w:rPr>
+              <w:t>Протокол испытаний / сертификации</w:t>
+            </w:r>
+          </w:p>
+        </w:tc>
+        <w:tc>
+          <w:tcPr>
+            <w:tcW w:type="dxa" w:w="3324"/>
+            <w:shd w:fill="fee2e2" w:val="clear"/>
+          </w:tcPr>
+          <w:p>
+            <w:r/>
+            <w:r>
+              <w:rPr>
+                <w:rFonts w:ascii="Calibri" w:hAnsi="Calibri"/>
+                <w:color w:val="991B1B"/>
+                <w:sz w:val="18"/>
+              </w:rPr>
+              <w:t>✗ Нет данных</w:t>
+            </w:r>
+          </w:p>
+        </w:tc>
+        <w:tc>
+          <w:tcPr>
+            <w:tcW w:type="dxa" w:w="3324"/>
+          </w:tcPr>
+          <w:p>
+            <w:r/>
+            <w:r>
+              <w:rPr>
+                <w:rFonts w:ascii="Calibri" w:hAnsi="Calibri"/>
+                <w:sz w:val="18"/>
+              </w:rPr>
+              <w:t>Не обнаружены. Требуется предоставить при наличии.</w:t>
+            </w:r>
+          </w:p>
+        </w:tc>
+      </w:tr>
+      <w:tr>
+        <w:tc>
+          <w:tcPr>
+            <w:tcW w:type="dxa" w:w="3324"/>
+            <w:shd w:fill="fef9c3" w:val="clear"/>
+          </w:tcPr>
+          <w:p>
+            <w:r/>
+            <w:r>
+              <w:rPr>
+                <w:rFonts w:ascii="Calibri" w:hAnsi="Calibri"/>
+                <w:color w:val="854D0E"/>
+                <w:sz w:val="18"/>
+              </w:rPr>
+              <w:t>Иная техническая документация (чертежи, ТУ, спецификации, конструкторские документы)</w:t>
+            </w:r>
+          </w:p>
+        </w:tc>
+        <w:tc>
+          <w:tcPr>
+            <w:tcW w:type="dxa" w:w="3324"/>
+            <w:shd w:fill="fef9c3" w:val="clear"/>
+          </w:tcPr>
+          <w:p>
+            <w:r/>
+            <w:r>
+              <w:rPr>
+                <w:rFonts w:ascii="Calibri" w:hAnsi="Calibri"/>
+                <w:color w:val="854D0E"/>
+                <w:sz w:val="18"/>
+              </w:rPr>
+              <w:t>⚡ Уточняется</w:t>
+            </w:r>
+          </w:p>
+        </w:tc>
+        <w:tc>
+          <w:tcPr>
+            <w:tcW w:type="dxa" w:w="3324"/>
+          </w:tcPr>
+          <w:p>
+            <w:r/>
+            <w:r>
+              <w:rPr>
+                <w:rFonts w:ascii="Calibri" w:hAnsi="Calibri"/>
+                <w:sz w:val="18"/>
+              </w:rPr>
+              <w:t>Предположительно имеется — в компании есть конструкторский отдел и инженерный состав. Требуется предоставить релевантные документы.</w:t>
+            </w:r>
+          </w:p>
+        </w:tc>
+      </w:tr>
+      <w:tr>
+        <w:tc>
+          <w:tcPr>
+            <w:tcW w:type="dxa" w:w="3324"/>
+            <w:shd w:fill="fee2e2" w:val="clear"/>
+          </w:tcPr>
+          <w:p>
+            <w:r/>
+            <w:r>
+              <w:rPr>
+                <w:rFonts w:ascii="Calibri" w:hAnsi="Calibri"/>
+                <w:color w:val="991B1B"/>
+                <w:sz w:val="18"/>
+              </w:rPr>
+              <w:t>Научные статьи по тематике продукции</w:t>
+            </w:r>
+          </w:p>
+        </w:tc>
+        <w:tc>
+          <w:tcPr>
+            <w:tcW w:type="dxa" w:w="3324"/>
+            <w:shd w:fill="fee2e2" w:val="clear"/>
+          </w:tcPr>
+          <w:p>
+            <w:r/>
+            <w:r>
+              <w:rPr>
+                <w:rFonts w:ascii="Calibri" w:hAnsi="Calibri"/>
+                <w:color w:val="991B1B"/>
+                <w:sz w:val="18"/>
+              </w:rPr>
+              <w:t>✗ Нет данных</w:t>
+            </w:r>
+          </w:p>
+        </w:tc>
+        <w:tc>
+          <w:tcPr>
+            <w:tcW w:type="dxa" w:w="3324"/>
+          </w:tcPr>
+          <w:p>
+            <w:r/>
+            <w:r>
+              <w:rPr>
+                <w:rFonts w:ascii="Calibri" w:hAnsi="Calibri"/>
+                <w:sz w:val="18"/>
+              </w:rPr>
+              <w:t>Не обнаружены в открытых источниках.</w:t>
             </w:r>
           </w:p>
         </w:tc>
       </w:tr>
     </w:tbl>
+    <w:p/>
     <w:p>
+      <w:pPr>
+        <w:pStyle w:val="Heading1"/>
+      </w:pPr>
       <w:r>
         <w:rPr>
-          <w:rFonts w:ascii="Arial" w:hAnsi="Arial"/>
-          <w:b/>
-          <w:sz w:val="22"/>
+          <w:color w:val="1E293B"/>
         </w:rPr>
         <w:t>4. Критерий материально-технической базы</w:t>
       </w:r>
     </w:p>
     <w:tbl>
       <w:tblPr>
-        <w:tblStyle w:val="TableGrid"/>
+        <w:tblStyle w:val="LightList-Accent1"/>
         <w:tblW w:type="auto" w:w="0"/>
         <w:tblLook w:firstColumn="1" w:firstRow="1" w:lastColumn="0" w:lastRow="0" w:noHBand="0" w:noVBand="1" w:val="04A0"/>
       </w:tblPr>
       <w:tblGrid>
-        <w:gridCol w:w="3135"/>
-        <w:gridCol w:w="3135"/>
-        <w:gridCol w:w="3135"/>
+        <w:gridCol w:w="3324"/>
+        <w:gridCol w:w="3324"/>
+        <w:gridCol w:w="3324"/>
       </w:tblGrid>
       <w:tr>
         <w:tc>
           <w:tcPr>
-            <w:tcW w:type="dxa" w:w="3135"/>
+            <w:tcW w:type="dxa" w:w="3324"/>
           </w:tcPr>
           <w:p>
-            <w:pPr>
-              <w:jc w:val="center"/>
-            </w:pPr>
+            <w:r/>
             <w:r>
               <w:rPr>
+                <w:rFonts w:ascii="Calibri" w:hAnsi="Calibri"/>
                 <w:b/>
-                <w:sz w:val="18"/>
+                <w:sz w:val="19"/>
               </w:rPr>
               <w:t>Пункт</w:t>
             </w:r>
@@ -1139,16 +1314,15 @@
         </w:tc>
         <w:tc>
           <w:tcPr>
-            <w:tcW w:type="dxa" w:w="3135"/>
+            <w:tcW w:type="dxa" w:w="3324"/>
           </w:tcPr>
           <w:p>
-            <w:pPr>
-              <w:jc w:val="center"/>
-            </w:pPr>
+            <w:r/>
             <w:r>
               <w:rPr>
+                <w:rFonts w:ascii="Calibri" w:hAnsi="Calibri"/>
                 <w:b/>
-                <w:sz w:val="18"/>
+                <w:sz w:val="19"/>
               </w:rPr>
               <w:t>Статус</w:t>
             </w:r>
@@ -1156,16 +1330,15 @@
         </w:tc>
         <w:tc>
           <w:tcPr>
-            <w:tcW w:type="dxa" w:w="3135"/>
+            <w:tcW w:type="dxa" w:w="3324"/>
           </w:tcPr>
           <w:p>
-            <w:pPr>
-              <w:jc w:val="center"/>
-            </w:pPr>
+            <w:r/>
             <w:r>
               <w:rPr>
+                <w:rFonts w:ascii="Calibri" w:hAnsi="Calibri"/>
                 <w:b/>
-                <w:sz w:val="18"/>
+                <w:sz w:val="19"/>
               </w:rPr>
               <w:t>Значение / Комментарий</w:t>
             </w:r>
@@ -1175,40 +1348,50 @@
       <w:tr>
         <w:tc>
           <w:tcPr>
-            <w:tcW w:type="dxa" w:w="3135"/>
+            <w:tcW w:type="dxa" w:w="3324"/>
+            <w:shd w:fill="dcfce7" w:val="clear"/>
           </w:tcPr>
           <w:p>
+            <w:r/>
             <w:r>
               <w:rPr>
+                <w:rFonts w:ascii="Calibri" w:hAnsi="Calibri"/>
+                <w:color w:val="166534"/>
                 <w:sz w:val="18"/>
               </w:rPr>
-              <w:t>Производственные площади</w:t>
+              <w:t>ИНН, трудовые договоры, дипломы ключевых сотрудников (не более 3)</w:t>
             </w:r>
           </w:p>
         </w:tc>
         <w:tc>
           <w:tcPr>
-            <w:tcW w:type="dxa" w:w="3135"/>
+            <w:tcW w:type="dxa" w:w="3324"/>
+            <w:shd w:fill="dcfce7" w:val="clear"/>
           </w:tcPr>
           <w:p>
+            <w:r/>
             <w:r>
               <w:rPr>
+                <w:rFonts w:ascii="Calibri" w:hAnsi="Calibri"/>
+                <w:color w:val="166534"/>
                 <w:sz w:val="18"/>
               </w:rPr>
-              <w:t>🟡 Уточняется</w:t>
+              <w:t>✓ Заполнено</w:t>
             </w:r>
           </w:p>
         </w:tc>
         <w:tc>
           <w:tcPr>
-            <w:tcW w:type="dxa" w:w="3135"/>
+            <w:tcW w:type="dxa" w:w="3324"/>
           </w:tcPr>
           <w:p>
+            <w:r/>
             <w:r>
               <w:rPr>
+                <w:rFonts w:ascii="Calibri" w:hAnsi="Calibri"/>
                 <w:sz w:val="18"/>
               </w:rPr>
-              <w:t>Адрес: г. Калининград. Характер площадей уточняется у клиента</w:t>
+              <w:t>1) Матвейчук Константин Игоревич — ген. директор (ИНН 390636452499). Остальные сотрудники — требуется предоставить.</w:t>
             </w:r>
           </w:p>
         </w:tc>
@@ -1216,40 +1399,50 @@
       <w:tr>
         <w:tc>
           <w:tcPr>
-            <w:tcW w:type="dxa" w:w="3135"/>
+            <w:tcW w:type="dxa" w:w="3324"/>
+            <w:shd w:fill="dbeafe" w:val="clear"/>
           </w:tcPr>
           <w:p>
+            <w:r/>
             <w:r>
               <w:rPr>
+                <w:rFonts w:ascii="Calibri" w:hAnsi="Calibri"/>
+                <w:color w:val="1E40AF"/>
                 <w:sz w:val="18"/>
               </w:rPr>
-              <w:t>Оборудование</w:t>
+              <w:t>Штатное расписание</w:t>
             </w:r>
           </w:p>
         </w:tc>
         <w:tc>
           <w:tcPr>
-            <w:tcW w:type="dxa" w:w="3135"/>
+            <w:tcW w:type="dxa" w:w="3324"/>
+            <w:shd w:fill="dbeafe" w:val="clear"/>
           </w:tcPr>
           <w:p>
+            <w:r/>
             <w:r>
               <w:rPr>
+                <w:rFonts w:ascii="Calibri" w:hAnsi="Calibri"/>
+                <w:color w:val="1E40AF"/>
                 <w:sz w:val="18"/>
               </w:rPr>
-              <w:t>🟡 Уточняется</w:t>
+              <w:t>📋 Ждём от клиента</w:t>
             </w:r>
           </w:p>
         </w:tc>
         <w:tc>
           <w:tcPr>
-            <w:tcW w:type="dxa" w:w="3135"/>
+            <w:tcW w:type="dxa" w:w="3324"/>
           </w:tcPr>
           <w:p>
+            <w:r/>
             <w:r>
               <w:rPr>
+                <w:rFonts w:ascii="Calibri" w:hAnsi="Calibri"/>
                 <w:sz w:val="18"/>
               </w:rPr>
-              <w:t>~30 сотрудников. Производство изделий из янтаря и его обработка.</w:t>
+              <w:t>Должно быть предоставлено клиентом. В компании 30 сотрудников.</w:t>
             </w:r>
           </w:p>
         </w:tc>
@@ -1257,24 +1450,32 @@
       <w:tr>
         <w:tc>
           <w:tcPr>
-            <w:tcW w:type="dxa" w:w="3135"/>
+            <w:tcW w:type="dxa" w:w="3324"/>
+            <w:shd w:fill="fee2e2" w:val="clear"/>
           </w:tcPr>
           <w:p>
+            <w:r/>
             <w:r>
               <w:rPr>
+                <w:rFonts w:ascii="Calibri" w:hAnsi="Calibri"/>
+                <w:color w:val="991B1B"/>
                 <w:sz w:val="18"/>
               </w:rPr>
-              <w:t>Информационные системы / ПО</w:t>
+              <w:t>Сертификаты повышения квалификации</w:t>
             </w:r>
           </w:p>
         </w:tc>
         <w:tc>
           <w:tcPr>
-            <w:tcW w:type="dxa" w:w="3135"/>
+            <w:tcW w:type="dxa" w:w="3324"/>
+            <w:shd w:fill="fee2e2" w:val="clear"/>
           </w:tcPr>
           <w:p>
+            <w:r/>
             <w:r>
               <w:rPr>
+                <w:rFonts w:ascii="Calibri" w:hAnsi="Calibri"/>
+                <w:color w:val="991B1B"/>
                 <w:sz w:val="18"/>
               </w:rPr>
               <w:t>✗ Нет данных</w:t>
@@ -1283,14 +1484,16 @@
         </w:tc>
         <w:tc>
           <w:tcPr>
-            <w:tcW w:type="dxa" w:w="3135"/>
+            <w:tcW w:type="dxa" w:w="3324"/>
           </w:tcPr>
           <w:p>
+            <w:r/>
             <w:r>
               <w:rPr>
+                <w:rFonts w:ascii="Calibri" w:hAnsi="Calibri"/>
                 <w:sz w:val="18"/>
               </w:rPr>
-              <w:t>Уточнить у клиента</w:t>
+              <w:t>Не обнаружены. Предоставить при наличии.</w:t>
             </w:r>
           </w:p>
         </w:tc>
@@ -1298,51 +1501,216 @@
       <w:tr>
         <w:tc>
           <w:tcPr>
-            <w:tcW w:type="dxa" w:w="3135"/>
+            <w:tcW w:type="dxa" w:w="3324"/>
+            <w:shd w:fill="fee2e2" w:val="clear"/>
           </w:tcPr>
           <w:p>
+            <w:r/>
             <w:r>
               <w:rPr>
+                <w:rFonts w:ascii="Calibri" w:hAnsi="Calibri"/>
+                <w:color w:val="991B1B"/>
                 <w:sz w:val="18"/>
               </w:rPr>
-              <w:t>Сырьё и материалы</w:t>
+              <w:t>Сертификаты менеджмента ЮЛ (ISO и др.)</w:t>
             </w:r>
           </w:p>
         </w:tc>
         <w:tc>
           <w:tcPr>
-            <w:tcW w:type="dxa" w:w="3135"/>
+            <w:tcW w:type="dxa" w:w="3324"/>
+            <w:shd w:fill="fee2e2" w:val="clear"/>
           </w:tcPr>
           <w:p>
+            <w:r/>
             <w:r>
               <w:rPr>
+                <w:rFonts w:ascii="Calibri" w:hAnsi="Calibri"/>
+                <w:color w:val="991B1B"/>
                 <w:sz w:val="18"/>
               </w:rPr>
-              <w:t>🟡 Уточняется</w:t>
+              <w:t>✗ Нет данных</w:t>
             </w:r>
           </w:p>
         </w:tc>
         <w:tc>
           <w:tcPr>
-            <w:tcW w:type="dxa" w:w="3135"/>
+            <w:tcW w:type="dxa" w:w="3324"/>
           </w:tcPr>
           <w:p>
+            <w:r/>
             <w:r>
               <w:rPr>
+                <w:rFonts w:ascii="Calibri" w:hAnsi="Calibri"/>
                 <w:sz w:val="18"/>
               </w:rPr>
-              <w:t>Уточняется совместно с клиентом</w:t>
+              <w:t>Не обнаружены.</w:t>
+            </w:r>
+          </w:p>
+        </w:tc>
+      </w:tr>
+      <w:tr>
+        <w:tc>
+          <w:tcPr>
+            <w:tcW w:type="dxa" w:w="3324"/>
+            <w:shd w:fill="dbeafe" w:val="clear"/>
+          </w:tcPr>
+          <w:p>
+            <w:r/>
+            <w:r>
+              <w:rPr>
+                <w:rFonts w:ascii="Calibri" w:hAnsi="Calibri"/>
+                <w:color w:val="1E40AF"/>
+                <w:sz w:val="18"/>
+              </w:rPr>
+              <w:t>Оборотно-сальдовая ведомость / бухгалтерская справка по основным средствам</w:t>
+            </w:r>
+          </w:p>
+        </w:tc>
+        <w:tc>
+          <w:tcPr>
+            <w:tcW w:type="dxa" w:w="3324"/>
+            <w:shd w:fill="dbeafe" w:val="clear"/>
+          </w:tcPr>
+          <w:p>
+            <w:r/>
+            <w:r>
+              <w:rPr>
+                <w:rFonts w:ascii="Calibri" w:hAnsi="Calibri"/>
+                <w:color w:val="1E40AF"/>
+                <w:sz w:val="18"/>
+              </w:rPr>
+              <w:t>📋 Ждём от клиента</w:t>
+            </w:r>
+          </w:p>
+        </w:tc>
+        <w:tc>
+          <w:tcPr>
+            <w:tcW w:type="dxa" w:w="3324"/>
+          </w:tcPr>
+          <w:p>
+            <w:r/>
+            <w:r>
+              <w:rPr>
+                <w:rFonts w:ascii="Calibri" w:hAnsi="Calibri"/>
+                <w:sz w:val="18"/>
+              </w:rPr>
+              <w:t>Предоставляется клиентом. Из отчётности: основные средства ~250 млн ₽.</w:t>
+            </w:r>
+          </w:p>
+        </w:tc>
+      </w:tr>
+      <w:tr>
+        <w:tc>
+          <w:tcPr>
+            <w:tcW w:type="dxa" w:w="3324"/>
+            <w:shd w:fill="fee2e2" w:val="clear"/>
+          </w:tcPr>
+          <w:p>
+            <w:r/>
+            <w:r>
+              <w:rPr>
+                <w:rFonts w:ascii="Calibri" w:hAnsi="Calibri"/>
+                <w:color w:val="991B1B"/>
+                <w:sz w:val="18"/>
+              </w:rPr>
+              <w:t>Фото продукции</w:t>
+            </w:r>
+          </w:p>
+        </w:tc>
+        <w:tc>
+          <w:tcPr>
+            <w:tcW w:type="dxa" w:w="3324"/>
+            <w:shd w:fill="fee2e2" w:val="clear"/>
+          </w:tcPr>
+          <w:p>
+            <w:r/>
+            <w:r>
+              <w:rPr>
+                <w:rFonts w:ascii="Calibri" w:hAnsi="Calibri"/>
+                <w:color w:val="991B1B"/>
+                <w:sz w:val="18"/>
+              </w:rPr>
+              <w:t>✗ Нет данных</w:t>
+            </w:r>
+          </w:p>
+        </w:tc>
+        <w:tc>
+          <w:tcPr>
+            <w:tcW w:type="dxa" w:w="3324"/>
+          </w:tcPr>
+          <w:p>
+            <w:r/>
+            <w:r>
+              <w:rPr>
+                <w:rFonts w:ascii="Calibri" w:hAnsi="Calibri"/>
+                <w:sz w:val="18"/>
+              </w:rPr>
+              <w:t>Требуется предоставить фото продукции, для которой запрашивается статус резидента.</w:t>
+            </w:r>
+          </w:p>
+        </w:tc>
+      </w:tr>
+      <w:tr>
+        <w:tc>
+          <w:tcPr>
+            <w:tcW w:type="dxa" w:w="3324"/>
+            <w:shd w:fill="fee2e2" w:val="clear"/>
+          </w:tcPr>
+          <w:p>
+            <w:r/>
+            <w:r>
+              <w:rPr>
+                <w:rFonts w:ascii="Calibri" w:hAnsi="Calibri"/>
+                <w:color w:val="991B1B"/>
+                <w:sz w:val="18"/>
+              </w:rPr>
+              <w:t>Фото оборудования, помещений, складов, транспорта</w:t>
+            </w:r>
+          </w:p>
+        </w:tc>
+        <w:tc>
+          <w:tcPr>
+            <w:tcW w:type="dxa" w:w="3324"/>
+            <w:shd w:fill="fee2e2" w:val="clear"/>
+          </w:tcPr>
+          <w:p>
+            <w:r/>
+            <w:r>
+              <w:rPr>
+                <w:rFonts w:ascii="Calibri" w:hAnsi="Calibri"/>
+                <w:color w:val="991B1B"/>
+                <w:sz w:val="18"/>
+              </w:rPr>
+              <w:t>✗ Нет данных</w:t>
+            </w:r>
+          </w:p>
+        </w:tc>
+        <w:tc>
+          <w:tcPr>
+            <w:tcW w:type="dxa" w:w="3324"/>
+          </w:tcPr>
+          <w:p>
+            <w:r/>
+            <w:r>
+              <w:rPr>
+                <w:rFonts w:ascii="Calibri" w:hAnsi="Calibri"/>
+                <w:sz w:val="18"/>
+              </w:rPr>
+              <w:t>Требуется предоставить.</w:t>
             </w:r>
           </w:p>
         </w:tc>
       </w:tr>
     </w:tbl>
+    <w:p/>
     <w:p>
+      <w:pPr>
+        <w:pStyle w:val="Heading1"/>
+      </w:pPr>
       <w:r>
         <w:rPr>
-          <w:rFonts w:ascii="Arial" w:hAnsi="Arial"/>
-          <w:b/>
-          <w:sz w:val="22"/>
+          <w:color w:val="1E293B"/>
         </w:rPr>
         <w:t>5. Научно-техническая анкета (НИОКР)</w:t>
       </w:r>
@@ -1350,36 +1718,35 @@
     <w:p>
       <w:r>
         <w:rPr>
-          <w:color w:val="646464"/>
+          <w:color w:val="6B7280"/>
           <w:sz w:val="18"/>
         </w:rPr>
-        <w:t>Ниже — ключевые пункты. Частично заполнено на основе гипотез — требуется совместная проработка с клиентом.</w:t>
+        <w:t>Ниже приведены ключевые пункты анкеты. Частично заполнено на основе гипотез — требуется совместная проработка с клиентом.</w:t>
       </w:r>
     </w:p>
     <w:tbl>
       <w:tblPr>
-        <w:tblStyle w:val="TableGrid"/>
+        <w:tblStyle w:val="LightList-Accent1"/>
         <w:tblW w:type="auto" w:w="0"/>
         <w:tblLook w:firstColumn="1" w:firstRow="1" w:lastColumn="0" w:lastRow="0" w:noHBand="0" w:noVBand="1" w:val="04A0"/>
       </w:tblPr>
       <w:tblGrid>
-        <w:gridCol w:w="3135"/>
-        <w:gridCol w:w="3135"/>
-        <w:gridCol w:w="3135"/>
+        <w:gridCol w:w="3324"/>
+        <w:gridCol w:w="3324"/>
+        <w:gridCol w:w="3324"/>
       </w:tblGrid>
       <w:tr>
         <w:tc>
           <w:tcPr>
-            <w:tcW w:type="dxa" w:w="3135"/>
+            <w:tcW w:type="dxa" w:w="3324"/>
           </w:tcPr>
           <w:p>
-            <w:pPr>
-              <w:jc w:val="center"/>
-            </w:pPr>
+            <w:r/>
             <w:r>
               <w:rPr>
+                <w:rFonts w:ascii="Calibri" w:hAnsi="Calibri"/>
                 <w:b/>
-                <w:sz w:val="18"/>
+                <w:sz w:val="19"/>
               </w:rPr>
               <w:t>Пункт</w:t>
             </w:r>
@@ -1387,16 +1754,15 @@
         </w:tc>
         <w:tc>
           <w:tcPr>
-            <w:tcW w:type="dxa" w:w="3135"/>
+            <w:tcW w:type="dxa" w:w="3324"/>
           </w:tcPr>
           <w:p>
-            <w:pPr>
-              <w:jc w:val="center"/>
-            </w:pPr>
+            <w:r/>
             <w:r>
               <w:rPr>
+                <w:rFonts w:ascii="Calibri" w:hAnsi="Calibri"/>
                 <w:b/>
-                <w:sz w:val="18"/>
+                <w:sz w:val="19"/>
               </w:rPr>
               <w:t>Статус</w:t>
             </w:r>
@@ -1404,16 +1770,15 @@
         </w:tc>
         <w:tc>
           <w:tcPr>
-            <w:tcW w:type="dxa" w:w="3135"/>
+            <w:tcW w:type="dxa" w:w="3324"/>
           </w:tcPr>
           <w:p>
-            <w:pPr>
-              <w:jc w:val="center"/>
-            </w:pPr>
+            <w:r/>
             <w:r>
               <w:rPr>
+                <w:rFonts w:ascii="Calibri" w:hAnsi="Calibri"/>
                 <w:b/>
-                <w:sz w:val="18"/>
+                <w:sz w:val="19"/>
               </w:rPr>
               <w:t>Значение / Комментарий</w:t>
             </w:r>
@@ -1423,11 +1788,15 @@
       <w:tr>
         <w:tc>
           <w:tcPr>
-            <w:tcW w:type="dxa" w:w="3135"/>
+            <w:tcW w:type="dxa" w:w="3324"/>
+            <w:shd w:fill="fef9c3" w:val="clear"/>
           </w:tcPr>
           <w:p>
+            <w:r/>
             <w:r>
               <w:rPr>
+                <w:rFonts w:ascii="Calibri" w:hAnsi="Calibri"/>
+                <w:color w:val="854D0E"/>
                 <w:sz w:val="18"/>
               </w:rPr>
               <w:t>Наименование НИОКР</w:t>
@@ -1436,27 +1805,33 @@
         </w:tc>
         <w:tc>
           <w:tcPr>
-            <w:tcW w:type="dxa" w:w="3135"/>
+            <w:tcW w:type="dxa" w:w="3324"/>
+            <w:shd w:fill="fef9c3" w:val="clear"/>
           </w:tcPr>
           <w:p>
+            <w:r/>
             <w:r>
               <w:rPr>
+                <w:rFonts w:ascii="Calibri" w:hAnsi="Calibri"/>
+                <w:color w:val="854D0E"/>
                 <w:sz w:val="18"/>
               </w:rPr>
-              <w:t>🟡 Уточняется</w:t>
+              <w:t>⚡ Уточняется</w:t>
             </w:r>
           </w:p>
         </w:tc>
         <w:tc>
           <w:tcPr>
-            <w:tcW w:type="dxa" w:w="3135"/>
+            <w:tcW w:type="dxa" w:w="3324"/>
           </w:tcPr>
           <w:p>
+            <w:r/>
             <w:r>
               <w:rPr>
+                <w:rFonts w:ascii="Calibri" w:hAnsi="Calibri"/>
                 <w:sz w:val="18"/>
               </w:rPr>
-              <w:t>Разработка инновационного решения в области обработки природных материалов и ювелирного производства</w:t>
+              <w:t>Определяется совместно. Должно отражать суть инновации (напр., «Разработка технологии износостойкого гальванического покрытия для промышленных деталей» — гипотеза).</w:t>
             </w:r>
           </w:p>
         </w:tc>
@@ -1464,40 +1839,50 @@
       <w:tr>
         <w:tc>
           <w:tcPr>
-            <w:tcW w:type="dxa" w:w="3135"/>
+            <w:tcW w:type="dxa" w:w="3324"/>
+            <w:shd w:fill="fef9c3" w:val="clear"/>
           </w:tcPr>
           <w:p>
+            <w:r/>
             <w:r>
               <w:rPr>
+                <w:rFonts w:ascii="Calibri" w:hAnsi="Calibri"/>
+                <w:color w:val="854D0E"/>
                 <w:sz w:val="18"/>
               </w:rPr>
-              <w:t>Вид НИОКР</w:t>
+              <w:t>Описание конечного продукта (назначение, потребительские характеристики)</w:t>
             </w:r>
           </w:p>
         </w:tc>
         <w:tc>
           <w:tcPr>
-            <w:tcW w:type="dxa" w:w="3135"/>
+            <w:tcW w:type="dxa" w:w="3324"/>
+            <w:shd w:fill="fef9c3" w:val="clear"/>
           </w:tcPr>
           <w:p>
+            <w:r/>
             <w:r>
               <w:rPr>
+                <w:rFonts w:ascii="Calibri" w:hAnsi="Calibri"/>
+                <w:color w:val="854D0E"/>
                 <w:sz w:val="18"/>
               </w:rPr>
-              <w:t>🟡 Уточняется</w:t>
+              <w:t>⚡ Уточняется</w:t>
             </w:r>
           </w:p>
         </w:tc>
         <w:tc>
           <w:tcPr>
-            <w:tcW w:type="dxa" w:w="3135"/>
+            <w:tcW w:type="dxa" w:w="3324"/>
           </w:tcPr>
           <w:p>
+            <w:r/>
             <w:r>
               <w:rPr>
+                <w:rFonts w:ascii="Calibri" w:hAnsi="Calibri"/>
                 <w:sz w:val="18"/>
               </w:rPr>
-              <w:t>Прикладные исследования / ОКР</w:t>
+              <w:t>Прорабатывается совместно. Предположительно: Усовершенствованная технология обработки и облагораживания янтаря с повышением выхода качественного сырья и расширением цветовой палитры.</w:t>
             </w:r>
           </w:p>
         </w:tc>
@@ -1505,24 +1890,134 @@
       <w:tr>
         <w:tc>
           <w:tcPr>
-            <w:tcW w:type="dxa" w:w="3135"/>
+            <w:tcW w:type="dxa" w:w="3324"/>
+            <w:shd w:fill="fef9c3" w:val="clear"/>
           </w:tcPr>
           <w:p>
+            <w:r/>
             <w:r>
               <w:rPr>
+                <w:rFonts w:ascii="Calibri" w:hAnsi="Calibri"/>
+                <w:color w:val="854D0E"/>
                 <w:sz w:val="18"/>
               </w:rPr>
-              <w:t>Сроки выполнения</w:t>
+              <w:t>Цель выполнения НИОКР</w:t>
             </w:r>
           </w:p>
         </w:tc>
         <w:tc>
           <w:tcPr>
-            <w:tcW w:type="dxa" w:w="3135"/>
+            <w:tcW w:type="dxa" w:w="3324"/>
+            <w:shd w:fill="fef9c3" w:val="clear"/>
           </w:tcPr>
           <w:p>
+            <w:r/>
             <w:r>
               <w:rPr>
+                <w:rFonts w:ascii="Calibri" w:hAnsi="Calibri"/>
+                <w:color w:val="854D0E"/>
+                <w:sz w:val="18"/>
+              </w:rPr>
+              <w:t>⚡ Уточняется</w:t>
+            </w:r>
+          </w:p>
+        </w:tc>
+        <w:tc>
+          <w:tcPr>
+            <w:tcW w:type="dxa" w:w="3324"/>
+          </w:tcPr>
+          <w:p>
+            <w:r/>
+            <w:r>
+              <w:rPr>
+                <w:rFonts w:ascii="Calibri" w:hAnsi="Calibri"/>
+                <w:sz w:val="18"/>
+              </w:rPr>
+              <w:t>Определяется совместно после утверждения продукта-инновации.</w:t>
+            </w:r>
+          </w:p>
+        </w:tc>
+      </w:tr>
+      <w:tr>
+        <w:tc>
+          <w:tcPr>
+            <w:tcW w:type="dxa" w:w="3324"/>
+            <w:shd w:fill="fef9c3" w:val="clear"/>
+          </w:tcPr>
+          <w:p>
+            <w:r/>
+            <w:r>
+              <w:rPr>
+                <w:rFonts w:ascii="Calibri" w:hAnsi="Calibri"/>
+                <w:color w:val="854D0E"/>
+                <w:sz w:val="18"/>
+              </w:rPr>
+              <w:t>Научно-техническая новизна</w:t>
+            </w:r>
+          </w:p>
+        </w:tc>
+        <w:tc>
+          <w:tcPr>
+            <w:tcW w:type="dxa" w:w="3324"/>
+            <w:shd w:fill="fef9c3" w:val="clear"/>
+          </w:tcPr>
+          <w:p>
+            <w:r/>
+            <w:r>
+              <w:rPr>
+                <w:rFonts w:ascii="Calibri" w:hAnsi="Calibri"/>
+                <w:color w:val="854D0E"/>
+                <w:sz w:val="18"/>
+              </w:rPr>
+              <w:t>⚡ Уточняется</w:t>
+            </w:r>
+          </w:p>
+        </w:tc>
+        <w:tc>
+          <w:tcPr>
+            <w:tcW w:type="dxa" w:w="3324"/>
+          </w:tcPr>
+          <w:p>
+            <w:r/>
+            <w:r>
+              <w:rPr>
+                <w:rFonts w:ascii="Calibri" w:hAnsi="Calibri"/>
+                <w:sz w:val="18"/>
+              </w:rPr>
+              <w:t>Определяется совместно, при возможности — с привлечением патентоведа.</w:t>
+            </w:r>
+          </w:p>
+        </w:tc>
+      </w:tr>
+      <w:tr>
+        <w:tc>
+          <w:tcPr>
+            <w:tcW w:type="dxa" w:w="3324"/>
+            <w:shd w:fill="fee2e2" w:val="clear"/>
+          </w:tcPr>
+          <w:p>
+            <w:r/>
+            <w:r>
+              <w:rPr>
+                <w:rFonts w:ascii="Calibri" w:hAnsi="Calibri"/>
+                <w:color w:val="991B1B"/>
+                <w:sz w:val="18"/>
+              </w:rPr>
+              <w:t>Наличие патентов и иных правоохранных документов</w:t>
+            </w:r>
+          </w:p>
+        </w:tc>
+        <w:tc>
+          <w:tcPr>
+            <w:tcW w:type="dxa" w:w="3324"/>
+            <w:shd w:fill="fee2e2" w:val="clear"/>
+          </w:tcPr>
+          <w:p>
+            <w:r/>
+            <w:r>
+              <w:rPr>
+                <w:rFonts w:ascii="Calibri" w:hAnsi="Calibri"/>
+                <w:color w:val="991B1B"/>
                 <w:sz w:val="18"/>
               </w:rPr>
               <w:t>✗ Нет данных</w:t>
@@ -1531,14 +2026,16 @@
         </w:tc>
         <w:tc>
           <w:tcPr>
-            <w:tcW w:type="dxa" w:w="3135"/>
+            <w:tcW w:type="dxa" w:w="3324"/>
           </w:tcPr>
           <w:p>
+            <w:r/>
             <w:r>
               <w:rPr>
+                <w:rFonts w:ascii="Calibri" w:hAnsi="Calibri"/>
                 <w:sz w:val="18"/>
               </w:rPr>
-              <w:t>После согласования</w:t>
+              <w:t>Не обнаружены. Требуется подача заявки на полезную модель.</w:t>
             </w:r>
           </w:p>
         </w:tc>
@@ -1546,24 +2043,83 @@
       <w:tr>
         <w:tc>
           <w:tcPr>
-            <w:tcW w:type="dxa" w:w="3135"/>
+            <w:tcW w:type="dxa" w:w="3324"/>
+            <w:shd w:fill="fef9c3" w:val="clear"/>
           </w:tcPr>
           <w:p>
+            <w:r/>
             <w:r>
               <w:rPr>
+                <w:rFonts w:ascii="Calibri" w:hAnsi="Calibri"/>
+                <w:color w:val="854D0E"/>
                 <w:sz w:val="18"/>
               </w:rPr>
-              <w:t>Бюджет НИОКР</w:t>
+              <w:t>Планы по дополнительной защите ИС</w:t>
             </w:r>
           </w:p>
         </w:tc>
         <w:tc>
           <w:tcPr>
-            <w:tcW w:type="dxa" w:w="3135"/>
+            <w:tcW w:type="dxa" w:w="3324"/>
+            <w:shd w:fill="fef9c3" w:val="clear"/>
           </w:tcPr>
           <w:p>
+            <w:r/>
             <w:r>
               <w:rPr>
+                <w:rFonts w:ascii="Calibri" w:hAnsi="Calibri"/>
+                <w:color w:val="854D0E"/>
+                <w:sz w:val="18"/>
+              </w:rPr>
+              <w:t>⚡ Уточняется</w:t>
+            </w:r>
+          </w:p>
+        </w:tc>
+        <w:tc>
+          <w:tcPr>
+            <w:tcW w:type="dxa" w:w="3324"/>
+          </w:tcPr>
+          <w:p>
+            <w:r/>
+            <w:r>
+              <w:rPr>
+                <w:rFonts w:ascii="Calibri" w:hAnsi="Calibri"/>
+                <w:sz w:val="18"/>
+              </w:rPr>
+              <w:t>Прорабатывается с патентоведом. Рекомендуется: полезная модель → патент на изобретение → рассмотрение зарубежных рынков.</w:t>
+            </w:r>
+          </w:p>
+        </w:tc>
+      </w:tr>
+      <w:tr>
+        <w:tc>
+          <w:tcPr>
+            <w:tcW w:type="dxa" w:w="3324"/>
+            <w:shd w:fill="fee2e2" w:val="clear"/>
+          </w:tcPr>
+          <w:p>
+            <w:r/>
+            <w:r>
+              <w:rPr>
+                <w:rFonts w:ascii="Calibri" w:hAnsi="Calibri"/>
+                <w:color w:val="991B1B"/>
+                <w:sz w:val="18"/>
+              </w:rPr>
+              <w:t>Задел по тематике проекта (исследования, публикации, ИС)</w:t>
+            </w:r>
+          </w:p>
+        </w:tc>
+        <w:tc>
+          <w:tcPr>
+            <w:tcW w:type="dxa" w:w="3324"/>
+            <w:shd w:fill="fee2e2" w:val="clear"/>
+          </w:tcPr>
+          <w:p>
+            <w:r/>
+            <w:r>
+              <w:rPr>
+                <w:rFonts w:ascii="Calibri" w:hAnsi="Calibri"/>
+                <w:color w:val="991B1B"/>
                 <w:sz w:val="18"/>
               </w:rPr>
               <w:t>✗ Нет данных</w:t>
@@ -1572,14 +2128,16 @@
         </w:tc>
         <w:tc>
           <w:tcPr>
-            <w:tcW w:type="dxa" w:w="3135"/>
+            <w:tcW w:type="dxa" w:w="3324"/>
           </w:tcPr>
           <w:p>
+            <w:r/>
             <w:r>
               <w:rPr>
+                <w:rFonts w:ascii="Calibri" w:hAnsi="Calibri"/>
                 <w:sz w:val="18"/>
               </w:rPr>
-              <w:t>Запрашивается у клиента</w:t>
+              <w:t>Информации не имеется. Требуется предоставить при наличии.</w:t>
             </w:r>
           </w:p>
         </w:tc>
@@ -1587,113 +2145,663 @@
       <w:tr>
         <w:tc>
           <w:tcPr>
-            <w:tcW w:type="dxa" w:w="3135"/>
+            <w:tcW w:type="dxa" w:w="3324"/>
+            <w:shd w:fill="fef9c3" w:val="clear"/>
           </w:tcPr>
           <w:p>
+            <w:r/>
             <w:r>
               <w:rPr>
+                <w:rFonts w:ascii="Calibri" w:hAnsi="Calibri"/>
+                <w:color w:val="854D0E"/>
                 <w:sz w:val="18"/>
               </w:rPr>
-              <w:t>Ожидаемый результат</w:t>
+              <w:t>Способы и методы решения задач НИОКР</w:t>
             </w:r>
           </w:p>
         </w:tc>
         <w:tc>
           <w:tcPr>
-            <w:tcW w:type="dxa" w:w="3135"/>
+            <w:tcW w:type="dxa" w:w="3324"/>
+            <w:shd w:fill="fef9c3" w:val="clear"/>
           </w:tcPr>
           <w:p>
+            <w:r/>
             <w:r>
               <w:rPr>
+                <w:rFonts w:ascii="Calibri" w:hAnsi="Calibri"/>
+                <w:color w:val="854D0E"/>
                 <w:sz w:val="18"/>
               </w:rPr>
-              <w:t>🟡 Уточняется</w:t>
+              <w:t>⚡ Уточняется</w:t>
             </w:r>
           </w:p>
         </w:tc>
         <w:tc>
           <w:tcPr>
-            <w:tcW w:type="dxa" w:w="3135"/>
+            <w:tcW w:type="dxa" w:w="3324"/>
           </w:tcPr>
           <w:p>
+            <w:r/>
             <w:r>
               <w:rPr>
+                <w:rFonts w:ascii="Calibri" w:hAnsi="Calibri"/>
                 <w:sz w:val="18"/>
               </w:rPr>
-              <w:t>Создание продукта, обеспечивающего технологическое превосходство</w:t>
+              <w:t>Прорабатывается совместно с аналитиками после утверждения технологии.</w:t>
             </w:r>
           </w:p>
         </w:tc>
       </w:tr>
     </w:tbl>
+    <w:p/>
     <w:p>
+      <w:pPr>
+        <w:pStyle w:val="Heading1"/>
+      </w:pPr>
       <w:r>
         <w:rPr>
-          <w:rFonts w:ascii="Arial" w:hAnsi="Arial"/>
-          <w:b/>
-          <w:sz w:val="22"/>
+          <w:color w:val="1E293B"/>
         </w:rPr>
-        <w:t>6. Проект ТЗ на выполнение НИОКР</w:t>
+        <w:t>6. Проект технического задания на выполнение НИОКР</w:t>
       </w:r>
     </w:p>
+    <w:tbl>
+      <w:tblPr>
+        <w:tblStyle w:val="LightList-Accent1"/>
+        <w:tblW w:type="auto" w:w="0"/>
+        <w:tblLook w:firstColumn="1" w:firstRow="1" w:lastColumn="0" w:lastRow="0" w:noHBand="0" w:noVBand="1" w:val="04A0"/>
+      </w:tblPr>
+      <w:tblGrid>
+        <w:gridCol w:w="3324"/>
+        <w:gridCol w:w="3324"/>
+        <w:gridCol w:w="3324"/>
+      </w:tblGrid>
+      <w:tr>
+        <w:tc>
+          <w:tcPr>
+            <w:tcW w:type="dxa" w:w="3324"/>
+          </w:tcPr>
+          <w:p>
+            <w:r/>
+            <w:r>
+              <w:rPr>
+                <w:rFonts w:ascii="Calibri" w:hAnsi="Calibri"/>
+                <w:b/>
+                <w:sz w:val="19"/>
+              </w:rPr>
+              <w:t>Пункт</w:t>
+            </w:r>
+          </w:p>
+        </w:tc>
+        <w:tc>
+          <w:tcPr>
+            <w:tcW w:type="dxa" w:w="3324"/>
+          </w:tcPr>
+          <w:p>
+            <w:r/>
+            <w:r>
+              <w:rPr>
+                <w:rFonts w:ascii="Calibri" w:hAnsi="Calibri"/>
+                <w:b/>
+                <w:sz w:val="19"/>
+              </w:rPr>
+              <w:t>Статус</w:t>
+            </w:r>
+          </w:p>
+        </w:tc>
+        <w:tc>
+          <w:tcPr>
+            <w:tcW w:type="dxa" w:w="3324"/>
+          </w:tcPr>
+          <w:p>
+            <w:r/>
+            <w:r>
+              <w:rPr>
+                <w:rFonts w:ascii="Calibri" w:hAnsi="Calibri"/>
+                <w:b/>
+                <w:sz w:val="19"/>
+              </w:rPr>
+              <w:t>Значение / Комментарий</w:t>
+            </w:r>
+          </w:p>
+        </w:tc>
+      </w:tr>
+      <w:tr>
+        <w:tc>
+          <w:tcPr>
+            <w:tcW w:type="dxa" w:w="3324"/>
+            <w:shd w:fill="fef9c3" w:val="clear"/>
+          </w:tcPr>
+          <w:p>
+            <w:r/>
+            <w:r>
+              <w:rPr>
+                <w:rFonts w:ascii="Calibri" w:hAnsi="Calibri"/>
+                <w:color w:val="854D0E"/>
+                <w:sz w:val="18"/>
+              </w:rPr>
+              <w:t>Функции, которые должен обеспечивать разрабатываемый продукт</w:t>
+            </w:r>
+          </w:p>
+        </w:tc>
+        <w:tc>
+          <w:tcPr>
+            <w:tcW w:type="dxa" w:w="3324"/>
+            <w:shd w:fill="fef9c3" w:val="clear"/>
+          </w:tcPr>
+          <w:p>
+            <w:r/>
+            <w:r>
+              <w:rPr>
+                <w:rFonts w:ascii="Calibri" w:hAnsi="Calibri"/>
+                <w:color w:val="854D0E"/>
+                <w:sz w:val="18"/>
+              </w:rPr>
+              <w:t>⚡ Уточняется</w:t>
+            </w:r>
+          </w:p>
+        </w:tc>
+        <w:tc>
+          <w:tcPr>
+            <w:tcW w:type="dxa" w:w="3324"/>
+          </w:tcPr>
+          <w:p>
+            <w:r/>
+            <w:r>
+              <w:rPr>
+                <w:rFonts w:ascii="Calibri" w:hAnsi="Calibri"/>
+                <w:sz w:val="18"/>
+              </w:rPr>
+              <w:t>Определяется совместно с заказчиком.</w:t>
+            </w:r>
+          </w:p>
+        </w:tc>
+      </w:tr>
+      <w:tr>
+        <w:tc>
+          <w:tcPr>
+            <w:tcW w:type="dxa" w:w="3324"/>
+            <w:shd w:fill="fef9c3" w:val="clear"/>
+          </w:tcPr>
+          <w:p>
+            <w:r/>
+            <w:r>
+              <w:rPr>
+                <w:rFonts w:ascii="Calibri" w:hAnsi="Calibri"/>
+                <w:color w:val="854D0E"/>
+                <w:sz w:val="18"/>
+              </w:rPr>
+              <w:t>Количественные параметры (5–7 параметров в числовом выражении)</w:t>
+            </w:r>
+          </w:p>
+        </w:tc>
+        <w:tc>
+          <w:tcPr>
+            <w:tcW w:type="dxa" w:w="3324"/>
+            <w:shd w:fill="fef9c3" w:val="clear"/>
+          </w:tcPr>
+          <w:p>
+            <w:r/>
+            <w:r>
+              <w:rPr>
+                <w:rFonts w:ascii="Calibri" w:hAnsi="Calibri"/>
+                <w:color w:val="854D0E"/>
+                <w:sz w:val="18"/>
+              </w:rPr>
+              <w:t>⚡ Уточняется</w:t>
+            </w:r>
+          </w:p>
+        </w:tc>
+        <w:tc>
+          <w:tcPr>
+            <w:tcW w:type="dxa" w:w="3324"/>
+          </w:tcPr>
+          <w:p>
+            <w:r/>
+            <w:r>
+              <w:rPr>
+                <w:rFonts w:ascii="Calibri" w:hAnsi="Calibri"/>
+                <w:sz w:val="18"/>
+              </w:rPr>
+              <w:t>Определяется совместно после утверждения продукта.</w:t>
+            </w:r>
+          </w:p>
+        </w:tc>
+      </w:tr>
+      <w:tr>
+        <w:tc>
+          <w:tcPr>
+            <w:tcW w:type="dxa" w:w="3324"/>
+            <w:shd w:fill="fef9c3" w:val="clear"/>
+          </w:tcPr>
+          <w:p>
+            <w:r/>
+            <w:r>
+              <w:rPr>
+                <w:rFonts w:ascii="Calibri" w:hAnsi="Calibri"/>
+                <w:color w:val="854D0E"/>
+                <w:sz w:val="18"/>
+              </w:rPr>
+              <w:t>Входные воздействия (сигналы, данные, мех. воздействия)</w:t>
+            </w:r>
+          </w:p>
+        </w:tc>
+        <w:tc>
+          <w:tcPr>
+            <w:tcW w:type="dxa" w:w="3324"/>
+            <w:shd w:fill="fef9c3" w:val="clear"/>
+          </w:tcPr>
+          <w:p>
+            <w:r/>
+            <w:r>
+              <w:rPr>
+                <w:rFonts w:ascii="Calibri" w:hAnsi="Calibri"/>
+                <w:color w:val="854D0E"/>
+                <w:sz w:val="18"/>
+              </w:rPr>
+              <w:t>⚡ Уточняется</w:t>
+            </w:r>
+          </w:p>
+        </w:tc>
+        <w:tc>
+          <w:tcPr>
+            <w:tcW w:type="dxa" w:w="3324"/>
+          </w:tcPr>
+          <w:p>
+            <w:r/>
+            <w:r>
+              <w:rPr>
+                <w:rFonts w:ascii="Calibri" w:hAnsi="Calibri"/>
+                <w:sz w:val="18"/>
+              </w:rPr>
+              <w:t>Определяется совместно.</w:t>
+            </w:r>
+          </w:p>
+        </w:tc>
+      </w:tr>
+      <w:tr>
+        <w:tc>
+          <w:tcPr>
+            <w:tcW w:type="dxa" w:w="3324"/>
+            <w:shd w:fill="fef9c3" w:val="clear"/>
+          </w:tcPr>
+          <w:p>
+            <w:r/>
+            <w:r>
+              <w:rPr>
+                <w:rFonts w:ascii="Calibri" w:hAnsi="Calibri"/>
+                <w:color w:val="854D0E"/>
+                <w:sz w:val="18"/>
+              </w:rPr>
+              <w:t>Выходные реакции продукта</w:t>
+            </w:r>
+          </w:p>
+        </w:tc>
+        <w:tc>
+          <w:tcPr>
+            <w:tcW w:type="dxa" w:w="3324"/>
+            <w:shd w:fill="fef9c3" w:val="clear"/>
+          </w:tcPr>
+          <w:p>
+            <w:r/>
+            <w:r>
+              <w:rPr>
+                <w:rFonts w:ascii="Calibri" w:hAnsi="Calibri"/>
+                <w:color w:val="854D0E"/>
+                <w:sz w:val="18"/>
+              </w:rPr>
+              <w:t>⚡ Уточняется</w:t>
+            </w:r>
+          </w:p>
+        </w:tc>
+        <w:tc>
+          <w:tcPr>
+            <w:tcW w:type="dxa" w:w="3324"/>
+          </w:tcPr>
+          <w:p>
+            <w:r/>
+            <w:r>
+              <w:rPr>
+                <w:rFonts w:ascii="Calibri" w:hAnsi="Calibri"/>
+                <w:sz w:val="18"/>
+              </w:rPr>
+              <w:t>Определяется совместно.</w:t>
+            </w:r>
+          </w:p>
+        </w:tc>
+      </w:tr>
+      <w:tr>
+        <w:tc>
+          <w:tcPr>
+            <w:tcW w:type="dxa" w:w="3324"/>
+            <w:shd w:fill="fef9c3" w:val="clear"/>
+          </w:tcPr>
+          <w:p>
+            <w:r/>
+            <w:r>
+              <w:rPr>
+                <w:rFonts w:ascii="Calibri" w:hAnsi="Calibri"/>
+                <w:color w:val="854D0E"/>
+                <w:sz w:val="18"/>
+              </w:rPr>
+              <w:t>Внешний вид и состав продукта</w:t>
+            </w:r>
+          </w:p>
+        </w:tc>
+        <w:tc>
+          <w:tcPr>
+            <w:tcW w:type="dxa" w:w="3324"/>
+            <w:shd w:fill="fef9c3" w:val="clear"/>
+          </w:tcPr>
+          <w:p>
+            <w:r/>
+            <w:r>
+              <w:rPr>
+                <w:rFonts w:ascii="Calibri" w:hAnsi="Calibri"/>
+                <w:color w:val="854D0E"/>
+                <w:sz w:val="18"/>
+              </w:rPr>
+              <w:t>⚡ Уточняется</w:t>
+            </w:r>
+          </w:p>
+        </w:tc>
+        <w:tc>
+          <w:tcPr>
+            <w:tcW w:type="dxa" w:w="3324"/>
+          </w:tcPr>
+          <w:p>
+            <w:r/>
+            <w:r>
+              <w:rPr>
+                <w:rFonts w:ascii="Calibri" w:hAnsi="Calibri"/>
+                <w:sz w:val="18"/>
+              </w:rPr>
+              <w:t>Определяется совместно. Требуются фото/чертежи.</w:t>
+            </w:r>
+          </w:p>
+        </w:tc>
+      </w:tr>
+      <w:tr>
+        <w:tc>
+          <w:tcPr>
+            <w:tcW w:type="dxa" w:w="3324"/>
+            <w:shd w:fill="fef9c3" w:val="clear"/>
+          </w:tcPr>
+          <w:p>
+            <w:r/>
+            <w:r>
+              <w:rPr>
+                <w:rFonts w:ascii="Calibri" w:hAnsi="Calibri"/>
+                <w:color w:val="854D0E"/>
+                <w:sz w:val="18"/>
+              </w:rPr>
+              <w:t>Требования к конструкции и исходным компонентам</w:t>
+            </w:r>
+          </w:p>
+        </w:tc>
+        <w:tc>
+          <w:tcPr>
+            <w:tcW w:type="dxa" w:w="3324"/>
+            <w:shd w:fill="fef9c3" w:val="clear"/>
+          </w:tcPr>
+          <w:p>
+            <w:r/>
+            <w:r>
+              <w:rPr>
+                <w:rFonts w:ascii="Calibri" w:hAnsi="Calibri"/>
+                <w:color w:val="854D0E"/>
+                <w:sz w:val="18"/>
+              </w:rPr>
+              <w:t>⚡ Уточняется</w:t>
+            </w:r>
+          </w:p>
+        </w:tc>
+        <w:tc>
+          <w:tcPr>
+            <w:tcW w:type="dxa" w:w="3324"/>
+          </w:tcPr>
+          <w:p>
+            <w:r/>
+            <w:r>
+              <w:rPr>
+                <w:rFonts w:ascii="Calibri" w:hAnsi="Calibri"/>
+                <w:sz w:val="18"/>
+              </w:rPr>
+              <w:t>Определяется совместно с техническими специалистами компании.</w:t>
+            </w:r>
+          </w:p>
+        </w:tc>
+      </w:tr>
+      <w:tr>
+        <w:tc>
+          <w:tcPr>
+            <w:tcW w:type="dxa" w:w="3324"/>
+            <w:shd w:fill="fef9c3" w:val="clear"/>
+          </w:tcPr>
+          <w:p>
+            <w:r/>
+            <w:r>
+              <w:rPr>
+                <w:rFonts w:ascii="Calibri" w:hAnsi="Calibri"/>
+                <w:color w:val="854D0E"/>
+                <w:sz w:val="18"/>
+              </w:rPr>
+              <w:t>Требования к массогабаритным характеристикам</w:t>
+            </w:r>
+          </w:p>
+        </w:tc>
+        <w:tc>
+          <w:tcPr>
+            <w:tcW w:type="dxa" w:w="3324"/>
+            <w:shd w:fill="fef9c3" w:val="clear"/>
+          </w:tcPr>
+          <w:p>
+            <w:r/>
+            <w:r>
+              <w:rPr>
+                <w:rFonts w:ascii="Calibri" w:hAnsi="Calibri"/>
+                <w:color w:val="854D0E"/>
+                <w:sz w:val="18"/>
+              </w:rPr>
+              <w:t>⚡ Уточняется</w:t>
+            </w:r>
+          </w:p>
+        </w:tc>
+        <w:tc>
+          <w:tcPr>
+            <w:tcW w:type="dxa" w:w="3324"/>
+          </w:tcPr>
+          <w:p>
+            <w:r/>
+            <w:r>
+              <w:rPr>
+                <w:rFonts w:ascii="Calibri" w:hAnsi="Calibri"/>
+                <w:sz w:val="18"/>
+              </w:rPr>
+              <w:t>Определяется совместно (если применимо).</w:t>
+            </w:r>
+          </w:p>
+        </w:tc>
+      </w:tr>
+      <w:tr>
+        <w:tc>
+          <w:tcPr>
+            <w:tcW w:type="dxa" w:w="3324"/>
+            <w:shd w:fill="fef9c3" w:val="clear"/>
+          </w:tcPr>
+          <w:p>
+            <w:r/>
+            <w:r>
+              <w:rPr>
+                <w:rFonts w:ascii="Calibri" w:hAnsi="Calibri"/>
+                <w:color w:val="854D0E"/>
+                <w:sz w:val="18"/>
+              </w:rPr>
+              <w:t>Вид исполнения, товарные формы</w:t>
+            </w:r>
+          </w:p>
+        </w:tc>
+        <w:tc>
+          <w:tcPr>
+            <w:tcW w:type="dxa" w:w="3324"/>
+            <w:shd w:fill="fef9c3" w:val="clear"/>
+          </w:tcPr>
+          <w:p>
+            <w:r/>
+            <w:r>
+              <w:rPr>
+                <w:rFonts w:ascii="Calibri" w:hAnsi="Calibri"/>
+                <w:color w:val="854D0E"/>
+                <w:sz w:val="18"/>
+              </w:rPr>
+              <w:t>⚡ Уточняется</w:t>
+            </w:r>
+          </w:p>
+        </w:tc>
+        <w:tc>
+          <w:tcPr>
+            <w:tcW w:type="dxa" w:w="3324"/>
+          </w:tcPr>
+          <w:p>
+            <w:r/>
+            <w:r>
+              <w:rPr>
+                <w:rFonts w:ascii="Calibri" w:hAnsi="Calibri"/>
+                <w:sz w:val="18"/>
+              </w:rPr>
+              <w:t>Определяется совместно.</w:t>
+            </w:r>
+          </w:p>
+        </w:tc>
+      </w:tr>
+      <w:tr>
+        <w:tc>
+          <w:tcPr>
+            <w:tcW w:type="dxa" w:w="3324"/>
+            <w:shd w:fill="dbeafe" w:val="clear"/>
+          </w:tcPr>
+          <w:p>
+            <w:r/>
+            <w:r>
+              <w:rPr>
+                <w:rFonts w:ascii="Calibri" w:hAnsi="Calibri"/>
+                <w:color w:val="1E40AF"/>
+                <w:sz w:val="18"/>
+              </w:rPr>
+              <w:t>Планируемые стоимостные характеристики продукции</w:t>
+            </w:r>
+          </w:p>
+        </w:tc>
+        <w:tc>
+          <w:tcPr>
+            <w:tcW w:type="dxa" w:w="3324"/>
+            <w:shd w:fill="dbeafe" w:val="clear"/>
+          </w:tcPr>
+          <w:p>
+            <w:r/>
+            <w:r>
+              <w:rPr>
+                <w:rFonts w:ascii="Calibri" w:hAnsi="Calibri"/>
+                <w:color w:val="1E40AF"/>
+                <w:sz w:val="18"/>
+              </w:rPr>
+              <w:t>📋 Ждём от клиента</w:t>
+            </w:r>
+          </w:p>
+        </w:tc>
+        <w:tc>
+          <w:tcPr>
+            <w:tcW w:type="dxa" w:w="3324"/>
+          </w:tcPr>
+          <w:p>
+            <w:r/>
+            <w:r>
+              <w:rPr>
+                <w:rFonts w:ascii="Calibri" w:hAnsi="Calibri"/>
+                <w:sz w:val="18"/>
+              </w:rPr>
+              <w:t>Должны быть предоставлены клиентом.</w:t>
+            </w:r>
+          </w:p>
+        </w:tc>
+      </w:tr>
+    </w:tbl>
+    <w:p/>
     <w:p>
+      <w:pPr>
+        <w:pStyle w:val="Heading2"/>
+      </w:pPr>
       <w:r>
         <w:rPr>
-          <w:color w:val="646464"/>
-          <w:sz w:val="18"/>
-        </w:rPr>
-        <w:t>Формируется с клиентом после подписания договора.</w:t>
-      </w:r>
-    </w:p>
-    <w:p>
-      <w:r>
-        <w:rPr>
-          <w:rFonts w:ascii="Arial" w:hAnsi="Arial"/>
-          <w:b/>
-          <w:sz w:val="22"/>
+          <w:color w:val="1E293B"/>
         </w:rPr>
         <w:t>Примечания для аналитиков</w:t>
       </w:r>
     </w:p>
     <w:p>
-      <w:pPr/>
+      <w:pPr>
+        <w:pStyle w:val="ListBullet"/>
+      </w:pPr>
       <w:r>
         <w:rPr>
+          <w:rFonts w:ascii="Calibri" w:hAnsi="Calibri"/>
           <w:sz w:val="18"/>
         </w:rPr>
-        <w:t>• ОКВЭД 32.12.7 — редкая специализация, хорошо подходит для Сколково.</w:t>
+        <w:t>Патент: если у клиента нет патента — работаем с патентоведом, он помогает сформулировать научную новизну. Заявка на патент подаётся параллельно с заявкой в Сколково.</w:t>
       </w:r>
     </w:p>
     <w:p>
-      <w:pPr/>
+      <w:pPr>
+        <w:pStyle w:val="ListBullet"/>
+      </w:pPr>
       <w:r>
         <w:rPr>
+          <w:rFonts w:ascii="Calibri" w:hAnsi="Calibri"/>
           <w:sz w:val="18"/>
         </w:rPr>
-        <w:t>• Высокая прибыль (60 млн при 353 млн выручки).</w:t>
+        <w:t>Стоимость продукта и количество продаж — запрашиваются у клиента (75% случаев).</w:t>
       </w:r>
     </w:p>
     <w:p>
-      <w:pPr/>
+      <w:pPr>
+        <w:pStyle w:val="ListBullet"/>
+      </w:pPr>
       <w:r>
         <w:rPr>
+          <w:rFonts w:ascii="Calibri" w:hAnsi="Calibri"/>
           <w:sz w:val="18"/>
         </w:rPr>
-        <w:t>• Учредители: Дарвин Вячеслав Сергеевич, Матвейчук Константин Игоревич.</w:t>
+        <w:t>Сайт компании не обнаружен. Рекомендовать клиенту создать минимальную страницу с описанием продукции.</w:t>
       </w:r>
     </w:p>
     <w:p>
-      <w:pPr/>
+      <w:pPr>
+        <w:pStyle w:val="ListBullet"/>
+      </w:pPr>
       <w:r>
         <w:rPr>
+          <w:rFonts w:ascii="Calibri" w:hAnsi="Calibri"/>
           <w:sz w:val="18"/>
         </w:rPr>
-        <w:t>• Уставный капитал 1 млн руб.</w:t>
+        <w:t>Реквизиты подтверждены. Учредители: Дарвин В.С., Матвейчук К.И. УК 1 млн руб.</w:t>
+      </w:r>
+    </w:p>
+    <w:p>
+      <w:pPr>
+        <w:pStyle w:val="ListBullet"/>
+      </w:pPr>
+      <w:r>
+        <w:rPr>
+          <w:rFonts w:ascii="Calibri" w:hAnsi="Calibri"/>
+          <w:sz w:val="18"/>
+        </w:rPr>
+        <w:t>На весь процесс клиент тратит 3–5 рабочих дней команды.</w:t>
       </w:r>
     </w:p>
     <w:sectPr>
       <w:pgSz w:w="12240" w:h="15840"/>
-      <w:pgMar w:top="1134" w:right="1417" w:bottom="1134" w:left="1417" w:header="720" w:footer="720" w:gutter="0"/>
+      <w:pgMar w:top="1134" w:right="1134" w:bottom="1134" w:left="1134" w:header="720" w:footer="720" w:gutter="0"/>
       <w:cols w:space="720"/>
       <w:docGrid w:linePitch="360"/>
     </w:sectPr>
@@ -2065,7 +3173,7 @@
     <w:qFormat/>
     <w:rsid w:val="00FC693F"/>
     <w:rPr>
-      <w:rFonts w:ascii="Arial" w:hAnsi="Arial"/>
+      <w:rFonts w:ascii="Calibri" w:hAnsi="Calibri"/>
       <w:sz w:val="20"/>
     </w:rPr>
   </w:style>

</xml_diff>